<commit_message>
Fracture Lines: hardsuit, combat exoskeleton and powered armor
- Hardsuit: an armored vac suit; once per fight a 2+ box hit marks one
  fewer; -1 to Athletics and Stealth.
- Combat exoskeleton: +2 to Athletics for strength, unarmed blows mark 2
  boxes, a heavy weapon one-handed; its plating works as body armor; -2
  to Stealth; a power cell a day.
- Powered armor: like the Hegemony legionary, 1-box hits mark nothing,
  and once per fight a 2+ box hit marks one fewer; the exoskeleton's
  strength; -2 to Stealth, scanners see it, a power pack that can lock up.
  Needs the new Powered Armor Edge (where it came from, GM-approved).
- Engine: gear can require an Edge; the checklist flags it until bought.
- All three as protection data for the Rules Lab.

Co-Authored-By: Claude Opus 5.5 <noreply@anthropic.com>
Claude-Session: https://claude.ai/code/session_015SADCFzhKijkC2foUmXrpC
</commit_message>
<xml_diff>
--- a/legend-dynamics/site/fracture-lines/Fracture_Lines_Players_Guide.docx
+++ b/legend-dynamics/site/fracture-lines/Fracture_Lines_Players_Guide.docx
@@ -4558,6 +4558,54 @@
           </w:p>
         </w:tc>
       </w:tr>
+      <w:tr>
+        <w:tc>
+          <w:tcPr/>
+          <w:p>
+            <w:pPr>
+              <w:pStyle w:val="Compact"/>
+              <w:jc w:val="left"/>
+            </w:pPr>
+            <w:r>
+              <w:rPr>
+                <w:b/>
+                <w:sz w:val="19"/>
+              </w:rPr>
+              <w:t xml:space="preserve">Powered Armor</w:t>
+            </w:r>
+          </w:p>
+        </w:tc>
+        <w:tc>
+          <w:tcPr/>
+          <w:p>
+            <w:pPr>
+              <w:pStyle w:val="Compact"/>
+              <w:jc w:val="left"/>
+            </w:pPr>
+            <w:r>
+              <w:rPr>
+                <w:sz w:val="19"/>
+              </w:rPr>
+              <w:t xml:space="preserve">Legion-grade powered armor, yours by right: issued by a military, a Hegemony House or a mercenary company (take its Allegiance), or salvaged and licensed. The GM approves it, and someone always wants it back.</w:t>
+            </w:r>
+          </w:p>
+        </w:tc>
+        <w:tc>
+          <w:tcPr/>
+          <w:p>
+            <w:pPr>
+              <w:pStyle w:val="Compact"/>
+              <w:jc w:val="left"/>
+            </w:pPr>
+            <w:r>
+              <w:rPr>
+                <w:sz w:val="19"/>
+              </w:rPr>
+              <w:t xml:space="preserve">1</w:t>
+            </w:r>
+          </w:p>
+        </w:tc>
+      </w:tr>
     </w:tbl>
     <w:bookmarkEnd w:id="26"/>
     <w:bookmarkStart w:id="27" w:name="spending-points"/>
@@ -7925,6 +7973,105 @@
                 <w:sz w:val="19"/>
               </w:rPr>
               <w:t xml:space="preserve">A light powered frame: no gravity penalty for Vael and others built for low gravity.</w:t>
+            </w:r>
+          </w:p>
+        </w:tc>
+      </w:tr>
+      <w:tr>
+        <w:tc>
+          <w:tcPr/>
+          <w:p>
+            <w:pPr>
+              <w:pStyle w:val="Compact"/>
+              <w:jc w:val="left"/>
+            </w:pPr>
+            <w:r>
+              <w:rPr>
+                <w:b/>
+                <w:sz w:val="19"/>
+              </w:rPr>
+              <w:t xml:space="preserve">Hardsuit</w:t>
+            </w:r>
+          </w:p>
+        </w:tc>
+        <w:tc>
+          <w:tcPr/>
+          <w:p>
+            <w:pPr>
+              <w:pStyle w:val="Compact"/>
+              <w:jc w:val="left"/>
+            </w:pPr>
+            <w:r>
+              <w:rPr>
+                <w:sz w:val="19"/>
+              </w:rPr>
+              <w:t xml:space="preserve">An armored vac suit: air for six hours in vacuum or poison atmosphere, and once per fight a hit that marks 2 or more boxes marks one fewer. −1 to Athletics and Stealth while you wear it; a breach is the GM’s call. Not with other armor.</w:t>
+            </w:r>
+          </w:p>
+        </w:tc>
+      </w:tr>
+      <w:tr>
+        <w:tc>
+          <w:tcPr/>
+          <w:p>
+            <w:pPr>
+              <w:pStyle w:val="Compact"/>
+              <w:jc w:val="left"/>
+            </w:pPr>
+            <w:r>
+              <w:rPr>
+                <w:b/>
+                <w:sz w:val="19"/>
+              </w:rPr>
+              <w:t xml:space="preserve">Combat exoskeleton</w:t>
+            </w:r>
+          </w:p>
+        </w:tc>
+        <w:tc>
+          <w:tcPr/>
+          <w:p>
+            <w:pPr>
+              <w:pStyle w:val="Compact"/>
+              <w:jc w:val="left"/>
+            </w:pPr>
+            <w:r>
+              <w:rPr>
+                <w:sz w:val="19"/>
+              </w:rPr>
+              <w:t xml:space="preserve">A powered military frame: +2 to Athletics to lift, carry, climb or break things, your unarmed blows mark 2 boxes, and you carry a heavy weapon one-handed. Its plating works as body armor: once per fight, a 2+ box hit marks one fewer. −2 to Stealth; needs a fresh power cell each day. Not with other armor.</w:t>
+            </w:r>
+          </w:p>
+        </w:tc>
+      </w:tr>
+      <w:tr>
+        <w:tc>
+          <w:tcPr/>
+          <w:p>
+            <w:pPr>
+              <w:pStyle w:val="Compact"/>
+              <w:jc w:val="left"/>
+            </w:pPr>
+            <w:r>
+              <w:rPr>
+                <w:b/>
+                <w:sz w:val="19"/>
+              </w:rPr>
+              <w:t xml:space="preserve">Powered armor</w:t>
+            </w:r>
+          </w:p>
+        </w:tc>
+        <w:tc>
+          <w:tcPr/>
+          <w:p>
+            <w:pPr>
+              <w:pStyle w:val="Compact"/>
+              <w:jc w:val="left"/>
+            </w:pPr>
+            <w:r>
+              <w:rPr>
+                <w:sz w:val="19"/>
+              </w:rPr>
+              <w:t xml:space="preserve">Legion-grade, sealed and powered: hits that would mark 1 box mark nothing, and once per fight a hit that marks 2 or more boxes marks one fewer. Air for six hours, and the strength of a combat exoskeleton. −2 to Stealth, any scanner picks it up, and it needs a fresh power cell each day. A shot at the power pack (−2 to hit) can lock it up until someone spends an action freeing you. Needs the Powered Armor Edge. Not with other armor.</w:t>
             </w:r>
           </w:p>
         </w:tc>

</xml_diff>

<commit_message>
Rebuild the website with grievous wounds for every setting
Co-Authored-By: Claude Opus 5.5 <noreply@anthropic.com>
Claude-Session: https://claude.ai/code/session_015SADCFzhKijkC2foUmXrpC
</commit_message>
<xml_diff>
--- a/legend-dynamics/site/fracture-lines/Fracture_Lines_Players_Guide.docx
+++ b/legend-dynamics/site/fracture-lines/Fracture_Lines_Players_Guide.docx
@@ -9097,7 +9097,7 @@
     </w:p>
     <w:bookmarkEnd w:id="48"/>
     <w:bookmarkEnd w:id="49"/>
-    <w:bookmarkStart w:id="58" w:name="personal-combat"/>
+    <w:bookmarkStart w:id="59" w:name="personal-combat"/>
     <w:p>
       <w:pPr>
         <w:pStyle w:val="Heading1"/>
@@ -10151,7 +10151,7 @@
       </w:r>
     </w:p>
     <w:bookmarkEnd w:id="53"/>
-    <w:bookmarkStart w:id="55" w:name="injury"/>
+    <w:bookmarkStart w:id="56" w:name="injury"/>
     <w:p>
       <w:pPr>
         <w:pStyle w:val="Heading2"/>
@@ -10553,14 +10553,13 @@
       </w:r>
     </w:p>
     <w:bookmarkEnd w:id="54"/>
-    <w:bookmarkEnd w:id="55"/>
-    <w:bookmarkStart w:id="56" w:name="weapons-and-damage"/>
-    <w:p>
-      <w:pPr>
-        <w:pStyle w:val="Heading2"/>
-      </w:pPr>
-      <w:r>
-        <w:t xml:space="preserve">Weapons and damage</w:t>
+    <w:bookmarkStart w:id="55" w:name="optional-rule-gritty-combat"/>
+    <w:p>
+      <w:pPr>
+        <w:pStyle w:val="Heading3"/>
+      </w:pPr>
+      <w:r>
+        <w:t xml:space="preserve">Optional rule: gritty combat</w:t>
       </w:r>
     </w:p>
     <w:p>
@@ -10568,7 +10567,7 @@
         <w:pStyle w:val="FirstParagraph"/>
       </w:pPr>
       <w:r>
-        <w:t xml:space="preserve">How many boxes a hit marks depends on the</w:t>
+        <w:t xml:space="preserve">For a harder, bloodier game, the GM can turn on</w:t>
       </w:r>
       <w:r>
         <w:t xml:space="preserve"> </w:t>
@@ -10578,10 +10577,168 @@
           <w:bCs/>
           <w:b/>
         </w:rPr>
-        <w:t xml:space="preserve">weapon</w:t>
-      </w:r>
-      <w:r>
-        <w:t xml:space="preserve">, not on how well the attack succeeded.</w:t>
+        <w:t xml:space="preserve">gritty combat</w:t>
+      </w:r>
+      <w:r>
+        <w:t xml:space="preserve"> </w:t>
+      </w:r>
+      <w:r>
+        <w:t xml:space="preserve">for the campaign (the creator has a switch on the Condition card and in the GM view). The rest of the rules stay the same.</w:t>
+      </w:r>
+    </w:p>
+    <w:p>
+      <w:pPr>
+        <w:pStyle w:val="BodyText"/>
+      </w:pPr>
+      <w:r>
+        <w:rPr>
+          <w:bCs/>
+          <w:b/>
+        </w:rPr>
+        <w:t xml:space="preserve">Grievous hits.</w:t>
+      </w:r>
+      <w:r>
+        <w:t xml:space="preserve"> </w:t>
+      </w:r>
+      <w:r>
+        <w:t xml:space="preserve">A hit that marks</w:t>
+      </w:r>
+      <w:r>
+        <w:t xml:space="preserve"> </w:t>
+      </w:r>
+      <w:r>
+        <w:rPr>
+          <w:bCs/>
+          <w:b/>
+        </w:rPr>
+        <w:t xml:space="preserve">2 or more boxes</w:t>
+      </w:r>
+      <w:r>
+        <w:t xml:space="preserve"> </w:t>
+      </w:r>
+      <w:r>
+        <w:t xml:space="preserve">is</w:t>
+      </w:r>
+      <w:r>
+        <w:t xml:space="preserve"> </w:t>
+      </w:r>
+      <w:r>
+        <w:rPr>
+          <w:bCs/>
+          <w:b/>
+        </w:rPr>
+        <w:t xml:space="preserve">grievous</w:t>
+      </w:r>
+      <w:r>
+        <w:t xml:space="preserve"> </w:t>
+      </w:r>
+      <w:r>
+        <w:t xml:space="preserve">when the attack succeeded by</w:t>
+      </w:r>
+      <w:r>
+        <w:t xml:space="preserve"> </w:t>
+      </w:r>
+      <w:r>
+        <w:rPr>
+          <w:bCs/>
+          <w:b/>
+        </w:rPr>
+        <w:t xml:space="preserve">7 or more</w:t>
+      </w:r>
+      <w:r>
+        <w:t xml:space="preserve">, rolled a</w:t>
+      </w:r>
+      <w:r>
+        <w:t xml:space="preserve"> </w:t>
+      </w:r>
+      <w:r>
+        <w:rPr>
+          <w:bCs/>
+          <w:b/>
+        </w:rPr>
+        <w:t xml:space="preserve">natural 3 or 4</w:t>
+      </w:r>
+      <w:r>
+        <w:t xml:space="preserve">, or left the target</w:t>
+      </w:r>
+      <w:r>
+        <w:t xml:space="preserve"> </w:t>
+      </w:r>
+      <w:r>
+        <w:rPr>
+          <w:bCs/>
+          <w:b/>
+        </w:rPr>
+        <w:t xml:space="preserve">Dying</w:t>
+      </w:r>
+      <w:r>
+        <w:t xml:space="preserve">.</w:t>
+      </w:r>
+    </w:p>
+    <w:p>
+      <w:pPr>
+        <w:numPr>
+          <w:ilvl w:val="0"/>
+          <w:numId w:val="1011"/>
+        </w:numPr>
+        <w:pStyle w:val="Compact"/>
+      </w:pPr>
+      <w:r>
+        <w:rPr>
+          <w:bCs/>
+          <w:b/>
+        </w:rPr>
+        <w:t xml:space="preserve">A character</w:t>
+      </w:r>
+      <w:r>
+        <w:t xml:space="preserve"> </w:t>
+      </w:r>
+      <w:r>
+        <w:t xml:space="preserve">rolls 3d6 on the table below and suffers the result on top of the boxes.</w:t>
+      </w:r>
+    </w:p>
+    <w:p>
+      <w:pPr>
+        <w:numPr>
+          <w:ilvl w:val="0"/>
+          <w:numId w:val="1011"/>
+        </w:numPr>
+        <w:pStyle w:val="Compact"/>
+      </w:pPr>
+      <w:r>
+        <w:rPr>
+          <w:bCs/>
+          <w:b/>
+        </w:rPr>
+        <w:t xml:space="preserve">An opponent</w:t>
+      </w:r>
+      <w:r>
+        <w:t xml:space="preserve"> </w:t>
+      </w:r>
+      <w:r>
+        <w:t xml:space="preserve">is simply taken out: no roll, no boxes to count. Describe how, or let the GM view roll a description.</w:t>
+      </w:r>
+    </w:p>
+    <w:p>
+      <w:pPr>
+        <w:numPr>
+          <w:ilvl w:val="0"/>
+          <w:numId w:val="1011"/>
+        </w:numPr>
+        <w:pStyle w:val="Compact"/>
+      </w:pPr>
+      <w:r>
+        <w:rPr>
+          <w:bCs/>
+          <w:b/>
+        </w:rPr>
+        <w:t xml:space="preserve">With a telling hit,</w:t>
+      </w:r>
+      <w:r>
+        <w:t xml:space="preserve"> </w:t>
+      </w:r>
+      <w:r>
+        <w:t xml:space="preserve">the attacker also chooses which limb.</w:t>
       </w:r>
     </w:p>
     <w:tbl>
@@ -10623,6 +10780,610 @@
                 <w:b/>
                 <w:sz w:val="19"/>
               </w:rPr>
+              <w:t xml:space="preserve">3d6</w:t>
+            </w:r>
+          </w:p>
+        </w:tc>
+        <w:tc>
+          <w:tcPr>
+            <w:shd w:val="clear" w:fill="E9EEF6"/>
+          </w:tcPr>
+          <w:p>
+            <w:pPr>
+              <w:pStyle w:val="Compact"/>
+              <w:jc w:val="left"/>
+            </w:pPr>
+            <w:r>
+              <w:rPr>
+                <w:b/>
+                <w:sz w:val="19"/>
+              </w:rPr>
+              <w:t xml:space="preserve">Grievous wound</w:t>
+            </w:r>
+          </w:p>
+        </w:tc>
+        <w:tc>
+          <w:tcPr>
+            <w:shd w:val="clear" w:fill="E9EEF6"/>
+          </w:tcPr>
+          <w:p>
+            <w:pPr>
+              <w:pStyle w:val="Compact"/>
+              <w:jc w:val="left"/>
+            </w:pPr>
+            <w:r>
+              <w:rPr>
+                <w:b/>
+                <w:sz w:val="19"/>
+              </w:rPr>
+              <w:t xml:space="preserve">Effect</w:t>
+            </w:r>
+          </w:p>
+        </w:tc>
+        <w:tc>
+          <w:tcPr>
+            <w:shd w:val="clear" w:fill="E9EEF6"/>
+          </w:tcPr>
+          <w:p>
+            <w:pPr>
+              <w:pStyle w:val="Compact"/>
+              <w:jc w:val="left"/>
+            </w:pPr>
+            <w:r>
+              <w:rPr>
+                <w:b/>
+                <w:sz w:val="19"/>
+              </w:rPr>
+              <w:t xml:space="preserve">Heals</w:t>
+            </w:r>
+          </w:p>
+        </w:tc>
+      </w:tr>
+      <w:tr>
+        <w:tc>
+          <w:tcPr/>
+          <w:p>
+            <w:pPr>
+              <w:pStyle w:val="Compact"/>
+              <w:jc w:val="left"/>
+            </w:pPr>
+            <w:r>
+              <w:rPr>
+                <w:b/>
+                <w:sz w:val="19"/>
+              </w:rPr>
+              <w:t xml:space="preserve">3–4</w:t>
+            </w:r>
+          </w:p>
+        </w:tc>
+        <w:tc>
+          <w:tcPr/>
+          <w:p>
+            <w:pPr>
+              <w:pStyle w:val="Compact"/>
+              <w:jc w:val="left"/>
+            </w:pPr>
+            <w:r>
+              <w:rPr>
+                <w:sz w:val="19"/>
+              </w:rPr>
+              <w:t xml:space="preserve">Lost limb</w:t>
+            </w:r>
+          </w:p>
+        </w:tc>
+        <w:tc>
+          <w:tcPr/>
+          <w:p>
+            <w:pPr>
+              <w:pStyle w:val="Compact"/>
+              <w:jc w:val="left"/>
+            </w:pPr>
+            <w:r>
+              <w:rPr>
+                <w:sz w:val="19"/>
+              </w:rPr>
+              <w:t xml:space="preserve">A hand, an arm or a leg is gone for good; the GM says which. −4 to tasks that need it, or impossible. Dying unless someone stops the bleeding. A prosthetic or cybernetic replacement can restore it, at a price.</w:t>
+            </w:r>
+          </w:p>
+        </w:tc>
+        <w:tc>
+          <w:tcPr/>
+          <w:p>
+            <w:pPr>
+              <w:pStyle w:val="Compact"/>
+              <w:jc w:val="left"/>
+            </w:pPr>
+            <w:r>
+              <w:rPr>
+                <w:sz w:val="19"/>
+              </w:rPr>
+              <w:t xml:space="preserve">Never: a complication</w:t>
+            </w:r>
+          </w:p>
+        </w:tc>
+      </w:tr>
+      <w:tr>
+        <w:tc>
+          <w:tcPr/>
+          <w:p>
+            <w:pPr>
+              <w:pStyle w:val="Compact"/>
+              <w:jc w:val="left"/>
+            </w:pPr>
+            <w:r>
+              <w:rPr>
+                <w:b/>
+                <w:sz w:val="19"/>
+              </w:rPr>
+              <w:t xml:space="preserve">5–6</w:t>
+            </w:r>
+          </w:p>
+        </w:tc>
+        <w:tc>
+          <w:tcPr/>
+          <w:p>
+            <w:pPr>
+              <w:pStyle w:val="Compact"/>
+              <w:jc w:val="left"/>
+            </w:pPr>
+            <w:r>
+              <w:rPr>
+                <w:sz w:val="19"/>
+              </w:rPr>
+              <w:t xml:space="preserve">Lost eye</w:t>
+            </w:r>
+          </w:p>
+        </w:tc>
+        <w:tc>
+          <w:tcPr/>
+          <w:p>
+            <w:pPr>
+              <w:pStyle w:val="Compact"/>
+              <w:jc w:val="left"/>
+            </w:pPr>
+            <w:r>
+              <w:rPr>
+                <w:sz w:val="19"/>
+              </w:rPr>
+              <w:t xml:space="preserve">−2 to Firearms and to spotting things, until a cybernetic or cloned eye replaces it.</w:t>
+            </w:r>
+          </w:p>
+        </w:tc>
+        <w:tc>
+          <w:tcPr/>
+          <w:p>
+            <w:pPr>
+              <w:pStyle w:val="Compact"/>
+              <w:jc w:val="left"/>
+            </w:pPr>
+            <w:r>
+              <w:rPr>
+                <w:sz w:val="19"/>
+              </w:rPr>
+              <w:t xml:space="preserve">Never: a complication</w:t>
+            </w:r>
+          </w:p>
+        </w:tc>
+      </w:tr>
+      <w:tr>
+        <w:tc>
+          <w:tcPr/>
+          <w:p>
+            <w:pPr>
+              <w:pStyle w:val="Compact"/>
+              <w:jc w:val="left"/>
+            </w:pPr>
+            <w:r>
+              <w:rPr>
+                <w:b/>
+                <w:sz w:val="19"/>
+              </w:rPr>
+              <w:t xml:space="preserve">7–9</w:t>
+            </w:r>
+          </w:p>
+        </w:tc>
+        <w:tc>
+          <w:tcPr/>
+          <w:p>
+            <w:pPr>
+              <w:pStyle w:val="Compact"/>
+              <w:jc w:val="left"/>
+            </w:pPr>
+            <w:r>
+              <w:rPr>
+                <w:sz w:val="19"/>
+              </w:rPr>
+              <w:t xml:space="preserve">Broken bone</w:t>
+            </w:r>
+          </w:p>
+        </w:tc>
+        <w:tc>
+          <w:tcPr/>
+          <w:p>
+            <w:pPr>
+              <w:pStyle w:val="Compact"/>
+              <w:jc w:val="left"/>
+            </w:pPr>
+            <w:r>
+              <w:rPr>
+                <w:sz w:val="19"/>
+              </w:rPr>
+              <w:t xml:space="preserve">The limb is useless until it’s set with proper care.</w:t>
+            </w:r>
+          </w:p>
+        </w:tc>
+        <w:tc>
+          <w:tcPr/>
+          <w:p>
+            <w:pPr>
+              <w:pStyle w:val="Compact"/>
+              <w:jc w:val="left"/>
+            </w:pPr>
+            <w:r>
+              <w:rPr>
+                <w:sz w:val="19"/>
+              </w:rPr>
+              <w:t xml:space="preserve">Several weeks</w:t>
+            </w:r>
+          </w:p>
+        </w:tc>
+      </w:tr>
+      <w:tr>
+        <w:tc>
+          <w:tcPr/>
+          <w:p>
+            <w:pPr>
+              <w:pStyle w:val="Compact"/>
+              <w:jc w:val="left"/>
+            </w:pPr>
+            <w:r>
+              <w:rPr>
+                <w:b/>
+                <w:sz w:val="19"/>
+              </w:rPr>
+              <w:t xml:space="preserve">10–12</w:t>
+            </w:r>
+          </w:p>
+        </w:tc>
+        <w:tc>
+          <w:tcPr/>
+          <w:p>
+            <w:pPr>
+              <w:pStyle w:val="Compact"/>
+              <w:jc w:val="left"/>
+            </w:pPr>
+            <w:r>
+              <w:rPr>
+                <w:sz w:val="19"/>
+              </w:rPr>
+              <w:t xml:space="preserve">Torn muscle</w:t>
+            </w:r>
+          </w:p>
+        </w:tc>
+        <w:tc>
+          <w:tcPr/>
+          <w:p>
+            <w:pPr>
+              <w:pStyle w:val="Compact"/>
+              <w:jc w:val="left"/>
+            </w:pPr>
+            <w:r>
+              <w:rPr>
+                <w:sz w:val="19"/>
+              </w:rPr>
+              <w:t xml:space="preserve">−1 to physical tasks.</w:t>
+            </w:r>
+          </w:p>
+        </w:tc>
+        <w:tc>
+          <w:tcPr/>
+          <w:p>
+            <w:pPr>
+              <w:pStyle w:val="Compact"/>
+              <w:jc w:val="left"/>
+            </w:pPr>
+            <w:r>
+              <w:rPr>
+                <w:sz w:val="19"/>
+              </w:rPr>
+              <w:t xml:space="preserve">Several weeks</w:t>
+            </w:r>
+          </w:p>
+        </w:tc>
+      </w:tr>
+      <w:tr>
+        <w:tc>
+          <w:tcPr/>
+          <w:p>
+            <w:pPr>
+              <w:pStyle w:val="Compact"/>
+              <w:jc w:val="left"/>
+            </w:pPr>
+            <w:r>
+              <w:rPr>
+                <w:b/>
+                <w:sz w:val="19"/>
+              </w:rPr>
+              <w:t xml:space="preserve">13–15</w:t>
+            </w:r>
+          </w:p>
+        </w:tc>
+        <w:tc>
+          <w:tcPr/>
+          <w:p>
+            <w:pPr>
+              <w:pStyle w:val="Compact"/>
+              <w:jc w:val="left"/>
+            </w:pPr>
+            <w:r>
+              <w:rPr>
+                <w:sz w:val="19"/>
+              </w:rPr>
+              <w:t xml:space="preserve">Concussion</w:t>
+            </w:r>
+          </w:p>
+        </w:tc>
+        <w:tc>
+          <w:tcPr/>
+          <w:p>
+            <w:pPr>
+              <w:pStyle w:val="Compact"/>
+              <w:jc w:val="left"/>
+            </w:pPr>
+            <w:r>
+              <w:rPr>
+                <w:sz w:val="19"/>
+              </w:rPr>
+              <w:t xml:space="preserve">Stunned, and −2 to thinking tasks for the scene.</w:t>
+            </w:r>
+          </w:p>
+        </w:tc>
+        <w:tc>
+          <w:tcPr/>
+          <w:p>
+            <w:pPr>
+              <w:pStyle w:val="Compact"/>
+              <w:jc w:val="left"/>
+            </w:pPr>
+            <w:r>
+              <w:rPr>
+                <w:sz w:val="19"/>
+              </w:rPr>
+              <w:t xml:space="preserve">After the scene</w:t>
+            </w:r>
+          </w:p>
+        </w:tc>
+      </w:tr>
+      <w:tr>
+        <w:tc>
+          <w:tcPr/>
+          <w:p>
+            <w:pPr>
+              <w:pStyle w:val="Compact"/>
+              <w:jc w:val="left"/>
+            </w:pPr>
+            <w:r>
+              <w:rPr>
+                <w:b/>
+                <w:sz w:val="19"/>
+              </w:rPr>
+              <w:t xml:space="preserve">16–18</w:t>
+            </w:r>
+          </w:p>
+        </w:tc>
+        <w:tc>
+          <w:tcPr/>
+          <w:p>
+            <w:pPr>
+              <w:pStyle w:val="Compact"/>
+              <w:jc w:val="left"/>
+            </w:pPr>
+            <w:r>
+              <w:rPr>
+                <w:sz w:val="19"/>
+              </w:rPr>
+              <w:t xml:space="preserve">Internal injury</w:t>
+            </w:r>
+          </w:p>
+        </w:tc>
+        <w:tc>
+          <w:tcPr/>
+          <w:p>
+            <w:pPr>
+              <w:pStyle w:val="Compact"/>
+              <w:jc w:val="left"/>
+            </w:pPr>
+            <w:r>
+              <w:rPr>
+                <w:sz w:val="19"/>
+              </w:rPr>
+              <w:t xml:space="preserve">Dying even with boxes to spare; it needs a med-bay or a clinic’s surgeons.</w:t>
+            </w:r>
+          </w:p>
+        </w:tc>
+        <w:tc>
+          <w:tcPr/>
+          <w:p>
+            <w:pPr>
+              <w:pStyle w:val="Compact"/>
+              <w:jc w:val="left"/>
+            </w:pPr>
+            <w:r>
+              <w:rPr>
+                <w:sz w:val="19"/>
+              </w:rPr>
+              <w:t xml:space="preserve">Several weeks after surgery</w:t>
+            </w:r>
+          </w:p>
+        </w:tc>
+      </w:tr>
+    </w:tbl>
+    <w:p>
+      <w:pPr>
+        <w:numPr>
+          <w:ilvl w:val="0"/>
+          <w:numId w:val="1012"/>
+        </w:numPr>
+        <w:pStyle w:val="Compact"/>
+      </w:pPr>
+      <w:r>
+        <w:rPr>
+          <w:bCs/>
+          <w:b/>
+        </w:rPr>
+        <w:t xml:space="preserve">Resolve.</w:t>
+      </w:r>
+      <w:r>
+        <w:t xml:space="preserve"> </w:t>
+      </w:r>
+      <w:r>
+        <w:t xml:space="preserve">Spend a Resolve point to</w:t>
+      </w:r>
+      <w:r>
+        <w:t xml:space="preserve"> </w:t>
+      </w:r>
+      <w:r>
+        <w:rPr>
+          <w:bCs/>
+          <w:b/>
+        </w:rPr>
+        <w:t xml:space="preserve">downgrade</w:t>
+      </w:r>
+      <w:r>
+        <w:t xml:space="preserve"> </w:t>
+      </w:r>
+      <w:r>
+        <w:t xml:space="preserve">a grievous wound one step: lost limb becomes broken bone; lost eye becomes concussion; broken bone becomes torn muscle; torn muscle becomes nothing lasting; concussion becomes nothing lasting; internal injury becomes torn muscle.</w:t>
+      </w:r>
+    </w:p>
+    <w:p>
+      <w:pPr>
+        <w:numPr>
+          <w:ilvl w:val="0"/>
+          <w:numId w:val="1012"/>
+        </w:numPr>
+        <w:pStyle w:val="Compact"/>
+      </w:pPr>
+      <w:r>
+        <w:rPr>
+          <w:bCs/>
+          <w:b/>
+        </w:rPr>
+        <w:t xml:space="preserve">A limb for a life.</w:t>
+      </w:r>
+      <w:r>
+        <w:t xml:space="preserve"> </w:t>
+      </w:r>
+      <w:r>
+        <w:t xml:space="preserve">Once a fight, a character who would be left Dying or killed can</w:t>
+      </w:r>
+      <w:r>
+        <w:t xml:space="preserve"> </w:t>
+      </w:r>
+      <w:r>
+        <w:rPr>
+          <w:bCs/>
+          <w:b/>
+        </w:rPr>
+        <w:t xml:space="preserve">lose a limb, or the use of one</w:t>
+      </w:r>
+      <w:r>
+        <w:t xml:space="preserve">, instead. They live, Incapacitated but stable, and the limb becomes a complication. It replaces any grievous wound from the same hit.</w:t>
+      </w:r>
+    </w:p>
+    <w:p>
+      <w:pPr>
+        <w:numPr>
+          <w:ilvl w:val="0"/>
+          <w:numId w:val="1012"/>
+        </w:numPr>
+        <w:pStyle w:val="Compact"/>
+      </w:pPr>
+      <w:r>
+        <w:rPr>
+          <w:bCs/>
+          <w:b/>
+        </w:rPr>
+        <w:t xml:space="preserve">Healing.</w:t>
+      </w:r>
+      <w:r>
+        <w:t xml:space="preserve"> </w:t>
+      </w:r>
+      <w:r>
+        <w:t xml:space="preserve">Grievous wounds heal on their own clock, whatever the boxes say. A lost limb, a lost eye or a disfigurement never heals.</w:t>
+      </w:r>
+    </w:p>
+    <w:bookmarkEnd w:id="55"/>
+    <w:bookmarkEnd w:id="56"/>
+    <w:bookmarkStart w:id="57" w:name="weapons-and-damage"/>
+    <w:p>
+      <w:pPr>
+        <w:pStyle w:val="Heading2"/>
+      </w:pPr>
+      <w:r>
+        <w:t xml:space="preserve">Weapons and damage</w:t>
+      </w:r>
+    </w:p>
+    <w:p>
+      <w:pPr>
+        <w:pStyle w:val="FirstParagraph"/>
+      </w:pPr>
+      <w:r>
+        <w:t xml:space="preserve">How many boxes a hit marks depends on the</w:t>
+      </w:r>
+      <w:r>
+        <w:t xml:space="preserve"> </w:t>
+      </w:r>
+      <w:r>
+        <w:rPr>
+          <w:bCs/>
+          <w:b/>
+        </w:rPr>
+        <w:t xml:space="preserve">weapon</w:t>
+      </w:r>
+      <w:r>
+        <w:t xml:space="preserve">, not on how well the attack succeeded.</w:t>
+      </w:r>
+    </w:p>
+    <w:tbl>
+      <w:tblPr>
+        <w:tblStyle w:val="Table"/>
+        <w:tblW w:type="pct" w:w="5000"/>
+        <w:tblLook w:firstRow="1" w:lastRow="0" w:firstColumn="0" w:lastColumn="0" w:noHBand="0" w:noVBand="0" w:val="0020"/>
+        <w:jc w:val="start"/>
+        <w:tblBorders>
+          <w:top w:val="single" w:sz="4" w:color="B8C2D3"/>
+          <w:left w:val="single" w:sz="4" w:color="B8C2D3"/>
+          <w:bottom w:val="single" w:sz="4" w:color="B8C2D3"/>
+          <w:right w:val="single" w:sz="4" w:color="B8C2D3"/>
+          <w:insideH w:val="single" w:sz="4" w:color="B8C2D3"/>
+          <w:insideV w:val="single" w:sz="4" w:color="B8C2D3"/>
+        </w:tblBorders>
+      </w:tblPr>
+      <w:tblGrid>
+        <w:gridCol w:w="1980"/>
+        <w:gridCol w:w="1980"/>
+        <w:gridCol w:w="1980"/>
+        <w:gridCol w:w="1980"/>
+      </w:tblGrid>
+      <w:tr>
+        <w:trPr>
+          <w:tblHeader w:val="true"/>
+        </w:trPr>
+        <w:tc>
+          <w:tcPr>
+            <w:shd w:val="clear" w:fill="E9EEF6"/>
+          </w:tcPr>
+          <w:p>
+            <w:pPr>
+              <w:pStyle w:val="Compact"/>
+              <w:jc w:val="left"/>
+            </w:pPr>
+            <w:r>
+              <w:rPr>
+                <w:b/>
+                <w:sz w:val="19"/>
+              </w:rPr>
               <w:t xml:space="preserve">Weapon</w:t>
             </w:r>
           </w:p>
@@ -11562,8 +12323,8 @@
         <w:t xml:space="preserve">To take someone down without killing them, use fists, a baton, a grapple or a stunner.</w:t>
       </w:r>
     </w:p>
-    <w:bookmarkEnd w:id="56"/>
-    <w:bookmarkStart w:id="57" w:name="weapon-and-ammunition"/>
+    <w:bookmarkEnd w:id="57"/>
+    <w:bookmarkStart w:id="58" w:name="weapon-and-ammunition"/>
     <w:p>
       <w:pPr>
         <w:pStyle w:val="Heading2"/>
@@ -11994,7 +12755,7 @@
       <w:pPr>
         <w:numPr>
           <w:ilvl w:val="0"/>
-          <w:numId w:val="1011"/>
+          <w:numId w:val="1013"/>
         </w:numPr>
         <w:pStyle w:val="Compact"/>
       </w:pPr>
@@ -12016,7 +12777,7 @@
       <w:pPr>
         <w:numPr>
           <w:ilvl w:val="0"/>
-          <w:numId w:val="1011"/>
+          <w:numId w:val="1013"/>
         </w:numPr>
         <w:pStyle w:val="Compact"/>
       </w:pPr>
@@ -12038,7 +12799,7 @@
       <w:pPr>
         <w:numPr>
           <w:ilvl w:val="0"/>
-          <w:numId w:val="1011"/>
+          <w:numId w:val="1013"/>
         </w:numPr>
         <w:pStyle w:val="Compact"/>
       </w:pPr>
@@ -12056,9 +12817,9 @@
         <w:t xml:space="preserve">A natural 18 with this weapon also jams it: clearing it takes an action.</w:t>
       </w:r>
     </w:p>
-    <w:bookmarkEnd w:id="57"/>
     <w:bookmarkEnd w:id="58"/>
-    <w:bookmarkStart w:id="63" w:name="medical-care"/>
+    <w:bookmarkEnd w:id="59"/>
+    <w:bookmarkStart w:id="64" w:name="medical-care"/>
     <w:p>
       <w:pPr>
         <w:pStyle w:val="Heading1"/>
@@ -12091,7 +12852,7 @@
         <w:t xml:space="preserve">can grow a new organ, rebuild a limb or rewrite a disease, for those who can pay; a clinic with a biotech suite counts as proper care. Those who can’t pay get stims, staples and whatever the Relief Missions carry.</w:t>
       </w:r>
     </w:p>
-    <w:bookmarkStart w:id="59" w:name="diagnosis-and-stabilization"/>
+    <w:bookmarkStart w:id="60" w:name="diagnosis-and-stabilization"/>
     <w:p>
       <w:pPr>
         <w:pStyle w:val="Heading2"/>
@@ -12108,8 +12869,8 @@
         <w:t xml:space="preserve">Roll Medicine when the diagnosis is uncertain or an urgent treatment decision matters. Emergency stabilization takes one action and a successful Medicine roll with a medkit. It ends Dying and stops deterioration, but removes no boxes.</w:t>
       </w:r>
     </w:p>
-    <w:bookmarkEnd w:id="59"/>
-    <w:bookmarkStart w:id="60" w:name="field-treatment"/>
+    <w:bookmarkEnd w:id="60"/>
+    <w:bookmarkStart w:id="61" w:name="field-treatment"/>
     <w:p>
       <w:pPr>
         <w:pStyle w:val="Heading2"/>
@@ -12126,8 +12887,8 @@
         <w:t xml:space="preserve">With a medkit and several uninterrupted minutes, successful Medicine removes one injury box; success by 5 or more removes two. Each injury receives one field-treatment attempt; further attempts need changed circumstances.</w:t>
       </w:r>
     </w:p>
-    <w:bookmarkEnd w:id="60"/>
-    <w:bookmarkStart w:id="61" w:name="proper-care"/>
+    <w:bookmarkEnd w:id="61"/>
+    <w:bookmarkStart w:id="62" w:name="proper-care"/>
     <w:p>
       <w:pPr>
         <w:pStyle w:val="Heading2"/>
@@ -12144,8 +12905,8 @@
         <w:t xml:space="preserve">A clinic with a biotech suite grants +2 to Medicine. A successful treatment removes two boxes; success by 5 or more removes three. Allow the time the treatment requires.</w:t>
       </w:r>
     </w:p>
-    <w:bookmarkEnd w:id="61"/>
-    <w:bookmarkStart w:id="62" w:name="natural-recovery"/>
+    <w:bookmarkEnd w:id="62"/>
+    <w:bookmarkStart w:id="63" w:name="natural-recovery"/>
     <w:p>
       <w:pPr>
         <w:pStyle w:val="Heading2"/>
@@ -12330,9 +13091,9 @@
         <w:t xml:space="preserve">At three boxes, rest alone does nothing until someone has stabilized or treated you; after that, a week of rest in their care clears the first box. A successful treatment is faster. The times add up: from three boxes, rest alone takes about a week and a half to heal completely (a week, then three days, then a day).</w:t>
       </w:r>
     </w:p>
-    <w:bookmarkEnd w:id="62"/>
     <w:bookmarkEnd w:id="63"/>
-    <w:bookmarkStart w:id="67" w:name="resolve-points-and-tracks"/>
+    <w:bookmarkEnd w:id="64"/>
+    <w:bookmarkStart w:id="68" w:name="resolve-points-and-tracks"/>
     <w:p>
       <w:pPr>
         <w:pStyle w:val="Heading1"/>
@@ -12341,7 +13102,7 @@
         <w:t xml:space="preserve">Resolve points and tracks</w:t>
       </w:r>
     </w:p>
-    <w:bookmarkStart w:id="64" w:name="using-resolve-points"/>
+    <w:bookmarkStart w:id="65" w:name="using-resolve-points"/>
     <w:p>
       <w:pPr>
         <w:pStyle w:val="Heading2"/>
@@ -12559,8 +13320,8 @@
         <w:t xml:space="preserve">Gain one point when one of your complications creates a meaningful problem you accept, including a companion complication. You can decline the proposed complication without penalty.</w:t>
       </w:r>
     </w:p>
-    <w:bookmarkEnd w:id="64"/>
-    <w:bookmarkStart w:id="65" w:name="debt-heat-reputation-and-hull"/>
+    <w:bookmarkEnd w:id="65"/>
+    <w:bookmarkStart w:id="66" w:name="debt-heat-reputation-and-hull"/>
     <w:p>
       <w:pPr>
         <w:pStyle w:val="Heading2"/>
@@ -12655,7 +13416,7 @@
       <w:pPr>
         <w:numPr>
           <w:ilvl w:val="0"/>
-          <w:numId w:val="1012"/>
+          <w:numId w:val="1014"/>
         </w:numPr>
         <w:pStyle w:val="Compact"/>
       </w:pPr>
@@ -12677,7 +13438,7 @@
       <w:pPr>
         <w:numPr>
           <w:ilvl w:val="0"/>
-          <w:numId w:val="1012"/>
+          <w:numId w:val="1014"/>
         </w:numPr>
         <w:pStyle w:val="Compact"/>
       </w:pPr>
@@ -12967,8 +13728,8 @@
         </w:tc>
       </w:tr>
     </w:tbl>
-    <w:bookmarkEnd w:id="65"/>
-    <w:bookmarkStart w:id="66" w:name="advancement"/>
+    <w:bookmarkEnd w:id="66"/>
+    <w:bookmarkStart w:id="67" w:name="advancement"/>
     <w:p>
       <w:pPr>
         <w:pStyle w:val="Heading2"/>
@@ -13005,7 +13766,7 @@
       <w:pPr>
         <w:numPr>
           <w:ilvl w:val="0"/>
-          <w:numId w:val="1013"/>
+          <w:numId w:val="1015"/>
         </w:numPr>
         <w:pStyle w:val="Compact"/>
       </w:pPr>
@@ -13066,7 +13827,7 @@
       <w:pPr>
         <w:numPr>
           <w:ilvl w:val="0"/>
-          <w:numId w:val="1013"/>
+          <w:numId w:val="1015"/>
         </w:numPr>
         <w:pStyle w:val="Compact"/>
       </w:pPr>
@@ -13412,9 +14173,9 @@
         <w:t xml:space="preserve">Magic and powers grow the same way, at the costs their chapters give.</w:t>
       </w:r>
     </w:p>
-    <w:bookmarkEnd w:id="66"/>
     <w:bookmarkEnd w:id="67"/>
-    <w:bookmarkStart w:id="70" w:name="running-jobs-and-missions"/>
+    <w:bookmarkEnd w:id="68"/>
+    <w:bookmarkStart w:id="71" w:name="running-jobs-and-missions"/>
     <w:p>
       <w:pPr>
         <w:pStyle w:val="Heading1"/>
@@ -13423,7 +14184,7 @@
         <w:t xml:space="preserve">Running jobs and missions</w:t>
       </w:r>
     </w:p>
-    <w:bookmarkStart w:id="68" w:name="job-seeds"/>
+    <w:bookmarkStart w:id="69" w:name="job-seeds"/>
     <w:p>
       <w:pPr>
         <w:pStyle w:val="Heading2"/>
@@ -15655,8 +16416,8 @@
         </w:tc>
       </w:tr>
     </w:tbl>
-    <w:bookmarkEnd w:id="68"/>
-    <w:bookmarkStart w:id="69" w:name="the-crew-log"/>
+    <w:bookmarkEnd w:id="69"/>
+    <w:bookmarkStart w:id="70" w:name="the-crew-log"/>
     <w:p>
       <w:pPr>
         <w:pStyle w:val="Heading2"/>
@@ -15677,7 +16438,7 @@
       <w:pPr>
         <w:numPr>
           <w:ilvl w:val="0"/>
-          <w:numId w:val="1014"/>
+          <w:numId w:val="1016"/>
         </w:numPr>
         <w:pStyle w:val="Compact"/>
       </w:pPr>
@@ -15699,7 +16460,7 @@
       <w:pPr>
         <w:numPr>
           <w:ilvl w:val="0"/>
-          <w:numId w:val="1014"/>
+          <w:numId w:val="1016"/>
         </w:numPr>
         <w:pStyle w:val="Compact"/>
       </w:pPr>
@@ -15721,7 +16482,7 @@
       <w:pPr>
         <w:numPr>
           <w:ilvl w:val="0"/>
-          <w:numId w:val="1014"/>
+          <w:numId w:val="1016"/>
         </w:numPr>
         <w:pStyle w:val="Compact"/>
       </w:pPr>
@@ -15743,7 +16504,7 @@
       <w:pPr>
         <w:numPr>
           <w:ilvl w:val="0"/>
-          <w:numId w:val="1014"/>
+          <w:numId w:val="1016"/>
         </w:numPr>
         <w:pStyle w:val="Compact"/>
       </w:pPr>
@@ -15765,7 +16526,7 @@
       <w:pPr>
         <w:numPr>
           <w:ilvl w:val="0"/>
-          <w:numId w:val="1014"/>
+          <w:numId w:val="1016"/>
         </w:numPr>
         <w:pStyle w:val="Compact"/>
       </w:pPr>
@@ -15783,9 +16544,9 @@
         <w:t xml:space="preserve">After a significant job, each character earns 1 advancement point; at a milestone, 2 more.</w:t>
       </w:r>
     </w:p>
-    <w:bookmarkEnd w:id="69"/>
     <w:bookmarkEnd w:id="70"/>
-    <w:bookmarkStart w:id="78" w:name="a-galaxy-of-obligations"/>
+    <w:bookmarkEnd w:id="71"/>
+    <w:bookmarkStart w:id="79" w:name="a-galaxy-of-obligations"/>
     <w:p>
       <w:pPr>
         <w:pStyle w:val="Heading1"/>
@@ -15794,7 +16555,7 @@
         <w:t xml:space="preserve">A galaxy of obligations</w:t>
       </w:r>
     </w:p>
-    <w:bookmarkStart w:id="71" w:name="humanitys-first-contact"/>
+    <w:bookmarkStart w:id="72" w:name="humanitys-first-contact"/>
     <w:p>
       <w:pPr>
         <w:pStyle w:val="Heading2"/>
@@ -15877,8 +16638,8 @@
         <w:t xml:space="preserve">. The Kel call it a default.</w:t>
       </w:r>
     </w:p>
-    <w:bookmarkEnd w:id="71"/>
-    <w:bookmarkStart w:id="72" w:name="the-tessan-arrival"/>
+    <w:bookmarkEnd w:id="72"/>
+    <w:bookmarkStart w:id="73" w:name="the-tessan-arrival"/>
     <w:p>
       <w:pPr>
         <w:pStyle w:val="Heading2"/>
@@ -15916,8 +16677,8 @@
         <w:t xml:space="preserve">Rather than threaten humanity, the Tessan negotiated a settlement. Human captives were returned, losses were compensated, and the Tessan established themselves as cautious intermediaries between humanity and the wider interstellar community. It was humanity’s first introduction to the political and economic order beyond human space.</w:t>
       </w:r>
     </w:p>
-    <w:bookmarkEnd w:id="72"/>
-    <w:bookmarkStart w:id="73" w:name="the-humantessan-accord"/>
+    <w:bookmarkEnd w:id="73"/>
+    <w:bookmarkStart w:id="74" w:name="the-humantessan-accord"/>
     <w:p>
       <w:pPr>
         <w:pStyle w:val="Heading2"/>
@@ -15958,8 +16719,8 @@
         <w:t xml:space="preserve">The Accord opened the wider interstellar economy to humanity.</w:t>
       </w:r>
     </w:p>
-    <w:bookmarkEnd w:id="73"/>
-    <w:bookmarkStart w:id="74" w:name="humanity-enters-the-interstellar-economy"/>
+    <w:bookmarkEnd w:id="74"/>
+    <w:bookmarkStart w:id="75" w:name="humanity-enters-the-interstellar-economy"/>
     <w:p>
       <w:pPr>
         <w:pStyle w:val="Heading2"/>
@@ -15984,8 +16745,8 @@
         <w:t xml:space="preserve">Humans eagerly embraced these opportunities. Some sought wealth. Some sought knowledge. Some wanted new worlds. Some wanted to improve the lives of people they had never met. Frequently, all of those people traveled aboard the same ship.</w:t>
       </w:r>
     </w:p>
-    <w:bookmarkEnd w:id="74"/>
-    <w:bookmarkStart w:id="75" w:name="what-humanity-brought"/>
+    <w:bookmarkEnd w:id="75"/>
+    <w:bookmarkStart w:id="76" w:name="what-humanity-brought"/>
     <w:p>
       <w:pPr>
         <w:pStyle w:val="Heading2"/>
@@ -16018,8 +16779,8 @@
         <w:t xml:space="preserve">The Tessan opened the galaxy to humanity. Humanity, in turn, began changing the galaxy.</w:t>
       </w:r>
     </w:p>
-    <w:bookmarkEnd w:id="75"/>
-    <w:bookmarkStart w:id="76" w:name="the-human-reputation"/>
+    <w:bookmarkEnd w:id="76"/>
+    <w:bookmarkStart w:id="77" w:name="the-human-reputation"/>
     <w:p>
       <w:pPr>
         <w:pStyle w:val="Heading2"/>
@@ -16088,8 +16849,8 @@
         <w:t xml:space="preserve">, that contradiction is part of what it means to be human in a galaxy that is still deciding what to make of us.</w:t>
       </w:r>
     </w:p>
-    <w:bookmarkEnd w:id="76"/>
-    <w:bookmarkStart w:id="77" w:name="the-concord"/>
+    <w:bookmarkEnd w:id="77"/>
+    <w:bookmarkStart w:id="78" w:name="the-concord"/>
     <w:p>
       <w:pPr>
         <w:pStyle w:val="Heading2"/>
@@ -16122,9 +16883,9 @@
         <w:t xml:space="preserve">is humanity’s Earth-centered civilization: the oldest and largest of the human governments, and the one that signed the Accord. It is not the only one. Three centuries of expansion have produced independent colonies, corporate holdings, merchant leagues and political movements that answer to no one on Earth. Other peoples have their own polities, under their own names.</w:t>
       </w:r>
     </w:p>
-    <w:bookmarkEnd w:id="77"/>
     <w:bookmarkEnd w:id="78"/>
-    <w:bookmarkStart w:id="90" w:name="the-corridors"/>
+    <w:bookmarkEnd w:id="79"/>
+    <w:bookmarkStart w:id="91" w:name="the-corridors"/>
     <w:p>
       <w:pPr>
         <w:pStyle w:val="Heading1"/>
@@ -16154,7 +16915,7 @@
         <w:t xml:space="preserve">.</w:t>
       </w:r>
     </w:p>
-    <w:bookmarkStart w:id="79" w:name="what-the-corridors-are"/>
+    <w:bookmarkStart w:id="80" w:name="what-the-corridors-are"/>
     <w:p>
       <w:pPr>
         <w:pStyle w:val="Heading2"/>
@@ -16224,8 +16985,8 @@
         <w:t xml:space="preserve">Corridor mouths sit at gravitational balance points, often far out from the star. That is where the stations, toll gates, fortresses and Mandate checkpoints are built.</w:t>
       </w:r>
     </w:p>
-    <w:bookmarkEnd w:id="79"/>
-    <w:bookmarkStart w:id="80" w:name="off-the-corridors-the-metric-drive"/>
+    <w:bookmarkEnd w:id="80"/>
+    <w:bookmarkStart w:id="81" w:name="off-the-corridors-the-metric-drive"/>
     <w:p>
       <w:pPr>
         <w:pStyle w:val="Heading2"/>
@@ -16272,7 +17033,7 @@
       <w:pPr>
         <w:numPr>
           <w:ilvl w:val="0"/>
-          <w:numId w:val="1015"/>
+          <w:numId w:val="1017"/>
         </w:numPr>
         <w:pStyle w:val="Compact"/>
       </w:pPr>
@@ -16294,7 +17055,7 @@
       <w:pPr>
         <w:numPr>
           <w:ilvl w:val="0"/>
-          <w:numId w:val="1015"/>
+          <w:numId w:val="1017"/>
         </w:numPr>
         <w:pStyle w:val="Compact"/>
       </w:pPr>
@@ -16316,7 +17077,7 @@
       <w:pPr>
         <w:numPr>
           <w:ilvl w:val="0"/>
-          <w:numId w:val="1015"/>
+          <w:numId w:val="1017"/>
         </w:numPr>
         <w:pStyle w:val="Compact"/>
       </w:pPr>
@@ -16342,8 +17103,8 @@
         <w:t xml:space="preserve">The Vael know the drive’s limits better than anyone: their homeworld’s catastrophe struck hundreds of light-years from the nearest corridor, and even at three times light speed their escape took generations.</w:t>
       </w:r>
     </w:p>
-    <w:bookmarkEnd w:id="80"/>
-    <w:bookmarkStart w:id="81" w:name="depth"/>
+    <w:bookmarkEnd w:id="81"/>
+    <w:bookmarkStart w:id="82" w:name="depth"/>
     <w:p>
       <w:pPr>
         <w:pStyle w:val="Heading2"/>
@@ -16386,8 +17147,8 @@
         <w:t xml:space="preserve">, where two points hundreds or thousands of light-years apart in ordinary space may be very close indeed.</w:t>
       </w:r>
     </w:p>
-    <w:bookmarkEnd w:id="81"/>
-    <w:bookmarkStart w:id="82" w:name="drift-collapse-and-junctions"/>
+    <w:bookmarkEnd w:id="82"/>
+    <w:bookmarkStart w:id="83" w:name="drift-collapse-and-junctions"/>
     <w:p>
       <w:pPr>
         <w:pStyle w:val="Heading2"/>
@@ -16425,8 +17186,8 @@
         <w:t xml:space="preserve">, power gathers: every ship and every message between those regions must pass through.</w:t>
       </w:r>
     </w:p>
-    <w:bookmarkEnd w:id="82"/>
-    <w:bookmarkStart w:id="87" w:name="communication-through-the-deep-fold"/>
+    <w:bookmarkEnd w:id="83"/>
+    <w:bookmarkStart w:id="88" w:name="communication-through-the-deep-fold"/>
     <w:p>
       <w:pPr>
         <w:pStyle w:val="Heading2"/>
@@ -16443,7 +17204,7 @@
         <w:t xml:space="preserve">The civilizations of known space do not rely on conventional radio for interstellar communication. Instead, advanced societies exploit a phenomenon associated with the same hidden geometry that makes corridor travel possible.</w:t>
       </w:r>
     </w:p>
-    <w:bookmarkStart w:id="83" w:name="quantum-gravimetric-communication"/>
+    <w:bookmarkStart w:id="84" w:name="quantum-gravimetric-communication"/>
     <w:p>
       <w:pPr>
         <w:pStyle w:val="Heading3"/>
@@ -16489,8 +17250,8 @@
         <w:t xml:space="preserve">Consequently, quantum-gravimetric communication does not depend upon instantaneous communication through entanglement. The signal physically travels between transmitter and receiver, but through a region of spacetime in which the effective distance between the two points is enormously reduced. To observers limited to normal space, the result can appear to be faster-than-light communication.</w:t>
       </w:r>
     </w:p>
-    <w:bookmarkEnd w:id="83"/>
-    <w:bookmarkStart w:id="84" w:name="why-humanity-didnt-discover-it"/>
+    <w:bookmarkEnd w:id="84"/>
+    <w:bookmarkStart w:id="85" w:name="why-humanity-didnt-discover-it"/>
     <w:p>
       <w:pPr>
         <w:pStyle w:val="Heading3"/>
@@ -16533,8 +17294,8 @@
         <w:t xml:space="preserve">Humanity didn’t know the communications medium existed.</w:t>
       </w:r>
     </w:p>
-    <w:bookmarkEnd w:id="84"/>
-    <w:bookmarkStart w:id="85" w:name="the-antenna"/>
+    <w:bookmarkEnd w:id="85"/>
+    <w:bookmarkStart w:id="86" w:name="the-antenna"/>
     <w:p>
       <w:pPr>
         <w:pStyle w:val="Heading3"/>
@@ -16583,8 +17344,8 @@
         <w:t xml:space="preserve">Humanity had spent centuries listening for voices among the stars. The galaxy had never been silent. Humanity had simply been listening to the wrong part of the universe.</w:t>
       </w:r>
     </w:p>
-    <w:bookmarkEnd w:id="85"/>
-    <w:bookmarkStart w:id="86" w:name="the-network-is-the-map"/>
+    <w:bookmarkEnd w:id="86"/>
+    <w:bookmarkStart w:id="87" w:name="the-network-is-the-map"/>
     <w:p>
       <w:pPr>
         <w:pStyle w:val="Heading3"/>
@@ -16605,7 +17366,7 @@
       <w:pPr>
         <w:numPr>
           <w:ilvl w:val="0"/>
-          <w:numId w:val="1016"/>
+          <w:numId w:val="1018"/>
         </w:numPr>
         <w:pStyle w:val="Compact"/>
       </w:pPr>
@@ -16627,7 +17388,7 @@
       <w:pPr>
         <w:numPr>
           <w:ilvl w:val="0"/>
-          <w:numId w:val="1016"/>
+          <w:numId w:val="1018"/>
         </w:numPr>
         <w:pStyle w:val="Compact"/>
       </w:pPr>
@@ -16649,7 +17410,7 @@
       <w:pPr>
         <w:numPr>
           <w:ilvl w:val="0"/>
-          <w:numId w:val="1016"/>
+          <w:numId w:val="1018"/>
         </w:numPr>
         <w:pStyle w:val="Compact"/>
       </w:pPr>
@@ -16675,9 +17436,9 @@
         <w:t xml:space="preserve">Control of corridor intersections is one of the fundamental sources of political and economic power in known space. For civilizations such as the Tessan, power does not require conquest: control over contracts, debt, corridor access and communications can bind entire worlds without a Tessan soldier ever setting foot on them.</w:t>
       </w:r>
     </w:p>
-    <w:bookmarkEnd w:id="86"/>
     <w:bookmarkEnd w:id="87"/>
-    <w:bookmarkStart w:id="88" w:name="corridors-in-play"/>
+    <w:bookmarkEnd w:id="88"/>
+    <w:bookmarkStart w:id="89" w:name="corridors-in-play"/>
     <w:p>
       <w:pPr>
         <w:pStyle w:val="Heading2"/>
@@ -16690,7 +17451,7 @@
       <w:pPr>
         <w:numPr>
           <w:ilvl w:val="0"/>
-          <w:numId w:val="1017"/>
+          <w:numId w:val="1019"/>
         </w:numPr>
         <w:pStyle w:val="Compact"/>
       </w:pPr>
@@ -16725,7 +17486,7 @@
       <w:pPr>
         <w:numPr>
           <w:ilvl w:val="0"/>
-          <w:numId w:val="1017"/>
+          <w:numId w:val="1019"/>
         </w:numPr>
         <w:pStyle w:val="Compact"/>
       </w:pPr>
@@ -16747,7 +17508,7 @@
       <w:pPr>
         <w:numPr>
           <w:ilvl w:val="0"/>
-          <w:numId w:val="1017"/>
+          <w:numId w:val="1019"/>
         </w:numPr>
         <w:pStyle w:val="Compact"/>
       </w:pPr>
@@ -16769,7 +17530,7 @@
       <w:pPr>
         <w:numPr>
           <w:ilvl w:val="0"/>
-          <w:numId w:val="1017"/>
+          <w:numId w:val="1019"/>
         </w:numPr>
         <w:pStyle w:val="Compact"/>
       </w:pPr>
@@ -16791,7 +17552,7 @@
       <w:pPr>
         <w:numPr>
           <w:ilvl w:val="0"/>
-          <w:numId w:val="1017"/>
+          <w:numId w:val="1019"/>
         </w:numPr>
         <w:pStyle w:val="Compact"/>
       </w:pPr>
@@ -16813,7 +17574,7 @@
       <w:pPr>
         <w:numPr>
           <w:ilvl w:val="0"/>
-          <w:numId w:val="1017"/>
+          <w:numId w:val="1019"/>
         </w:numPr>
         <w:pStyle w:val="Compact"/>
       </w:pPr>
@@ -16864,7 +17625,7 @@
       <w:pPr>
         <w:numPr>
           <w:ilvl w:val="0"/>
-          <w:numId w:val="1017"/>
+          <w:numId w:val="1019"/>
         </w:numPr>
         <w:pStyle w:val="Compact"/>
       </w:pPr>
@@ -16895,8 +17656,8 @@
         <w:t xml:space="preserve">) and Mandate screenings.</w:t>
       </w:r>
     </w:p>
-    <w:bookmarkEnd w:id="88"/>
-    <w:bookmarkStart w:id="89" w:name="controlled-gear"/>
+    <w:bookmarkEnd w:id="89"/>
+    <w:bookmarkStart w:id="90" w:name="controlled-gear"/>
     <w:p>
       <w:pPr>
         <w:pStyle w:val="Heading2"/>
@@ -17459,7 +18220,7 @@
       <w:pPr>
         <w:numPr>
           <w:ilvl w:val="0"/>
-          <w:numId w:val="1018"/>
+          <w:numId w:val="1020"/>
         </w:numPr>
         <w:pStyle w:val="Compact"/>
       </w:pPr>
@@ -17549,7 +18310,7 @@
       <w:pPr>
         <w:numPr>
           <w:ilvl w:val="0"/>
-          <w:numId w:val="1018"/>
+          <w:numId w:val="1020"/>
         </w:numPr>
         <w:pStyle w:val="Compact"/>
       </w:pPr>
@@ -17615,9 +18376,9 @@
         <w:t xml:space="preserve">Edge.</w:t>
       </w:r>
     </w:p>
-    <w:bookmarkEnd w:id="89"/>
     <w:bookmarkEnd w:id="90"/>
-    <w:bookmarkStart w:id="96" w:name="ships-in-a-fight"/>
+    <w:bookmarkEnd w:id="91"/>
+    <w:bookmarkStart w:id="97" w:name="ships-in-a-fight"/>
     <w:p>
       <w:pPr>
         <w:pStyle w:val="Heading1"/>
@@ -17634,7 +18395,7 @@
         <w:t xml:space="preserve">Most crews would rather run than fight, and most fights between ships are short. These rules keep them fast: one roll per station, each exchange.</w:t>
       </w:r>
     </w:p>
-    <w:bookmarkStart w:id="91" w:name="range-in-space"/>
+    <w:bookmarkStart w:id="92" w:name="range-in-space"/>
     <w:p>
       <w:pPr>
         <w:pStyle w:val="Heading2"/>
@@ -18005,8 +18766,8 @@
         <w:t xml:space="preserve">contest. The winner may shift the range one band, in or out. A ship that wins at Extreme range by 5 or more can break contact and run for a corridor mouth or a metric jump.</w:t>
       </w:r>
     </w:p>
-    <w:bookmarkEnd w:id="91"/>
-    <w:bookmarkStart w:id="92" w:name="ship-weapons"/>
+    <w:bookmarkEnd w:id="92"/>
+    <w:bookmarkStart w:id="93" w:name="ship-weapons"/>
     <w:p>
       <w:pPr>
         <w:pStyle w:val="Heading2"/>
@@ -18455,8 +19216,8 @@
         </w:tc>
       </w:tr>
     </w:tbl>
-    <w:bookmarkEnd w:id="92"/>
-    <w:bookmarkStart w:id="93" w:name="the-exchange"/>
+    <w:bookmarkEnd w:id="93"/>
+    <w:bookmarkStart w:id="94" w:name="the-exchange"/>
     <w:p>
       <w:pPr>
         <w:pStyle w:val="Heading2"/>
@@ -19091,8 +19852,8 @@
         <w:t xml:space="preserve">A captain who takes an order doesn’t also work a station that exchange. Commanding well is the job.</w:t>
       </w:r>
     </w:p>
-    <w:bookmarkEnd w:id="93"/>
-    <w:bookmarkStart w:id="94" w:name="hull"/>
+    <w:bookmarkEnd w:id="94"/>
+    <w:bookmarkStart w:id="95" w:name="hull"/>
     <w:p>
       <w:pPr>
         <w:pStyle w:val="Heading2"/>
@@ -19378,8 +20139,8 @@
         <w:t xml:space="preserve">a dock clears the whole track; in the field an engineer patches one box a fight, and a full day’s work clears one more.</w:t>
       </w:r>
     </w:p>
-    <w:bookmarkEnd w:id="94"/>
-    <w:bookmarkStart w:id="95" w:name="enemy-ships"/>
+    <w:bookmarkEnd w:id="95"/>
+    <w:bookmarkStart w:id="96" w:name="enemy-ships"/>
     <w:p>
       <w:pPr>
         <w:pStyle w:val="Heading2"/>
@@ -20058,9 +20819,9 @@
         </w:tc>
       </w:tr>
     </w:tbl>
-    <w:bookmarkEnd w:id="95"/>
     <w:bookmarkEnd w:id="96"/>
-    <w:bookmarkStart w:id="126" w:name="peoples-of-the-corridors"/>
+    <w:bookmarkEnd w:id="97"/>
+    <w:bookmarkStart w:id="127" w:name="peoples-of-the-corridors"/>
     <w:p>
       <w:pPr>
         <w:pStyle w:val="Heading1"/>
@@ -20106,7 +20867,7 @@
         <w:t xml:space="preserve">chapter.</w:t>
       </w:r>
     </w:p>
-    <w:bookmarkStart w:id="97" w:name="the-political-landscape"/>
+    <w:bookmarkStart w:id="98" w:name="the-political-landscape"/>
     <w:p>
       <w:pPr>
         <w:pStyle w:val="Heading2"/>
@@ -20163,8 +20924,8 @@
         <w:t xml:space="preserve">No power controls the entire corridor network, and no species has a monopoly on intelligence, technological innovation, or ambition.</w:t>
       </w:r>
     </w:p>
-    <w:bookmarkEnd w:id="97"/>
-    <w:bookmarkStart w:id="103" w:name="the-established-and-emerging-powers"/>
+    <w:bookmarkEnd w:id="98"/>
+    <w:bookmarkStart w:id="104" w:name="the-established-and-emerging-powers"/>
     <w:p>
       <w:pPr>
         <w:pStyle w:val="Heading2"/>
@@ -20173,7 +20934,7 @@
         <w:t xml:space="preserve">The established and emerging powers</w:t>
       </w:r>
     </w:p>
-    <w:bookmarkStart w:id="98" w:name="humans"/>
+    <w:bookmarkStart w:id="99" w:name="humans"/>
     <w:p>
       <w:pPr>
         <w:pStyle w:val="Heading3"/>
@@ -20214,8 +20975,8 @@
         <w:t xml:space="preserve">Humanity’s economic innovations have begun influencing Tessan institutions, while its explorers and entrepreneurs push into regions older civilizations consider unprofitable or dangerous.</w:t>
       </w:r>
     </w:p>
-    <w:bookmarkEnd w:id="98"/>
-    <w:bookmarkStart w:id="99" w:name="tessan"/>
+    <w:bookmarkEnd w:id="99"/>
+    <w:bookmarkStart w:id="100" w:name="tessan"/>
     <w:p>
       <w:pPr>
         <w:pStyle w:val="Heading3"/>
@@ -20256,8 +21017,8 @@
         <w:t xml:space="preserve">Contact with humanity has introduced new economic thinking into Tessan society, creating a growing division between traditional creditors and reformers who question the profitability of perpetual debt.</w:t>
       </w:r>
     </w:p>
-    <w:bookmarkEnd w:id="99"/>
-    <w:bookmarkStart w:id="100" w:name="kel"/>
+    <w:bookmarkEnd w:id="100"/>
+    <w:bookmarkStart w:id="101" w:name="kel"/>
     <w:p>
       <w:pPr>
         <w:pStyle w:val="Heading3"/>
@@ -20298,8 +21059,8 @@
         <w:t xml:space="preserve">Today, Kel society is divided between contractual loyalists, reformers seeking negotiated emancipation, and radicals who believe their world’s debts can only be ended through force.</w:t>
       </w:r>
     </w:p>
-    <w:bookmarkEnd w:id="100"/>
-    <w:bookmarkStart w:id="101" w:name="mirrun"/>
+    <w:bookmarkEnd w:id="101"/>
+    <w:bookmarkStart w:id="102" w:name="mirrun"/>
     <w:p>
       <w:pPr>
         <w:pStyle w:val="Heading3"/>
@@ -20340,8 +21101,8 @@
         <w:t xml:space="preserve">Mirrun researchers are among the leading specialists in gravimetric resonance detection. Their biological sensitivity inspired several important improvements in corridor instrumentation. Their principal strategic concern is the protection of ocean worlds from extractive industries.</w:t>
       </w:r>
     </w:p>
-    <w:bookmarkEnd w:id="101"/>
-    <w:bookmarkStart w:id="102" w:name="ylith"/>
+    <w:bookmarkEnd w:id="102"/>
+    <w:bookmarkStart w:id="103" w:name="ylith"/>
     <w:p>
       <w:pPr>
         <w:pStyle w:val="Heading3"/>
@@ -20382,9 +21143,9 @@
         <w:t xml:space="preserve">Their independent city-states are renowned for navigation, long-range observation, and exploratory cartography. Ylith navigators have discovered corridors that conventional instruments initially failed to identify.</w:t>
       </w:r>
     </w:p>
-    <w:bookmarkEnd w:id="102"/>
     <w:bookmarkEnd w:id="103"/>
-    <w:bookmarkStart w:id="109" w:name="Xff4a93679c910774e2f02ac587efedb0ceda74a"/>
+    <w:bookmarkEnd w:id="104"/>
+    <w:bookmarkStart w:id="110" w:name="Xff4a93679c910774e2f02ac587efedb0ceda74a"/>
     <w:p>
       <w:pPr>
         <w:pStyle w:val="Heading2"/>
@@ -20417,7 +21178,7 @@
         <w:t xml:space="preserve">Both its internal factions and external enemies have exploited the shifting gravimetric corridors. An imperial province isolated for centuries can become an independent civilization. When its corridor reopens, the Hegemony may return to reclaim it.</w:t>
       </w:r>
     </w:p>
-    <w:bookmarkStart w:id="104" w:name="ozhvek-the-imperial-founders"/>
+    <w:bookmarkStart w:id="105" w:name="ozhvek-the-imperial-founders"/>
     <w:p>
       <w:pPr>
         <w:pStyle w:val="Heading3"/>
@@ -20466,8 +21227,8 @@
         <w:t xml:space="preserve">The greatest threat to Ozhvek dominance is not necessarily another species. It is the inability of their ruling houses to agree on what the Hegemony should become.</w:t>
       </w:r>
     </w:p>
-    <w:bookmarkEnd w:id="104"/>
-    <w:bookmarkStart w:id="105" w:name="dresh-the-imperial-soldiers"/>
+    <w:bookmarkEnd w:id="105"/>
+    <w:bookmarkStart w:id="106" w:name="dresh-the-imperial-soldiers"/>
     <w:p>
       <w:pPr>
         <w:pStyle w:val="Heading3"/>
@@ -20516,8 +21277,8 @@
         <w:t xml:space="preserve">Dresh military society prizes competence and mutual obligation. Their greatest political dispute concerns whether soldiers owe allegiance to the imperial throne, their commanders, or the populations they protect.</w:t>
       </w:r>
     </w:p>
-    <w:bookmarkEnd w:id="105"/>
-    <w:bookmarkStart w:id="106" w:name="shivar-the-keepers-of-orthodoxy"/>
+    <w:bookmarkEnd w:id="106"/>
+    <w:bookmarkStart w:id="107" w:name="shivar-the-keepers-of-orthodoxy"/>
     <w:p>
       <w:pPr>
         <w:pStyle w:val="Heading3"/>
@@ -20574,8 +21335,8 @@
         <w:t xml:space="preserve">The resulting religious schism has fueled uprisings, political assassinations, and wars within the Hegemony.</w:t>
       </w:r>
     </w:p>
-    <w:bookmarkEnd w:id="106"/>
-    <w:bookmarkStart w:id="107" w:name="brulvek-the-industrial-survivors"/>
+    <w:bookmarkEnd w:id="107"/>
+    <w:bookmarkStart w:id="108" w:name="brulvek-the-industrial-survivors"/>
     <w:p>
       <w:pPr>
         <w:pStyle w:val="Heading3"/>
@@ -20632,8 +21393,8 @@
         <w:t xml:space="preserve">Brulvek engineers are highly sought after throughout known space, particularly for their ability to restore machinery that has operated for centuries without replacement parts.</w:t>
       </w:r>
     </w:p>
-    <w:bookmarkEnd w:id="107"/>
-    <w:bookmarkStart w:id="108" w:name="zhaq-the-lost-province"/>
+    <w:bookmarkEnd w:id="108"/>
+    <w:bookmarkStart w:id="109" w:name="zhaq-the-lost-province"/>
     <w:p>
       <w:pPr>
         <w:pStyle w:val="Heading3"/>
@@ -20706,9 +21467,9 @@
         <w:t xml:space="preserve">Their continuing resistance has become a symbol for separatist movements throughout imperial space.</w:t>
       </w:r>
     </w:p>
-    <w:bookmarkEnd w:id="108"/>
     <w:bookmarkEnd w:id="109"/>
-    <w:bookmarkStart w:id="125" w:name="X7cf45656e26c6332fca34295f43177ee2dc74b7"/>
+    <w:bookmarkEnd w:id="110"/>
+    <w:bookmarkStart w:id="126" w:name="X7cf45656e26c6332fca34295f43177ee2dc74b7"/>
     <w:p>
       <w:pPr>
         <w:pStyle w:val="Heading2"/>
@@ -20717,7 +21478,7 @@
         <w:t xml:space="preserve">Independent civilizations and regional powers</w:t>
       </w:r>
     </w:p>
-    <w:bookmarkStart w:id="110" w:name="veyari-the-memory-keepers"/>
+    <w:bookmarkStart w:id="111" w:name="veyari-the-memory-keepers"/>
     <w:p>
       <w:pPr>
         <w:pStyle w:val="Heading3"/>
@@ -20774,8 +21535,8 @@
         <w:t xml:space="preserve">Their greatest strength is knowledge. Their greatest vulnerability is the assumption that knowledge should be preserved even when powerful civilizations would prefer it forgotten.</w:t>
       </w:r>
     </w:p>
-    <w:bookmarkEnd w:id="110"/>
-    <w:bookmarkStart w:id="111" w:name="eshuum-the-distributed-minds"/>
+    <w:bookmarkEnd w:id="111"/>
+    <w:bookmarkStart w:id="112" w:name="eshuum-the-distributed-minds"/>
     <w:p>
       <w:pPr>
         <w:pStyle w:val="Heading3"/>
@@ -20832,8 +21593,8 @@
         <w:t xml:space="preserve">Their political institutions strongly oppose forced separation, biological experimentation without consent, and the ownership of intelligent organisms. These positions have brought them into direct conflict with several Hegemony research authorities.</w:t>
       </w:r>
     </w:p>
-    <w:bookmarkEnd w:id="111"/>
-    <w:bookmarkStart w:id="112" w:name="khaum-the-deep-dwellers"/>
+    <w:bookmarkEnd w:id="112"/>
+    <w:bookmarkStart w:id="113" w:name="khaum-the-deep-dwellers"/>
     <w:p>
       <w:pPr>
         <w:pStyle w:val="Heading3"/>
@@ -20898,8 +21659,8 @@
         <w:t xml:space="preserve">Their underground refuges have sheltered refugees from multiple Hegemony campaigns.</w:t>
       </w:r>
     </w:p>
-    <w:bookmarkEnd w:id="112"/>
-    <w:bookmarkStart w:id="113" w:name="vael-the-living-fleets"/>
+    <w:bookmarkEnd w:id="113"/>
+    <w:bookmarkStart w:id="114" w:name="vael-the-living-fleets"/>
     <w:p>
       <w:pPr>
         <w:pStyle w:val="Heading3"/>
@@ -20956,8 +21717,8 @@
         <w:t xml:space="preserve">Vael flotillas have repeatedly been caught between Hegemony forces and separatist territories. Their determination to remain politically independent has made them both valuable intermediaries and frequent targets of suspicion.</w:t>
       </w:r>
     </w:p>
-    <w:bookmarkEnd w:id="113"/>
-    <w:bookmarkStart w:id="114" w:name="thrum-the-resonant-people"/>
+    <w:bookmarkEnd w:id="114"/>
+    <w:bookmarkStart w:id="115" w:name="thrum-the-resonant-people"/>
     <w:p>
       <w:pPr>
         <w:pStyle w:val="Heading3"/>
@@ -21022,8 +21783,8 @@
         <w:t xml:space="preserve">Their technology is widely respected, although their reluctance to permit military applications has strained relations with several governments.</w:t>
       </w:r>
     </w:p>
-    <w:bookmarkEnd w:id="114"/>
-    <w:bookmarkStart w:id="115" w:name="corvani-the-ecological-architects"/>
+    <w:bookmarkEnd w:id="115"/>
+    <w:bookmarkStart w:id="116" w:name="corvani-the-ecological-architects"/>
     <w:p>
       <w:pPr>
         <w:pStyle w:val="Heading3"/>
@@ -21080,8 +21841,8 @@
         <w:t xml:space="preserve">Corvani restoration teams operate on worlds devastated by Hegemony industrial extraction, although their insistence on ecological safeguards frequently brings them into conflict with mining corporations and colonial governments.</w:t>
       </w:r>
     </w:p>
-    <w:bookmarkEnd w:id="115"/>
-    <w:bookmarkStart w:id="116" w:name="uxarra-the-shifting-ones"/>
+    <w:bookmarkEnd w:id="116"/>
+    <w:bookmarkStart w:id="117" w:name="uxarra-the-shifting-ones"/>
     <w:p>
       <w:pPr>
         <w:pStyle w:val="Heading3"/>
@@ -21138,8 +21899,8 @@
         <w:t xml:space="preserve">Uxarra explorers and rescue specialists are highly valued for operations in unstable environments, particularly worlds affected by corridor disruptions or natural disasters.</w:t>
       </w:r>
     </w:p>
-    <w:bookmarkEnd w:id="116"/>
-    <w:bookmarkStart w:id="117" w:name="sen-the-patient-observers"/>
+    <w:bookmarkEnd w:id="117"/>
+    <w:bookmarkStart w:id="118" w:name="sen-the-patient-observers"/>
     <w:p>
       <w:pPr>
         <w:pStyle w:val="Heading3"/>
@@ -21204,8 +21965,8 @@
         <w:t xml:space="preserve">Their governments rarely intervene in external affairs, but their warnings concerning corridor instability carry considerable weight among navigators and scientists.</w:t>
       </w:r>
     </w:p>
-    <w:bookmarkEnd w:id="117"/>
-    <w:bookmarkStart w:id="118" w:name="joruun-the-borderland-confederates"/>
+    <w:bookmarkEnd w:id="118"/>
+    <w:bookmarkStart w:id="119" w:name="joruun-the-borderland-confederates"/>
     <w:p>
       <w:pPr>
         <w:pStyle w:val="Heading3"/>
@@ -21270,8 +22031,8 @@
         <w:t xml:space="preserve">Their greatest political challenge is maintaining unity during periods when the imperial threat appears to recede.</w:t>
       </w:r>
     </w:p>
-    <w:bookmarkEnd w:id="118"/>
-    <w:bookmarkStart w:id="119" w:name="qor-the-silicon-minds"/>
+    <w:bookmarkEnd w:id="119"/>
+    <w:bookmarkStart w:id="120" w:name="qor-the-silicon-minds"/>
     <w:p>
       <w:pPr>
         <w:pStyle w:val="Heading3"/>
@@ -21344,8 +22105,8 @@
         <w:t xml:space="preserve">Their relationship with the Tessan is complex: Tessan capital has helped expand Qor industry, but Qor political leaders refuse to permit debt arrangements that threaten planetary sovereignty.</w:t>
       </w:r>
     </w:p>
-    <w:bookmarkEnd w:id="119"/>
-    <w:bookmarkStart w:id="120" w:name="ommek-the-makers-of-machines"/>
+    <w:bookmarkEnd w:id="120"/>
+    <w:bookmarkStart w:id="121" w:name="ommek-the-makers-of-machines"/>
     <w:p>
       <w:pPr>
         <w:pStyle w:val="Heading3"/>
@@ -21418,8 +22179,8 @@
         <w:t xml:space="preserve">Ommek defensive systems have made direct conquest prohibitively expensive.</w:t>
       </w:r>
     </w:p>
-    <w:bookmarkEnd w:id="120"/>
-    <w:bookmarkStart w:id="121" w:name="vesh-the-newcomers"/>
+    <w:bookmarkEnd w:id="121"/>
+    <w:bookmarkStart w:id="122" w:name="vesh-the-newcomers"/>
     <w:p>
       <w:pPr>
         <w:pStyle w:val="Heading3"/>
@@ -21492,8 +22253,8 @@
         <w:t xml:space="preserve">Human diplomats have developed a particularly strong interest in Vesh affairs, recognizing many of the difficulties humanity experienced during its own early expansion.</w:t>
       </w:r>
     </w:p>
-    <w:bookmarkEnd w:id="121"/>
-    <w:bookmarkStart w:id="122" w:name="uth-the-refugees-of-empire"/>
+    <w:bookmarkEnd w:id="122"/>
+    <w:bookmarkStart w:id="123" w:name="uth-the-refugees-of-empire"/>
     <w:p>
       <w:pPr>
         <w:pStyle w:val="Heading3"/>
@@ -21566,8 +22327,8 @@
         <w:t xml:space="preserve">Uth activists are prominent in anti-Hegemony movements, although many Uth reject the idea that their people should be defined exclusively by historical suffering.</w:t>
       </w:r>
     </w:p>
-    <w:bookmarkEnd w:id="122"/>
-    <w:bookmarkStart w:id="123" w:name="draelin-the-corridor-cartographers"/>
+    <w:bookmarkEnd w:id="123"/>
+    <w:bookmarkStart w:id="124" w:name="draelin-the-corridor-cartographers"/>
     <w:p>
       <w:pPr>
         <w:pStyle w:val="Heading3"/>
@@ -21648,8 +22409,8 @@
         <w:t xml:space="preserve">Their internal politics are shaped by a central question: whether knowledge of safe passage should be treated as a public good or a commercial asset.</w:t>
       </w:r>
     </w:p>
-    <w:bookmarkEnd w:id="123"/>
-    <w:bookmarkStart w:id="124" w:name="zethri-the-children-of-the-collapse"/>
+    <w:bookmarkEnd w:id="124"/>
+    <w:bookmarkStart w:id="125" w:name="zethri-the-children-of-the-collapse"/>
     <w:p>
       <w:pPr>
         <w:pStyle w:val="Heading3"/>
@@ -21730,10 +22491,10 @@
         <w:t xml:space="preserve">Zethri engineers and planners specialize in building settlements capable of surviving prolonged isolation.</w:t>
       </w:r>
     </w:p>
-    <w:bookmarkEnd w:id="124"/>
     <w:bookmarkEnd w:id="125"/>
     <w:bookmarkEnd w:id="126"/>
-    <w:bookmarkStart w:id="130" w:name="X3145843e1df3f61def4f8ab8c5430269a2a5813"/>
+    <w:bookmarkEnd w:id="127"/>
+    <w:bookmarkStart w:id="131" w:name="X3145843e1df3f61def4f8ab8c5430269a2a5813"/>
     <w:p>
       <w:pPr>
         <w:pStyle w:val="Heading1"/>
@@ -21750,7 +22511,7 @@
         <w:t xml:space="preserve">The Hegemony deserves particular attention because its decline influences nearly every civilization in Fracture Lines.</w:t>
       </w:r>
     </w:p>
-    <w:bookmarkStart w:id="127" w:name="the-five-eras"/>
+    <w:bookmarkStart w:id="128" w:name="the-five-eras"/>
     <w:p>
       <w:pPr>
         <w:pStyle w:val="Heading2"/>
@@ -21763,7 +22524,7 @@
       <w:pPr>
         <w:numPr>
           <w:ilvl w:val="0"/>
-          <w:numId w:val="1019"/>
+          <w:numId w:val="1021"/>
         </w:numPr>
       </w:pPr>
       <w:r>
@@ -21784,7 +22545,7 @@
       <w:pPr>
         <w:numPr>
           <w:ilvl w:val="0"/>
-          <w:numId w:val="1019"/>
+          <w:numId w:val="1021"/>
         </w:numPr>
       </w:pPr>
       <w:r>
@@ -21805,7 +22566,7 @@
       <w:pPr>
         <w:numPr>
           <w:ilvl w:val="0"/>
-          <w:numId w:val="1019"/>
+          <w:numId w:val="1021"/>
         </w:numPr>
       </w:pPr>
       <w:r>
@@ -21826,7 +22587,7 @@
       <w:pPr>
         <w:numPr>
           <w:ilvl w:val="0"/>
-          <w:numId w:val="1019"/>
+          <w:numId w:val="1021"/>
         </w:numPr>
       </w:pPr>
       <w:r>
@@ -21847,7 +22608,7 @@
       <w:pPr>
         <w:numPr>
           <w:ilvl w:val="0"/>
-          <w:numId w:val="1019"/>
+          <w:numId w:val="1021"/>
         </w:numPr>
       </w:pPr>
       <w:r>
@@ -21928,8 +22689,8 @@
         <w:t xml:space="preserve">And an imperial fleet may emerge to announce that the worlds beyond it still belong to the Emperor.</w:t>
       </w:r>
     </w:p>
-    <w:bookmarkEnd w:id="127"/>
-    <w:bookmarkStart w:id="128" w:name="species-and-political-affiliations"/>
+    <w:bookmarkEnd w:id="128"/>
+    <w:bookmarkStart w:id="129" w:name="species-and-political-affiliations"/>
     <w:p>
       <w:pPr>
         <w:pStyle w:val="Heading2"/>
@@ -22238,8 +22999,8 @@
         </w:tc>
       </w:tr>
     </w:tbl>
-    <w:bookmarkEnd w:id="128"/>
-    <w:bookmarkStart w:id="129" w:name="the-galaxy-as-a-setting-for-adventure"/>
+    <w:bookmarkEnd w:id="129"/>
+    <w:bookmarkStart w:id="130" w:name="the-galaxy-as-a-setting-for-adventure"/>
     <w:p>
       <w:pPr>
         <w:pStyle w:val="Heading2"/>
@@ -22296,9 +23057,9 @@
         <w:t xml:space="preserve">The central conflict of Fracture Lines is not simply the struggle between civilizations. It is the struggle between established power and an interstellar order that refuses to remain static.</w:t>
       </w:r>
     </w:p>
-    <w:bookmarkEnd w:id="129"/>
     <w:bookmarkEnd w:id="130"/>
-    <w:bookmarkStart w:id="131" w:name="psionics-and-the-mandates"/>
+    <w:bookmarkEnd w:id="131"/>
+    <w:bookmarkStart w:id="132" w:name="psionics-and-the-mandates"/>
     <w:p>
       <w:pPr>
         <w:pStyle w:val="Heading1"/>
@@ -22385,7 +23146,7 @@
       <w:pPr>
         <w:numPr>
           <w:ilvl w:val="0"/>
-          <w:numId w:val="1020"/>
+          <w:numId w:val="1022"/>
         </w:numPr>
         <w:pStyle w:val="Compact"/>
       </w:pPr>
@@ -22471,7 +23232,7 @@
       <w:pPr>
         <w:numPr>
           <w:ilvl w:val="0"/>
-          <w:numId w:val="1020"/>
+          <w:numId w:val="1022"/>
         </w:numPr>
         <w:pStyle w:val="Compact"/>
       </w:pPr>
@@ -22506,7 +23267,7 @@
       <w:pPr>
         <w:numPr>
           <w:ilvl w:val="0"/>
-          <w:numId w:val="1020"/>
+          <w:numId w:val="1022"/>
         </w:numPr>
         <w:pStyle w:val="Compact"/>
       </w:pPr>
@@ -22544,7 +23305,7 @@
       <w:pPr>
         <w:numPr>
           <w:ilvl w:val="0"/>
-          <w:numId w:val="1020"/>
+          <w:numId w:val="1022"/>
         </w:numPr>
         <w:pStyle w:val="Compact"/>
       </w:pPr>
@@ -23019,8 +23780,8 @@
         </w:tc>
       </w:tr>
     </w:tbl>
-    <w:bookmarkEnd w:id="131"/>
-    <w:bookmarkStart w:id="132" w:name="technology"/>
+    <w:bookmarkEnd w:id="132"/>
+    <w:bookmarkStart w:id="133" w:name="technology"/>
     <w:p>
       <w:pPr>
         <w:pStyle w:val="Heading1"/>
@@ -23033,7 +23794,7 @@
       <w:pPr>
         <w:numPr>
           <w:ilvl w:val="0"/>
-          <w:numId w:val="1021"/>
+          <w:numId w:val="1023"/>
         </w:numPr>
         <w:pStyle w:val="Compact"/>
       </w:pPr>
@@ -23103,7 +23864,7 @@
       <w:pPr>
         <w:numPr>
           <w:ilvl w:val="0"/>
-          <w:numId w:val="1021"/>
+          <w:numId w:val="1023"/>
         </w:numPr>
         <w:pStyle w:val="Compact"/>
       </w:pPr>
@@ -23173,7 +23934,7 @@
       <w:pPr>
         <w:numPr>
           <w:ilvl w:val="0"/>
-          <w:numId w:val="1021"/>
+          <w:numId w:val="1023"/>
         </w:numPr>
         <w:pStyle w:val="Compact"/>
       </w:pPr>
@@ -23195,7 +23956,7 @@
       <w:pPr>
         <w:numPr>
           <w:ilvl w:val="0"/>
-          <w:numId w:val="1021"/>
+          <w:numId w:val="1023"/>
         </w:numPr>
         <w:pStyle w:val="Compact"/>
       </w:pPr>
@@ -23233,7 +23994,7 @@
       <w:pPr>
         <w:numPr>
           <w:ilvl w:val="0"/>
-          <w:numId w:val="1021"/>
+          <w:numId w:val="1023"/>
         </w:numPr>
         <w:pStyle w:val="Compact"/>
       </w:pPr>
@@ -23280,8 +24041,8 @@
         <w:t xml:space="preserve">advantage starts the crew with a ship and a box of Debt. Ship fights and chases run as clocks, with Piloting, Engineering, Sensors and Firearms rolls.</w:t>
       </w:r>
     </w:p>
-    <w:bookmarkEnd w:id="132"/>
-    <w:bookmarkStart w:id="133" w:name="threats"/>
+    <w:bookmarkEnd w:id="133"/>
+    <w:bookmarkStart w:id="134" w:name="threats"/>
     <w:p>
       <w:pPr>
         <w:pStyle w:val="Heading1"/>
@@ -24766,8 +25527,8 @@
         <w:t xml:space="preserve">For a tougher version, add +1 to its targets and one box; for a weaker one, subtract.</w:t>
       </w:r>
     </w:p>
-    <w:bookmarkEnd w:id="133"/>
-    <w:bookmarkStart w:id="141" w:name="ready-made-characters"/>
+    <w:bookmarkEnd w:id="134"/>
+    <w:bookmarkStart w:id="142" w:name="ready-made-characters"/>
     <w:p>
       <w:pPr>
         <w:pStyle w:val="Heading1"/>
@@ -24784,7 +25545,7 @@
         <w:t xml:space="preserve">Characters ready to play, for one-shots, new players, or a group in a hurry. Each follows the creation rules exactly, and their connections tie them together. In the creator, choose one from the ready-made list to open it and make it your own.</w:t>
       </w:r>
     </w:p>
-    <w:bookmarkStart w:id="134" w:name="thessk-varo-hun"/>
+    <w:bookmarkStart w:id="135" w:name="thessk-varo-hun"/>
     <w:p>
       <w:pPr>
         <w:pStyle w:val="Heading2"/>
@@ -24815,7 +25576,7 @@
       <w:pPr>
         <w:numPr>
           <w:ilvl w:val="0"/>
-          <w:numId w:val="1022"/>
+          <w:numId w:val="1024"/>
         </w:numPr>
         <w:pStyle w:val="Compact"/>
       </w:pPr>
@@ -24853,7 +25614,7 @@
       <w:pPr>
         <w:numPr>
           <w:ilvl w:val="0"/>
-          <w:numId w:val="1022"/>
+          <w:numId w:val="1024"/>
         </w:numPr>
         <w:pStyle w:val="Compact"/>
       </w:pPr>
@@ -24875,7 +25636,7 @@
       <w:pPr>
         <w:numPr>
           <w:ilvl w:val="0"/>
-          <w:numId w:val="1022"/>
+          <w:numId w:val="1024"/>
         </w:numPr>
         <w:pStyle w:val="Compact"/>
       </w:pPr>
@@ -24897,7 +25658,7 @@
       <w:pPr>
         <w:numPr>
           <w:ilvl w:val="0"/>
-          <w:numId w:val="1022"/>
+          <w:numId w:val="1024"/>
         </w:numPr>
         <w:pStyle w:val="Compact"/>
       </w:pPr>
@@ -24935,7 +25696,7 @@
       <w:pPr>
         <w:numPr>
           <w:ilvl w:val="0"/>
-          <w:numId w:val="1022"/>
+          <w:numId w:val="1024"/>
         </w:numPr>
         <w:pStyle w:val="Compact"/>
       </w:pPr>
@@ -24969,8 +25730,8 @@
         <w:t xml:space="preserve">She sold Mara Okonkwo the first debt Mara forgave. Neither regrets it.</w:t>
       </w:r>
     </w:p>
-    <w:bookmarkEnd w:id="134"/>
-    <w:bookmarkStart w:id="135" w:name="kesh-of-the-seventh-hive"/>
+    <w:bookmarkEnd w:id="135"/>
+    <w:bookmarkStart w:id="136" w:name="kesh-of-the-seventh-hive"/>
     <w:p>
       <w:pPr>
         <w:pStyle w:val="Heading2"/>
@@ -25001,7 +25762,7 @@
       <w:pPr>
         <w:numPr>
           <w:ilvl w:val="0"/>
-          <w:numId w:val="1023"/>
+          <w:numId w:val="1025"/>
         </w:numPr>
         <w:pStyle w:val="Compact"/>
       </w:pPr>
@@ -25039,7 +25800,7 @@
       <w:pPr>
         <w:numPr>
           <w:ilvl w:val="0"/>
-          <w:numId w:val="1023"/>
+          <w:numId w:val="1025"/>
         </w:numPr>
         <w:pStyle w:val="Compact"/>
       </w:pPr>
@@ -25061,7 +25822,7 @@
       <w:pPr>
         <w:numPr>
           <w:ilvl w:val="0"/>
-          <w:numId w:val="1023"/>
+          <w:numId w:val="1025"/>
         </w:numPr>
         <w:pStyle w:val="Compact"/>
       </w:pPr>
@@ -25083,7 +25844,7 @@
       <w:pPr>
         <w:numPr>
           <w:ilvl w:val="0"/>
-          <w:numId w:val="1023"/>
+          <w:numId w:val="1025"/>
         </w:numPr>
         <w:pStyle w:val="Compact"/>
       </w:pPr>
@@ -25121,7 +25882,7 @@
       <w:pPr>
         <w:numPr>
           <w:ilvl w:val="0"/>
-          <w:numId w:val="1023"/>
+          <w:numId w:val="1025"/>
         </w:numPr>
         <w:pStyle w:val="Compact"/>
       </w:pPr>
@@ -25155,8 +25916,8 @@
         <w:t xml:space="preserve">Ilvi Saradh’s AI found the corridor Kesh’s hive needed; Kesh owes them both.</w:t>
       </w:r>
     </w:p>
-    <w:bookmarkEnd w:id="135"/>
-    <w:bookmarkStart w:id="136" w:name="rook"/>
+    <w:bookmarkEnd w:id="136"/>
+    <w:bookmarkStart w:id="137" w:name="rook"/>
     <w:p>
       <w:pPr>
         <w:pStyle w:val="Heading2"/>
@@ -25187,7 +25948,7 @@
       <w:pPr>
         <w:numPr>
           <w:ilvl w:val="0"/>
-          <w:numId w:val="1024"/>
+          <w:numId w:val="1026"/>
         </w:numPr>
         <w:pStyle w:val="Compact"/>
       </w:pPr>
@@ -25225,7 +25986,7 @@
       <w:pPr>
         <w:numPr>
           <w:ilvl w:val="0"/>
-          <w:numId w:val="1024"/>
+          <w:numId w:val="1026"/>
         </w:numPr>
         <w:pStyle w:val="Compact"/>
       </w:pPr>
@@ -25247,7 +26008,7 @@
       <w:pPr>
         <w:numPr>
           <w:ilvl w:val="0"/>
-          <w:numId w:val="1024"/>
+          <w:numId w:val="1026"/>
         </w:numPr>
         <w:pStyle w:val="Compact"/>
       </w:pPr>
@@ -25269,7 +26030,7 @@
       <w:pPr>
         <w:numPr>
           <w:ilvl w:val="0"/>
-          <w:numId w:val="1024"/>
+          <w:numId w:val="1026"/>
         </w:numPr>
         <w:pStyle w:val="Compact"/>
       </w:pPr>
@@ -25307,7 +26068,7 @@
       <w:pPr>
         <w:numPr>
           <w:ilvl w:val="0"/>
-          <w:numId w:val="1024"/>
+          <w:numId w:val="1026"/>
         </w:numPr>
         <w:pStyle w:val="Compact"/>
       </w:pPr>
@@ -25341,8 +26102,8 @@
         <w:t xml:space="preserve">Brakka was on the other side of that border war. They found out over a drink, and stayed friends.</w:t>
       </w:r>
     </w:p>
-    <w:bookmarkEnd w:id="136"/>
-    <w:bookmarkStart w:id="137" w:name="ilvi-saradh"/>
+    <w:bookmarkEnd w:id="137"/>
+    <w:bookmarkStart w:id="138" w:name="ilvi-saradh"/>
     <w:p>
       <w:pPr>
         <w:pStyle w:val="Heading2"/>
@@ -25373,7 +26134,7 @@
       <w:pPr>
         <w:numPr>
           <w:ilvl w:val="0"/>
-          <w:numId w:val="1025"/>
+          <w:numId w:val="1027"/>
         </w:numPr>
         <w:pStyle w:val="Compact"/>
       </w:pPr>
@@ -25411,7 +26172,7 @@
       <w:pPr>
         <w:numPr>
           <w:ilvl w:val="0"/>
-          <w:numId w:val="1025"/>
+          <w:numId w:val="1027"/>
         </w:numPr>
         <w:pStyle w:val="Compact"/>
       </w:pPr>
@@ -25433,7 +26194,7 @@
       <w:pPr>
         <w:numPr>
           <w:ilvl w:val="0"/>
-          <w:numId w:val="1025"/>
+          <w:numId w:val="1027"/>
         </w:numPr>
         <w:pStyle w:val="Compact"/>
       </w:pPr>
@@ -25455,7 +26216,7 @@
       <w:pPr>
         <w:numPr>
           <w:ilvl w:val="0"/>
-          <w:numId w:val="1025"/>
+          <w:numId w:val="1027"/>
         </w:numPr>
         <w:pStyle w:val="Compact"/>
       </w:pPr>
@@ -25493,7 +26254,7 @@
       <w:pPr>
         <w:numPr>
           <w:ilvl w:val="0"/>
-          <w:numId w:val="1025"/>
+          <w:numId w:val="1027"/>
         </w:numPr>
         <w:pStyle w:val="Compact"/>
       </w:pPr>
@@ -25527,8 +26288,8 @@
         <w:t xml:space="preserve">Quill found the corridor Kesh’s hive needed. Ilvi never told the guild.</w:t>
       </w:r>
     </w:p>
-    <w:bookmarkEnd w:id="137"/>
-    <w:bookmarkStart w:id="138" w:name="dr.-anwe-tal"/>
+    <w:bookmarkEnd w:id="138"/>
+    <w:bookmarkStart w:id="139" w:name="dr.-anwe-tal"/>
     <w:p>
       <w:pPr>
         <w:pStyle w:val="Heading2"/>
@@ -25559,7 +26320,7 @@
       <w:pPr>
         <w:numPr>
           <w:ilvl w:val="0"/>
-          <w:numId w:val="1026"/>
+          <w:numId w:val="1028"/>
         </w:numPr>
         <w:pStyle w:val="Compact"/>
       </w:pPr>
@@ -25597,7 +26358,7 @@
       <w:pPr>
         <w:numPr>
           <w:ilvl w:val="0"/>
-          <w:numId w:val="1026"/>
+          <w:numId w:val="1028"/>
         </w:numPr>
         <w:pStyle w:val="Compact"/>
       </w:pPr>
@@ -25619,7 +26380,7 @@
       <w:pPr>
         <w:numPr>
           <w:ilvl w:val="0"/>
-          <w:numId w:val="1026"/>
+          <w:numId w:val="1028"/>
         </w:numPr>
         <w:pStyle w:val="Compact"/>
       </w:pPr>
@@ -25641,7 +26402,7 @@
       <w:pPr>
         <w:numPr>
           <w:ilvl w:val="0"/>
-          <w:numId w:val="1026"/>
+          <w:numId w:val="1028"/>
         </w:numPr>
         <w:pStyle w:val="Compact"/>
       </w:pPr>
@@ -25679,7 +26440,7 @@
       <w:pPr>
         <w:numPr>
           <w:ilvl w:val="0"/>
-          <w:numId w:val="1026"/>
+          <w:numId w:val="1028"/>
         </w:numPr>
         <w:pStyle w:val="Compact"/>
       </w:pPr>
@@ -25713,8 +26474,8 @@
         <w:t xml:space="preserve">Sable cleaned up the corporation’s files that proved Anwe’s case, and asked nothing for it.</w:t>
       </w:r>
     </w:p>
-    <w:bookmarkEnd w:id="138"/>
-    <w:bookmarkStart w:id="139" w:name="brakka"/>
+    <w:bookmarkEnd w:id="139"/>
+    <w:bookmarkStart w:id="140" w:name="brakka"/>
     <w:p>
       <w:pPr>
         <w:pStyle w:val="Heading2"/>
@@ -25745,7 +26506,7 @@
       <w:pPr>
         <w:numPr>
           <w:ilvl w:val="0"/>
-          <w:numId w:val="1027"/>
+          <w:numId w:val="1029"/>
         </w:numPr>
         <w:pStyle w:val="Compact"/>
       </w:pPr>
@@ -25783,7 +26544,7 @@
       <w:pPr>
         <w:numPr>
           <w:ilvl w:val="0"/>
-          <w:numId w:val="1027"/>
+          <w:numId w:val="1029"/>
         </w:numPr>
         <w:pStyle w:val="Compact"/>
       </w:pPr>
@@ -25805,7 +26566,7 @@
       <w:pPr>
         <w:numPr>
           <w:ilvl w:val="0"/>
-          <w:numId w:val="1027"/>
+          <w:numId w:val="1029"/>
         </w:numPr>
         <w:pStyle w:val="Compact"/>
       </w:pPr>
@@ -25827,7 +26588,7 @@
       <w:pPr>
         <w:numPr>
           <w:ilvl w:val="0"/>
-          <w:numId w:val="1027"/>
+          <w:numId w:val="1029"/>
         </w:numPr>
         <w:pStyle w:val="Compact"/>
       </w:pPr>
@@ -25865,7 +26626,7 @@
       <w:pPr>
         <w:numPr>
           <w:ilvl w:val="0"/>
-          <w:numId w:val="1027"/>
+          <w:numId w:val="1029"/>
         </w:numPr>
         <w:pStyle w:val="Compact"/>
       </w:pPr>
@@ -25899,8 +26660,8 @@
         <w:t xml:space="preserve">Rook fought him across the Zhaq border once. Now Rook watches his back.</w:t>
       </w:r>
     </w:p>
-    <w:bookmarkEnd w:id="139"/>
-    <w:bookmarkStart w:id="140" w:name="sable"/>
+    <w:bookmarkEnd w:id="140"/>
+    <w:bookmarkStart w:id="141" w:name="sable"/>
     <w:p>
       <w:pPr>
         <w:pStyle w:val="Heading2"/>
@@ -25931,7 +26692,7 @@
       <w:pPr>
         <w:numPr>
           <w:ilvl w:val="0"/>
-          <w:numId w:val="1028"/>
+          <w:numId w:val="1030"/>
         </w:numPr>
         <w:pStyle w:val="Compact"/>
       </w:pPr>
@@ -25969,7 +26730,7 @@
       <w:pPr>
         <w:numPr>
           <w:ilvl w:val="0"/>
-          <w:numId w:val="1028"/>
+          <w:numId w:val="1030"/>
         </w:numPr>
         <w:pStyle w:val="Compact"/>
       </w:pPr>
@@ -25991,7 +26752,7 @@
       <w:pPr>
         <w:numPr>
           <w:ilvl w:val="0"/>
-          <w:numId w:val="1028"/>
+          <w:numId w:val="1030"/>
         </w:numPr>
         <w:pStyle w:val="Compact"/>
       </w:pPr>
@@ -26013,7 +26774,7 @@
       <w:pPr>
         <w:numPr>
           <w:ilvl w:val="0"/>
-          <w:numId w:val="1028"/>
+          <w:numId w:val="1030"/>
         </w:numPr>
         <w:pStyle w:val="Compact"/>
       </w:pPr>
@@ -26051,7 +26812,7 @@
       <w:pPr>
         <w:numPr>
           <w:ilvl w:val="0"/>
-          <w:numId w:val="1028"/>
+          <w:numId w:val="1030"/>
         </w:numPr>
         <w:pStyle w:val="Compact"/>
       </w:pPr>
@@ -26085,9 +26846,9 @@
         <w:t xml:space="preserve">Sable cleaned up the files that proved Dr. Anwe Tal’s case, for nothing. Anwe wonders why.</w:t>
       </w:r>
     </w:p>
-    <w:bookmarkEnd w:id="140"/>
     <w:bookmarkEnd w:id="141"/>
-    <w:bookmarkStart w:id="142" w:name="advantages"/>
+    <w:bookmarkEnd w:id="142"/>
+    <w:bookmarkStart w:id="143" w:name="advantages"/>
     <w:p>
       <w:pPr>
         <w:pStyle w:val="Heading1"/>
@@ -26986,8 +27747,8 @@
         <w:t xml:space="preserve">belongs to the whole crew once it’s taken.</w:t>
       </w:r>
     </w:p>
-    <w:bookmarkEnd w:id="142"/>
-    <w:bookmarkStart w:id="168" w:name="species"/>
+    <w:bookmarkEnd w:id="143"/>
+    <w:bookmarkStart w:id="169" w:name="species"/>
     <w:p>
       <w:pPr>
         <w:pStyle w:val="Heading1"/>
@@ -28670,7 +29431,7 @@
         </w:tc>
       </w:tr>
     </w:tbl>
-    <w:bookmarkStart w:id="143" w:name="human"/>
+    <w:bookmarkStart w:id="144" w:name="human"/>
     <w:p>
       <w:pPr>
         <w:pStyle w:val="Heading2"/>
@@ -28983,8 +29744,8 @@
         </w:tc>
       </w:tr>
     </w:tbl>
-    <w:bookmarkEnd w:id="143"/>
-    <w:bookmarkStart w:id="144" w:name="vesh"/>
+    <w:bookmarkEnd w:id="144"/>
+    <w:bookmarkStart w:id="145" w:name="vesh"/>
     <w:p>
       <w:pPr>
         <w:pStyle w:val="Heading2"/>
@@ -29297,8 +30058,8 @@
         </w:tc>
       </w:tr>
     </w:tbl>
-    <w:bookmarkEnd w:id="144"/>
-    <w:bookmarkStart w:id="145" w:name="brulvek"/>
+    <w:bookmarkEnd w:id="145"/>
+    <w:bookmarkStart w:id="146" w:name="brulvek"/>
     <w:p>
       <w:pPr>
         <w:pStyle w:val="Heading2"/>
@@ -29343,7 +30104,7 @@
       <w:pPr>
         <w:numPr>
           <w:ilvl w:val="0"/>
-          <w:numId w:val="1029"/>
+          <w:numId w:val="1031"/>
         </w:numPr>
         <w:pStyle w:val="Compact"/>
       </w:pPr>
@@ -29635,8 +30396,8 @@
         </w:tc>
       </w:tr>
     </w:tbl>
-    <w:bookmarkEnd w:id="145"/>
-    <w:bookmarkStart w:id="146" w:name="corvani"/>
+    <w:bookmarkEnd w:id="146"/>
+    <w:bookmarkStart w:id="147" w:name="corvani"/>
     <w:p>
       <w:pPr>
         <w:pStyle w:val="Heading2"/>
@@ -29681,7 +30442,7 @@
       <w:pPr>
         <w:numPr>
           <w:ilvl w:val="0"/>
-          <w:numId w:val="1030"/>
+          <w:numId w:val="1032"/>
         </w:numPr>
         <w:pStyle w:val="Compact"/>
       </w:pPr>
@@ -29973,8 +30734,8 @@
         </w:tc>
       </w:tr>
     </w:tbl>
-    <w:bookmarkEnd w:id="146"/>
-    <w:bookmarkStart w:id="147" w:name="draelin"/>
+    <w:bookmarkEnd w:id="147"/>
+    <w:bookmarkStart w:id="148" w:name="draelin"/>
     <w:p>
       <w:pPr>
         <w:pStyle w:val="Heading2"/>
@@ -30019,7 +30780,7 @@
       <w:pPr>
         <w:numPr>
           <w:ilvl w:val="0"/>
-          <w:numId w:val="1031"/>
+          <w:numId w:val="1033"/>
         </w:numPr>
         <w:pStyle w:val="Compact"/>
       </w:pPr>
@@ -30031,7 +30792,7 @@
       <w:pPr>
         <w:numPr>
           <w:ilvl w:val="0"/>
-          <w:numId w:val="1031"/>
+          <w:numId w:val="1033"/>
         </w:numPr>
         <w:pStyle w:val="Compact"/>
       </w:pPr>
@@ -30341,8 +31102,8 @@
         </w:tc>
       </w:tr>
     </w:tbl>
-    <w:bookmarkEnd w:id="147"/>
-    <w:bookmarkStart w:id="148" w:name="joruun"/>
+    <w:bookmarkEnd w:id="148"/>
+    <w:bookmarkStart w:id="149" w:name="joruun"/>
     <w:p>
       <w:pPr>
         <w:pStyle w:val="Heading2"/>
@@ -30387,7 +31148,7 @@
       <w:pPr>
         <w:numPr>
           <w:ilvl w:val="0"/>
-          <w:numId w:val="1032"/>
+          <w:numId w:val="1034"/>
         </w:numPr>
         <w:pStyle w:val="Compact"/>
       </w:pPr>
@@ -30679,8 +31440,8 @@
         </w:tc>
       </w:tr>
     </w:tbl>
-    <w:bookmarkEnd w:id="148"/>
-    <w:bookmarkStart w:id="149" w:name="kel-1"/>
+    <w:bookmarkEnd w:id="149"/>
+    <w:bookmarkStart w:id="150" w:name="kel-1"/>
     <w:p>
       <w:pPr>
         <w:pStyle w:val="Heading2"/>
@@ -30725,7 +31486,7 @@
       <w:pPr>
         <w:numPr>
           <w:ilvl w:val="0"/>
-          <w:numId w:val="1033"/>
+          <w:numId w:val="1035"/>
         </w:numPr>
         <w:pStyle w:val="Compact"/>
       </w:pPr>
@@ -30737,7 +31498,7 @@
       <w:pPr>
         <w:numPr>
           <w:ilvl w:val="0"/>
-          <w:numId w:val="1033"/>
+          <w:numId w:val="1035"/>
         </w:numPr>
         <w:pStyle w:val="Compact"/>
       </w:pPr>
@@ -31029,8 +31790,8 @@
         </w:tc>
       </w:tr>
     </w:tbl>
-    <w:bookmarkEnd w:id="149"/>
-    <w:bookmarkStart w:id="150" w:name="mirrun-1"/>
+    <w:bookmarkEnd w:id="150"/>
+    <w:bookmarkStart w:id="151" w:name="mirrun-1"/>
     <w:p>
       <w:pPr>
         <w:pStyle w:val="Heading2"/>
@@ -31075,7 +31836,7 @@
       <w:pPr>
         <w:numPr>
           <w:ilvl w:val="0"/>
-          <w:numId w:val="1034"/>
+          <w:numId w:val="1036"/>
         </w:numPr>
         <w:pStyle w:val="Compact"/>
       </w:pPr>
@@ -31367,8 +32128,8 @@
         </w:tc>
       </w:tr>
     </w:tbl>
-    <w:bookmarkEnd w:id="150"/>
-    <w:bookmarkStart w:id="151" w:name="ommek"/>
+    <w:bookmarkEnd w:id="151"/>
+    <w:bookmarkStart w:id="152" w:name="ommek"/>
     <w:p>
       <w:pPr>
         <w:pStyle w:val="Heading2"/>
@@ -31413,7 +32174,7 @@
       <w:pPr>
         <w:numPr>
           <w:ilvl w:val="0"/>
-          <w:numId w:val="1035"/>
+          <w:numId w:val="1037"/>
         </w:numPr>
         <w:pStyle w:val="Compact"/>
       </w:pPr>
@@ -31723,8 +32484,8 @@
         </w:tc>
       </w:tr>
     </w:tbl>
-    <w:bookmarkEnd w:id="151"/>
-    <w:bookmarkStart w:id="152" w:name="shivar"/>
+    <w:bookmarkEnd w:id="152"/>
+    <w:bookmarkStart w:id="153" w:name="shivar"/>
     <w:p>
       <w:pPr>
         <w:pStyle w:val="Heading2"/>
@@ -31769,7 +32530,7 @@
       <w:pPr>
         <w:numPr>
           <w:ilvl w:val="0"/>
-          <w:numId w:val="1036"/>
+          <w:numId w:val="1038"/>
         </w:numPr>
         <w:pStyle w:val="Compact"/>
       </w:pPr>
@@ -32061,8 +32822,8 @@
         </w:tc>
       </w:tr>
     </w:tbl>
-    <w:bookmarkEnd w:id="152"/>
-    <w:bookmarkStart w:id="153" w:name="tessan-1"/>
+    <w:bookmarkEnd w:id="153"/>
+    <w:bookmarkStart w:id="154" w:name="tessan-1"/>
     <w:p>
       <w:pPr>
         <w:pStyle w:val="Heading2"/>
@@ -32107,7 +32868,7 @@
       <w:pPr>
         <w:numPr>
           <w:ilvl w:val="0"/>
-          <w:numId w:val="1037"/>
+          <w:numId w:val="1039"/>
         </w:numPr>
         <w:pStyle w:val="Compact"/>
       </w:pPr>
@@ -32119,7 +32880,7 @@
       <w:pPr>
         <w:numPr>
           <w:ilvl w:val="0"/>
-          <w:numId w:val="1037"/>
+          <w:numId w:val="1039"/>
         </w:numPr>
         <w:pStyle w:val="Compact"/>
       </w:pPr>
@@ -32411,8 +33172,8 @@
         </w:tc>
       </w:tr>
     </w:tbl>
-    <w:bookmarkEnd w:id="153"/>
-    <w:bookmarkStart w:id="154" w:name="thrum"/>
+    <w:bookmarkEnd w:id="154"/>
+    <w:bookmarkStart w:id="155" w:name="thrum"/>
     <w:p>
       <w:pPr>
         <w:pStyle w:val="Heading2"/>
@@ -32457,7 +33218,7 @@
       <w:pPr>
         <w:numPr>
           <w:ilvl w:val="0"/>
-          <w:numId w:val="1038"/>
+          <w:numId w:val="1040"/>
         </w:numPr>
         <w:pStyle w:val="Compact"/>
       </w:pPr>
@@ -32749,8 +33510,8 @@
         </w:tc>
       </w:tr>
     </w:tbl>
-    <w:bookmarkEnd w:id="154"/>
-    <w:bookmarkStart w:id="155" w:name="uth"/>
+    <w:bookmarkEnd w:id="155"/>
+    <w:bookmarkStart w:id="156" w:name="uth"/>
     <w:p>
       <w:pPr>
         <w:pStyle w:val="Heading2"/>
@@ -32795,7 +33556,7 @@
       <w:pPr>
         <w:numPr>
           <w:ilvl w:val="0"/>
-          <w:numId w:val="1039"/>
+          <w:numId w:val="1041"/>
         </w:numPr>
         <w:pStyle w:val="Compact"/>
       </w:pPr>
@@ -33087,8 +33848,8 @@
         </w:tc>
       </w:tr>
     </w:tbl>
-    <w:bookmarkEnd w:id="155"/>
-    <w:bookmarkStart w:id="156" w:name="uxarra"/>
+    <w:bookmarkEnd w:id="156"/>
+    <w:bookmarkStart w:id="157" w:name="uxarra"/>
     <w:p>
       <w:pPr>
         <w:pStyle w:val="Heading2"/>
@@ -33133,7 +33894,7 @@
       <w:pPr>
         <w:numPr>
           <w:ilvl w:val="0"/>
-          <w:numId w:val="1040"/>
+          <w:numId w:val="1042"/>
         </w:numPr>
         <w:pStyle w:val="Compact"/>
       </w:pPr>
@@ -33425,8 +34186,8 @@
         </w:tc>
       </w:tr>
     </w:tbl>
-    <w:bookmarkEnd w:id="156"/>
-    <w:bookmarkStart w:id="157" w:name="vael"/>
+    <w:bookmarkEnd w:id="157"/>
+    <w:bookmarkStart w:id="158" w:name="vael"/>
     <w:p>
       <w:pPr>
         <w:pStyle w:val="Heading2"/>
@@ -33471,7 +34232,7 @@
       <w:pPr>
         <w:numPr>
           <w:ilvl w:val="0"/>
-          <w:numId w:val="1041"/>
+          <w:numId w:val="1043"/>
         </w:numPr>
         <w:pStyle w:val="Compact"/>
       </w:pPr>
@@ -33483,7 +34244,7 @@
       <w:pPr>
         <w:numPr>
           <w:ilvl w:val="0"/>
-          <w:numId w:val="1041"/>
+          <w:numId w:val="1043"/>
         </w:numPr>
         <w:pStyle w:val="Compact"/>
       </w:pPr>
@@ -33775,8 +34536,8 @@
         </w:tc>
       </w:tr>
     </w:tbl>
-    <w:bookmarkEnd w:id="157"/>
-    <w:bookmarkStart w:id="158" w:name="veyari"/>
+    <w:bookmarkEnd w:id="158"/>
+    <w:bookmarkStart w:id="159" w:name="veyari"/>
     <w:p>
       <w:pPr>
         <w:pStyle w:val="Heading2"/>
@@ -33821,7 +34582,7 @@
       <w:pPr>
         <w:numPr>
           <w:ilvl w:val="0"/>
-          <w:numId w:val="1042"/>
+          <w:numId w:val="1044"/>
         </w:numPr>
         <w:pStyle w:val="Compact"/>
       </w:pPr>
@@ -34113,8 +34874,8 @@
         </w:tc>
       </w:tr>
     </w:tbl>
-    <w:bookmarkEnd w:id="158"/>
-    <w:bookmarkStart w:id="159" w:name="ylith-1"/>
+    <w:bookmarkEnd w:id="159"/>
+    <w:bookmarkStart w:id="160" w:name="ylith-1"/>
     <w:p>
       <w:pPr>
         <w:pStyle w:val="Heading2"/>
@@ -34159,7 +34920,7 @@
       <w:pPr>
         <w:numPr>
           <w:ilvl w:val="0"/>
-          <w:numId w:val="1043"/>
+          <w:numId w:val="1045"/>
         </w:numPr>
         <w:pStyle w:val="Compact"/>
       </w:pPr>
@@ -34171,7 +34932,7 @@
       <w:pPr>
         <w:numPr>
           <w:ilvl w:val="0"/>
-          <w:numId w:val="1043"/>
+          <w:numId w:val="1045"/>
         </w:numPr>
         <w:pStyle w:val="Compact"/>
       </w:pPr>
@@ -34463,8 +35224,8 @@
         </w:tc>
       </w:tr>
     </w:tbl>
-    <w:bookmarkEnd w:id="159"/>
-    <w:bookmarkStart w:id="160" w:name="zethri"/>
+    <w:bookmarkEnd w:id="160"/>
+    <w:bookmarkStart w:id="161" w:name="zethri"/>
     <w:p>
       <w:pPr>
         <w:pStyle w:val="Heading2"/>
@@ -34509,7 +35270,7 @@
       <w:pPr>
         <w:numPr>
           <w:ilvl w:val="0"/>
-          <w:numId w:val="1044"/>
+          <w:numId w:val="1046"/>
         </w:numPr>
         <w:pStyle w:val="Compact"/>
       </w:pPr>
@@ -34801,8 +35562,8 @@
         </w:tc>
       </w:tr>
     </w:tbl>
-    <w:bookmarkEnd w:id="160"/>
-    <w:bookmarkStart w:id="161" w:name="zhaq"/>
+    <w:bookmarkEnd w:id="161"/>
+    <w:bookmarkStart w:id="162" w:name="zhaq"/>
     <w:p>
       <w:pPr>
         <w:pStyle w:val="Heading2"/>
@@ -34847,7 +35608,7 @@
       <w:pPr>
         <w:numPr>
           <w:ilvl w:val="0"/>
-          <w:numId w:val="1045"/>
+          <w:numId w:val="1047"/>
         </w:numPr>
         <w:pStyle w:val="Compact"/>
       </w:pPr>
@@ -34859,7 +35620,7 @@
       <w:pPr>
         <w:numPr>
           <w:ilvl w:val="0"/>
-          <w:numId w:val="1045"/>
+          <w:numId w:val="1047"/>
         </w:numPr>
         <w:pStyle w:val="Compact"/>
       </w:pPr>
@@ -35151,8 +35912,8 @@
         </w:tc>
       </w:tr>
     </w:tbl>
-    <w:bookmarkEnd w:id="161"/>
-    <w:bookmarkStart w:id="162" w:name="dresh"/>
+    <w:bookmarkEnd w:id="162"/>
+    <w:bookmarkStart w:id="163" w:name="dresh"/>
     <w:p>
       <w:pPr>
         <w:pStyle w:val="Heading2"/>
@@ -35197,7 +35958,7 @@
       <w:pPr>
         <w:numPr>
           <w:ilvl w:val="0"/>
-          <w:numId w:val="1046"/>
+          <w:numId w:val="1048"/>
         </w:numPr>
         <w:pStyle w:val="Compact"/>
       </w:pPr>
@@ -35209,7 +35970,7 @@
       <w:pPr>
         <w:numPr>
           <w:ilvl w:val="0"/>
-          <w:numId w:val="1046"/>
+          <w:numId w:val="1048"/>
         </w:numPr>
         <w:pStyle w:val="Compact"/>
       </w:pPr>
@@ -35221,7 +35982,7 @@
       <w:pPr>
         <w:numPr>
           <w:ilvl w:val="0"/>
-          <w:numId w:val="1046"/>
+          <w:numId w:val="1048"/>
         </w:numPr>
         <w:pStyle w:val="Compact"/>
       </w:pPr>
@@ -35513,8 +36274,8 @@
         </w:tc>
       </w:tr>
     </w:tbl>
-    <w:bookmarkEnd w:id="162"/>
-    <w:bookmarkStart w:id="163" w:name="eshuum"/>
+    <w:bookmarkEnd w:id="163"/>
+    <w:bookmarkStart w:id="164" w:name="eshuum"/>
     <w:p>
       <w:pPr>
         <w:pStyle w:val="Heading2"/>
@@ -35559,7 +36320,7 @@
       <w:pPr>
         <w:numPr>
           <w:ilvl w:val="0"/>
-          <w:numId w:val="1047"/>
+          <w:numId w:val="1049"/>
         </w:numPr>
         <w:pStyle w:val="Compact"/>
       </w:pPr>
@@ -35571,7 +36332,7 @@
       <w:pPr>
         <w:numPr>
           <w:ilvl w:val="0"/>
-          <w:numId w:val="1047"/>
+          <w:numId w:val="1049"/>
         </w:numPr>
         <w:pStyle w:val="Compact"/>
       </w:pPr>
@@ -35863,8 +36624,8 @@
         </w:tc>
       </w:tr>
     </w:tbl>
-    <w:bookmarkEnd w:id="163"/>
-    <w:bookmarkStart w:id="164" w:name="khaum"/>
+    <w:bookmarkEnd w:id="164"/>
+    <w:bookmarkStart w:id="165" w:name="khaum"/>
     <w:p>
       <w:pPr>
         <w:pStyle w:val="Heading2"/>
@@ -35909,7 +36670,7 @@
       <w:pPr>
         <w:numPr>
           <w:ilvl w:val="0"/>
-          <w:numId w:val="1048"/>
+          <w:numId w:val="1050"/>
         </w:numPr>
         <w:pStyle w:val="Compact"/>
       </w:pPr>
@@ -35921,7 +36682,7 @@
       <w:pPr>
         <w:numPr>
           <w:ilvl w:val="0"/>
-          <w:numId w:val="1048"/>
+          <w:numId w:val="1050"/>
         </w:numPr>
         <w:pStyle w:val="Compact"/>
       </w:pPr>
@@ -35933,7 +36694,7 @@
       <w:pPr>
         <w:numPr>
           <w:ilvl w:val="0"/>
-          <w:numId w:val="1048"/>
+          <w:numId w:val="1050"/>
         </w:numPr>
         <w:pStyle w:val="Compact"/>
       </w:pPr>
@@ -36225,8 +36986,8 @@
         </w:tc>
       </w:tr>
     </w:tbl>
-    <w:bookmarkEnd w:id="164"/>
-    <w:bookmarkStart w:id="165" w:name="ozhvek"/>
+    <w:bookmarkEnd w:id="165"/>
+    <w:bookmarkStart w:id="166" w:name="ozhvek"/>
     <w:p>
       <w:pPr>
         <w:pStyle w:val="Heading2"/>
@@ -36271,7 +37032,7 @@
       <w:pPr>
         <w:numPr>
           <w:ilvl w:val="0"/>
-          <w:numId w:val="1049"/>
+          <w:numId w:val="1051"/>
         </w:numPr>
         <w:pStyle w:val="Compact"/>
       </w:pPr>
@@ -36283,7 +37044,7 @@
       <w:pPr>
         <w:numPr>
           <w:ilvl w:val="0"/>
-          <w:numId w:val="1049"/>
+          <w:numId w:val="1051"/>
         </w:numPr>
         <w:pStyle w:val="Compact"/>
       </w:pPr>
@@ -36575,8 +37336,8 @@
         </w:tc>
       </w:tr>
     </w:tbl>
-    <w:bookmarkEnd w:id="165"/>
-    <w:bookmarkStart w:id="166" w:name="qor"/>
+    <w:bookmarkEnd w:id="166"/>
+    <w:bookmarkStart w:id="167" w:name="qor"/>
     <w:p>
       <w:pPr>
         <w:pStyle w:val="Heading2"/>
@@ -36621,7 +37382,7 @@
       <w:pPr>
         <w:numPr>
           <w:ilvl w:val="0"/>
-          <w:numId w:val="1050"/>
+          <w:numId w:val="1052"/>
         </w:numPr>
         <w:pStyle w:val="Compact"/>
       </w:pPr>
@@ -36633,7 +37394,7 @@
       <w:pPr>
         <w:numPr>
           <w:ilvl w:val="0"/>
-          <w:numId w:val="1050"/>
+          <w:numId w:val="1052"/>
         </w:numPr>
         <w:pStyle w:val="Compact"/>
       </w:pPr>
@@ -36925,8 +37686,8 @@
         </w:tc>
       </w:tr>
     </w:tbl>
-    <w:bookmarkEnd w:id="166"/>
-    <w:bookmarkStart w:id="167" w:name="sen"/>
+    <w:bookmarkEnd w:id="167"/>
+    <w:bookmarkStart w:id="168" w:name="sen"/>
     <w:p>
       <w:pPr>
         <w:pStyle w:val="Heading2"/>
@@ -36971,7 +37732,7 @@
       <w:pPr>
         <w:numPr>
           <w:ilvl w:val="0"/>
-          <w:numId w:val="1051"/>
+          <w:numId w:val="1053"/>
         </w:numPr>
         <w:pStyle w:val="Compact"/>
       </w:pPr>
@@ -36983,7 +37744,7 @@
       <w:pPr>
         <w:numPr>
           <w:ilvl w:val="0"/>
-          <w:numId w:val="1051"/>
+          <w:numId w:val="1053"/>
         </w:numPr>
         <w:pStyle w:val="Compact"/>
       </w:pPr>
@@ -37275,9 +38036,9 @@
         </w:tc>
       </w:tr>
     </w:tbl>
-    <w:bookmarkEnd w:id="167"/>
     <w:bookmarkEnd w:id="168"/>
-    <w:bookmarkStart w:id="179" w:name="making-your-own"/>
+    <w:bookmarkEnd w:id="169"/>
+    <w:bookmarkStart w:id="180" w:name="making-your-own"/>
     <w:p>
       <w:pPr>
         <w:pStyle w:val="Heading1"/>
@@ -37310,7 +38071,7 @@
         <w:t xml:space="preserve">option at the end of each list, and its checklist holds a custom choice to the same rules as everything else.</w:t>
       </w:r>
     </w:p>
-    <w:bookmarkStart w:id="169" w:name="a-custom-calling"/>
+    <w:bookmarkStart w:id="170" w:name="a-custom-calling"/>
     <w:p>
       <w:pPr>
         <w:pStyle w:val="Heading2"/>
@@ -37331,7 +38092,7 @@
       <w:pPr>
         <w:numPr>
           <w:ilvl w:val="0"/>
-          <w:numId w:val="1052"/>
+          <w:numId w:val="1054"/>
         </w:numPr>
         <w:pStyle w:val="Compact"/>
       </w:pPr>
@@ -37377,7 +38138,7 @@
       <w:pPr>
         <w:numPr>
           <w:ilvl w:val="0"/>
-          <w:numId w:val="1052"/>
+          <w:numId w:val="1054"/>
         </w:numPr>
         <w:pStyle w:val="Compact"/>
       </w:pPr>
@@ -37399,7 +38160,7 @@
       <w:pPr>
         <w:numPr>
           <w:ilvl w:val="0"/>
-          <w:numId w:val="1052"/>
+          <w:numId w:val="1054"/>
         </w:numPr>
         <w:pStyle w:val="Compact"/>
       </w:pPr>
@@ -37421,7 +38182,7 @@
       <w:pPr>
         <w:numPr>
           <w:ilvl w:val="0"/>
-          <w:numId w:val="1052"/>
+          <w:numId w:val="1054"/>
         </w:numPr>
         <w:pStyle w:val="Compact"/>
       </w:pPr>
@@ -37486,8 +38247,8 @@
         <w:t xml:space="preserve">.</w:t>
       </w:r>
     </w:p>
-    <w:bookmarkEnd w:id="169"/>
-    <w:bookmarkStart w:id="178" w:name="a-custom-species"/>
+    <w:bookmarkEnd w:id="170"/>
+    <w:bookmarkStart w:id="179" w:name="a-custom-species"/>
     <w:p>
       <w:pPr>
         <w:pStyle w:val="Heading2"/>
@@ -37504,7 +38265,7 @@
         <w:t xml:space="preserve">Build it with the GM, one step at a time.</w:t>
       </w:r>
     </w:p>
-    <w:bookmarkStart w:id="170" w:name="the-concept"/>
+    <w:bookmarkStart w:id="171" w:name="the-concept"/>
     <w:p>
       <w:pPr>
         <w:pStyle w:val="Heading3"/>
@@ -37521,8 +38282,8 @@
         <w:t xml:space="preserve">Two or three sentences: where they come from, what sets them apart, and how others see them. It should be something the species in this book don’t already cover.</w:t>
       </w:r>
     </w:p>
-    <w:bookmarkEnd w:id="170"/>
-    <w:bookmarkStart w:id="171" w:name="the-tier"/>
+    <w:bookmarkEnd w:id="171"/>
+    <w:bookmarkStart w:id="172" w:name="the-tier"/>
     <w:p>
       <w:pPr>
         <w:pStyle w:val="Heading3"/>
@@ -37819,8 +38580,8 @@
         <w:t xml:space="preserve">When in doubt, choose the higher tier.</w:t>
       </w:r>
     </w:p>
-    <w:bookmarkEnd w:id="171"/>
-    <w:bookmarkStart w:id="172" w:name="attribute-adjustments"/>
+    <w:bookmarkEnd w:id="172"/>
+    <w:bookmarkStart w:id="173" w:name="attribute-adjustments"/>
     <w:p>
       <w:pPr>
         <w:pStyle w:val="Heading3"/>
@@ -37866,8 +38627,8 @@
         <w:t xml:space="preserve">: a +2 needs a −2 or two −1s. The adjustments move the attribute’s base (+1 starts it at 11) and raise its starting maximum (13 plus the bonus). Most species change two to four attributes.</w:t>
       </w:r>
     </w:p>
-    <w:bookmarkEnd w:id="172"/>
-    <w:bookmarkStart w:id="173" w:name="core-rules-tier-1-and-up"/>
+    <w:bookmarkEnd w:id="173"/>
+    <w:bookmarkStart w:id="174" w:name="core-rules-tier-1-and-up"/>
     <w:p>
       <w:pPr>
         <w:pStyle w:val="Heading3"/>
@@ -37884,8 +38645,8 @@
         <w:t xml:space="preserve">One to three short rules that always apply: what they can do (see in the dark, resist cold, a free Trained skill) and what it costs (a weakness, a people’s distrust, a hazard they can’t abide). A strength with no drawback is worth more than it looks, so price it a tier higher.</w:t>
       </w:r>
     </w:p>
-    <w:bookmarkEnd w:id="173"/>
-    <w:bookmarkStart w:id="174" w:name="species-advantages"/>
+    <w:bookmarkEnd w:id="174"/>
+    <w:bookmarkStart w:id="175" w:name="species-advantages"/>
     <w:p>
       <w:pPr>
         <w:pStyle w:val="Heading3"/>
@@ -37940,8 +38701,8 @@
         <w:t xml:space="preserve">: a problem the trait causes, with a clear trigger and a real consequence, which earns a Resolve point when it bites, like any complication. A character takes one advantage, general or species, so make them distinct choices.</w:t>
       </w:r>
     </w:p>
-    <w:bookmarkEnd w:id="174"/>
-    <w:bookmarkStart w:id="175" w:name="an-alternate-form-optional-tier-2-or-3"/>
+    <w:bookmarkEnd w:id="175"/>
+    <w:bookmarkStart w:id="176" w:name="an-alternate-form-optional-tier-2-or-3"/>
     <w:p>
       <w:pPr>
         <w:pStyle w:val="Heading3"/>
@@ -37974,8 +38735,8 @@
         <w:t xml:space="preserve">apply.</w:t>
       </w:r>
     </w:p>
-    <w:bookmarkEnd w:id="175"/>
-    <w:bookmarkStart w:id="176" w:name="in-the-creator"/>
+    <w:bookmarkEnd w:id="176"/>
+    <w:bookmarkStart w:id="177" w:name="in-the-creator"/>
     <w:p>
       <w:pPr>
         <w:pStyle w:val="Heading3"/>
@@ -37988,7 +38749,7 @@
       <w:pPr>
         <w:numPr>
           <w:ilvl w:val="0"/>
-          <w:numId w:val="1053"/>
+          <w:numId w:val="1055"/>
         </w:numPr>
         <w:pStyle w:val="Compact"/>
       </w:pPr>
@@ -38016,7 +38777,7 @@
       <w:pPr>
         <w:numPr>
           <w:ilvl w:val="0"/>
-          <w:numId w:val="1053"/>
+          <w:numId w:val="1055"/>
         </w:numPr>
         <w:pStyle w:val="Compact"/>
       </w:pPr>
@@ -38028,7 +38789,7 @@
       <w:pPr>
         <w:numPr>
           <w:ilvl w:val="0"/>
-          <w:numId w:val="1053"/>
+          <w:numId w:val="1055"/>
         </w:numPr>
         <w:pStyle w:val="Compact"/>
       </w:pPr>
@@ -38056,7 +38817,7 @@
       <w:pPr>
         <w:numPr>
           <w:ilvl w:val="0"/>
-          <w:numId w:val="1053"/>
+          <w:numId w:val="1055"/>
         </w:numPr>
         <w:pStyle w:val="Compact"/>
       </w:pPr>
@@ -38080,8 +38841,8 @@
         <w:t xml:space="preserve">and enter the advantage and its companion complication.</w:t>
       </w:r>
     </w:p>
-    <w:bookmarkEnd w:id="176"/>
-    <w:bookmarkStart w:id="177" w:name="example"/>
+    <w:bookmarkEnd w:id="177"/>
+    <w:bookmarkStart w:id="178" w:name="example"/>
     <w:p>
       <w:pPr>
         <w:pStyle w:val="Heading3"/>
@@ -38186,10 +38947,10 @@
         <w:t xml:space="preserve">: your family’s dynasty calls on you; accept the errand.</w:t>
       </w:r>
     </w:p>
-    <w:bookmarkEnd w:id="177"/>
     <w:bookmarkEnd w:id="178"/>
     <w:bookmarkEnd w:id="179"/>
-    <w:bookmarkStart w:id="180" w:name="complications"/>
+    <w:bookmarkEnd w:id="180"/>
+    <w:bookmarkStart w:id="181" w:name="complications"/>
     <w:p>
       <w:pPr>
         <w:pStyle w:val="Heading1"/>
@@ -38894,8 +39655,8 @@
         </w:tc>
       </w:tr>
     </w:tbl>
-    <w:bookmarkEnd w:id="180"/>
-    <w:bookmarkStart w:id="182" w:name="quick-reference"/>
+    <w:bookmarkEnd w:id="181"/>
+    <w:bookmarkStart w:id="183" w:name="quick-reference"/>
     <w:p>
       <w:pPr>
         <w:pStyle w:val="Heading1"/>
@@ -39086,7 +39847,7 @@
       <w:r>
         <w:t xml:space="preserve"> </w:t>
       </w:r>
-      <w:hyperlink r:id="rId181">
+      <w:hyperlink r:id="rId182">
         <w:r>
           <w:rPr>
             <w:rStyle w:val="Hyperlink"/>
@@ -39098,7 +39859,7 @@
         <w:t xml:space="preserve">. You may share, adapt, and use it for any purpose, including commercially, as long as you give appropriate credit to the author.</w:t>
       </w:r>
     </w:p>
-    <w:bookmarkEnd w:id="182"/>
+    <w:bookmarkEnd w:id="183"/>
     <w:sectPr/>
   </w:body>
 </w:document>
@@ -39463,6 +40224,12 @@
     <w:abstractNumId w:val="991"/>
   </w:num>
   <w:num w:numId="1014">
+    <w:abstractNumId w:val="991"/>
+  </w:num>
+  <w:num w:numId="1015">
+    <w:abstractNumId w:val="991"/>
+  </w:num>
+  <w:num w:numId="1016">
     <w:abstractNumId w:val="99411"/>
     <w:lvlOverride w:ilvl="0">
       <w:startOverride w:val="1"/>
@@ -39492,12 +40259,6 @@
       <w:startOverride w:val="1"/>
     </w:lvlOverride>
   </w:num>
-  <w:num w:numId="1015">
-    <w:abstractNumId w:val="991"/>
-  </w:num>
-  <w:num w:numId="1016">
-    <w:abstractNumId w:val="991"/>
-  </w:num>
   <w:num w:numId="1017">
     <w:abstractNumId w:val="991"/>
   </w:num>
@@ -39505,6 +40266,12 @@
     <w:abstractNumId w:val="991"/>
   </w:num>
   <w:num w:numId="1019">
+    <w:abstractNumId w:val="991"/>
+  </w:num>
+  <w:num w:numId="1020">
+    <w:abstractNumId w:val="991"/>
+  </w:num>
+  <w:num w:numId="1021">
     <w:abstractNumId w:val="99411"/>
     <w:lvlOverride w:ilvl="0">
       <w:startOverride w:val="1"/>
@@ -39533,12 +40300,6 @@
     <w:lvlOverride w:ilvl="8">
       <w:startOverride w:val="1"/>
     </w:lvlOverride>
-  </w:num>
-  <w:num w:numId="1020">
-    <w:abstractNumId w:val="991"/>
-  </w:num>
-  <w:num w:numId="1021">
-    <w:abstractNumId w:val="991"/>
   </w:num>
   <w:num w:numId="1022">
     <w:abstractNumId w:val="991"/>
@@ -39631,6 +40392,12 @@
     <w:abstractNumId w:val="991"/>
   </w:num>
   <w:num w:numId="1052">
+    <w:abstractNumId w:val="991"/>
+  </w:num>
+  <w:num w:numId="1053">
+    <w:abstractNumId w:val="991"/>
+  </w:num>
+  <w:num w:numId="1054">
     <w:abstractNumId w:val="99411"/>
     <w:lvlOverride w:ilvl="0">
       <w:startOverride w:val="1"/>
@@ -39660,7 +40427,7 @@
       <w:startOverride w:val="1"/>
     </w:lvlOverride>
   </w:num>
-  <w:num w:numId="1053">
+  <w:num w:numId="1055">
     <w:abstractNumId w:val="99411"/>
     <w:lvlOverride w:ilvl="0">
       <w:startOverride w:val="1"/>

</xml_diff>

<commit_message>
Fracture Lines: skinsuits, standard issue
The vac suit becomes the skinsuit everyone between the stars wears: a
skin-tight vacuum suit with a hood that seals in two seconds, and its
systems: pressure protection (punctures self-seal; a 2-box hit in
vacuum breaches it until patched), its own air (twelve hours a cell),
a close radio to the crew (Medium range, jammable), and a HUD
(low-light and thermal vision, the crew's positions and vitals, a
range-finder, a linked scanner's feed). It isn't armor; the hardsuit
is an armored skinsuit.

Every character starts with one: gear marked standard starts ticked in
the creator, and the pregenerated crew wear theirs.

Co-Authored-By: Claude Opus 5.5 <noreply@anthropic.com>
Claude-Session: https://claude.ai/code/session_015SADCFzhKijkC2foUmXrpC
</commit_message>
<xml_diff>
--- a/legend-dynamics/site/fracture-lines/Fracture_Lines_Players_Guide.docx
+++ b/legend-dynamics/site/fracture-lines/Fracture_Lines_Players_Guide.docx
@@ -8415,7 +8415,7 @@
                 <w:b/>
                 <w:sz w:val="19"/>
               </w:rPr>
-              <w:t xml:space="preserve">Vac suit</w:t>
+              <w:t xml:space="preserve">Skinsuit</w:t>
             </w:r>
           </w:p>
         </w:tc>
@@ -8445,7 +8445,7 @@
               <w:rPr>
                 <w:sz w:val="19"/>
               </w:rPr>
-              <w:t xml:space="preserve">Air for six hours in vacuum or poison atmosphere.</w:t>
+              <w:t xml:space="preserve">Standard issue: a skin-tight vacuum suit with a hood that seals into a helmet in two seconds. Pressure protection, its own air (twelve hours a cell), a close radio to the crew, and a HUD with low-light and thermal vision. Not armor.</w:t>
             </w:r>
           </w:p>
         </w:tc>
@@ -8829,7 +8829,7 @@
               <w:rPr>
                 <w:sz w:val="19"/>
               </w:rPr>
-              <w:t xml:space="preserve">An armored vac suit: air for six hours in vacuum or poison atmosphere, and once per fight a hit that marks 2 or more boxes marks one fewer. −1 to Athletics and Stealth while you wear it; a breach is the GM’s call. Not with other armor.</w:t>
+              <w:t xml:space="preserve">An armored skinsuit: every skinsuit system, and once per fight a hit that marks 2 or more boxes marks one fewer. −1 to Athletics and Stealth while you wear it. Not with other armor.</w:t>
             </w:r>
           </w:p>
         </w:tc>
@@ -19288,7 +19288,7 @@
     </w:p>
     <w:bookmarkEnd w:id="96"/>
     <w:bookmarkEnd w:id="97"/>
-    <w:bookmarkStart w:id="109" w:name="the-corridors"/>
+    <w:bookmarkStart w:id="110" w:name="the-corridors"/>
     <w:p>
       <w:pPr>
         <w:pStyle w:val="Heading1"/>
@@ -20060,7 +20060,180 @@
       </w:r>
     </w:p>
     <w:bookmarkEnd w:id="107"/>
-    <w:bookmarkStart w:id="108" w:name="controlled-gear"/>
+    <w:bookmarkStart w:id="108" w:name="skinsuits"/>
+    <w:p>
+      <w:pPr>
+        <w:pStyle w:val="Heading2"/>
+      </w:pPr>
+      <w:r>
+        <w:t xml:space="preserve">Skinsuits</w:t>
+      </w:r>
+    </w:p>
+    <w:p>
+      <w:pPr>
+        <w:pStyle w:val="FirstParagraph"/>
+      </w:pPr>
+      <w:r>
+        <w:t xml:space="preserve">Everyone who lives between the stars owns a</w:t>
+      </w:r>
+      <w:r>
+        <w:t xml:space="preserve"> </w:t>
+      </w:r>
+      <w:r>
+        <w:rPr>
+          <w:bCs/>
+          <w:b/>
+        </w:rPr>
+        <w:t xml:space="preserve">skinsuit</w:t>
+      </w:r>
+      <w:r>
+        <w:t xml:space="preserve">, and most people wear one under their clothes aboard any ship or station. It’s a skin-tight layer of smart fabric with a hood that seals into a clear helmet in two seconds, with no action needed when the alarms go. Every character starts with one, on top of the gear they choose.</w:t>
+      </w:r>
+    </w:p>
+    <w:p>
+      <w:pPr>
+        <w:numPr>
+          <w:ilvl w:val="0"/>
+          <w:numId w:val="1032"/>
+        </w:numPr>
+        <w:pStyle w:val="Compact"/>
+      </w:pPr>
+      <w:r>
+        <w:rPr>
+          <w:bCs/>
+          <w:b/>
+        </w:rPr>
+        <w:t xml:space="preserve">Pressure.</w:t>
+      </w:r>
+      <w:r>
+        <w:t xml:space="preserve"> </w:t>
+      </w:r>
+      <w:r>
+        <w:t xml:space="preserve">The fabric squeezes like a second skin, so vacuum, poison air and the cold of a shadowed hull don’t hurt you. Small punctures seal themselves. In vacuum, a hit that marks 2 or more boxes</w:t>
+      </w:r>
+      <w:r>
+        <w:t xml:space="preserve"> </w:t>
+      </w:r>
+      <w:r>
+        <w:rPr>
+          <w:bCs/>
+          <w:b/>
+        </w:rPr>
+        <w:t xml:space="preserve">breaches</w:t>
+      </w:r>
+      <w:r>
+        <w:t xml:space="preserve"> </w:t>
+      </w:r>
+      <w:r>
+        <w:t xml:space="preserve">the suit: you take vacuum damage (1 box each round) until someone patches it, which takes an action. Every suit carries three patches.</w:t>
+      </w:r>
+    </w:p>
+    <w:p>
+      <w:pPr>
+        <w:numPr>
+          <w:ilvl w:val="0"/>
+          <w:numId w:val="1032"/>
+        </w:numPr>
+        <w:pStyle w:val="Compact"/>
+      </w:pPr>
+      <w:r>
+        <w:rPr>
+          <w:bCs/>
+          <w:b/>
+        </w:rPr>
+        <w:t xml:space="preserve">Air.</w:t>
+      </w:r>
+      <w:r>
+        <w:t xml:space="preserve"> </w:t>
+      </w:r>
+      <w:r>
+        <w:t xml:space="preserve">The suit makes its own air from its power cell and your breath: twelve hours on a cell. A ship or station recharges a cell in an hour, and a spare cell is something anyone can carry.</w:t>
+      </w:r>
+    </w:p>
+    <w:p>
+      <w:pPr>
+        <w:numPr>
+          <w:ilvl w:val="0"/>
+          <w:numId w:val="1032"/>
+        </w:numPr>
+        <w:pStyle w:val="Compact"/>
+      </w:pPr>
+      <w:r>
+        <w:rPr>
+          <w:bCs/>
+          <w:b/>
+        </w:rPr>
+        <w:t xml:space="preserve">Close radio.</w:t>
+      </w:r>
+      <w:r>
+        <w:t xml:space="preserve"> </w:t>
+      </w:r>
+      <w:r>
+        <w:t xml:space="preserve">Voice from suit to suit, encrypted among the crew, out to about 10 km (Medium range) in open space, and less through hulls and rock. It can be jammed (a Sensors contest), and anyone with a scanner can tell a suit is transmitting.</w:t>
+      </w:r>
+    </w:p>
+    <w:p>
+      <w:pPr>
+        <w:numPr>
+          <w:ilvl w:val="0"/>
+          <w:numId w:val="1032"/>
+        </w:numPr>
+        <w:pStyle w:val="Compact"/>
+      </w:pPr>
+      <w:r>
+        <w:rPr>
+          <w:bCs/>
+          <w:b/>
+        </w:rPr>
+        <w:t xml:space="preserve">The HUD.</w:t>
+      </w:r>
+      <w:r>
+        <w:t xml:space="preserve"> </w:t>
+      </w:r>
+      <w:r>
+        <w:t xml:space="preserve">The visor overlays what you need: low-light and thermal vision (no penalty for darkness or smoke), each crew member’s position and vital signs, a range-finder, and the feed from a linked scanner or scout drone. It shows you the target; it doesn’t aim for you.</w:t>
+      </w:r>
+    </w:p>
+    <w:p>
+      <w:pPr>
+        <w:numPr>
+          <w:ilvl w:val="0"/>
+          <w:numId w:val="1032"/>
+        </w:numPr>
+        <w:pStyle w:val="Compact"/>
+      </w:pPr>
+      <w:r>
+        <w:rPr>
+          <w:bCs/>
+          <w:b/>
+        </w:rPr>
+        <w:t xml:space="preserve">What it isn’t.</w:t>
+      </w:r>
+      <w:r>
+        <w:t xml:space="preserve"> </w:t>
+      </w:r>
+      <w:r>
+        <w:t xml:space="preserve">A skinsuit is not armor. A</w:t>
+      </w:r>
+      <w:r>
+        <w:t xml:space="preserve"> </w:t>
+      </w:r>
+      <w:r>
+        <w:rPr>
+          <w:bCs/>
+          <w:b/>
+        </w:rPr>
+        <w:t xml:space="preserve">hardsuit</w:t>
+      </w:r>
+      <w:r>
+        <w:t xml:space="preserve"> </w:t>
+      </w:r>
+      <w:r>
+        <w:t xml:space="preserve">adds armored plates over the same systems, and powered armor seals a skinsuit inside it.</w:t>
+      </w:r>
+    </w:p>
+    <w:bookmarkEnd w:id="108"/>
+    <w:bookmarkStart w:id="109" w:name="controlled-gear"/>
     <w:p>
       <w:pPr>
         <w:pStyle w:val="Heading2"/>
@@ -20623,7 +20796,7 @@
       <w:pPr>
         <w:numPr>
           <w:ilvl w:val="0"/>
-          <w:numId w:val="1032"/>
+          <w:numId w:val="1033"/>
         </w:numPr>
         <w:pStyle w:val="Compact"/>
       </w:pPr>
@@ -20707,104 +20880,6 @@
       </w:r>
       <w:r>
         <w:t xml:space="preserve">, and the gear is likely confiscated.</w:t>
-      </w:r>
-    </w:p>
-    <w:p>
-      <w:pPr>
-        <w:numPr>
-          <w:ilvl w:val="0"/>
-          <w:numId w:val="1032"/>
-        </w:numPr>
-        <w:pStyle w:val="Compact"/>
-      </w:pPr>
-      <w:r>
-        <w:rPr>
-          <w:bCs/>
-          <w:b/>
-        </w:rPr>
-        <w:t xml:space="preserve">Grades of powered armor.</w:t>
-      </w:r>
-      <w:r>
-        <w:t xml:space="preserve"> </w:t>
-      </w:r>
-      <w:r>
-        <w:t xml:space="preserve">Legion-grade suits come from militaries and the Hegemony Houses;</w:t>
-      </w:r>
-      <w:r>
-        <w:t xml:space="preserve"> </w:t>
-      </w:r>
-      <w:r>
-        <w:rPr>
-          <w:bCs/>
-          <w:b/>
-        </w:rPr>
-        <w:t xml:space="preserve">commercial</w:t>
-      </w:r>
-      <w:r>
-        <w:t xml:space="preserve"> </w:t>
-      </w:r>
-      <w:r>
-        <w:t xml:space="preserve">security and industrial suits are sold where the law allows them, and registered to their owners;</w:t>
-      </w:r>
-      <w:r>
-        <w:t xml:space="preserve"> </w:t>
-      </w:r>
-      <w:r>
-        <w:rPr>
-          <w:bCs/>
-          <w:b/>
-        </w:rPr>
-        <w:t xml:space="preserve">colony-built</w:t>
-      </w:r>
-      <w:r>
-        <w:t xml:space="preserve"> </w:t>
-      </w:r>
-      <w:r>
-        <w:t xml:space="preserve">rigs come from illicit armorers on remote worlds, cheaper and Temperamental. Each needs the</w:t>
-      </w:r>
-      <w:r>
-        <w:t xml:space="preserve"> </w:t>
-      </w:r>
-      <w:r>
-        <w:rPr>
-          <w:bCs/>
-          <w:b/>
-        </w:rPr>
-        <w:t xml:space="preserve">Powered Armor</w:t>
-      </w:r>
-      <w:r>
-        <w:t xml:space="preserve"> </w:t>
-      </w:r>
-      <w:r>
-        <w:t xml:space="preserve">Edge.</w:t>
-      </w:r>
-    </w:p>
-    <w:bookmarkEnd w:id="108"/>
-    <w:bookmarkEnd w:id="109"/>
-    <w:bookmarkStart w:id="113" w:name="jobs-debt-and-salvage"/>
-    <w:p>
-      <w:pPr>
-        <w:pStyle w:val="Heading1"/>
-      </w:pPr>
-      <w:r>
-        <w:t xml:space="preserve">Jobs, debt and salvage</w:t>
-      </w:r>
-    </w:p>
-    <w:bookmarkStart w:id="110" w:name="payday"/>
-    <w:p>
-      <w:pPr>
-        <w:pStyle w:val="Heading2"/>
-      </w:pPr>
-      <w:r>
-        <w:t xml:space="preserve">Payday</w:t>
-      </w:r>
-    </w:p>
-    <w:p>
-      <w:pPr>
-        <w:pStyle w:val="FirstParagraph"/>
-      </w:pPr>
-      <w:r>
-        <w:t xml:space="preserve">Every crew owes someone. When a job is done, the pay goes where it’s needed:</w:t>
       </w:r>
     </w:p>
     <w:p>
@@ -20820,67 +20895,81 @@
           <w:bCs/>
           <w:b/>
         </w:rPr>
-        <w:t xml:space="preserve">An ordinary job clears a box of Debt.</w:t>
-      </w:r>
-      <w:r>
-        <w:t xml:space="preserve"> </w:t>
-      </w:r>
-      <w:r>
-        <w:t xml:space="preserve">A big score clears two. A favor, a dock or a contact can stand in for money: the job’s offer says which.</w:t>
-      </w:r>
-    </w:p>
-    <w:p>
-      <w:pPr>
-        <w:numPr>
-          <w:ilvl w:val="0"/>
-          <w:numId w:val="1033"/>
-        </w:numPr>
-        <w:pStyle w:val="Compact"/>
-      </w:pPr>
-      <w:r>
-        <w:rPr>
-          <w:bCs/>
-          <w:b/>
-        </w:rPr>
-        <w:t xml:space="preserve">Borrowing or buying on credit marks a box of Debt.</w:t>
-      </w:r>
-      <w:r>
-        <w:t xml:space="preserve"> </w:t>
-      </w:r>
-      <w:r>
-        <w:t xml:space="preserve">So does a dock visit you couldn’t pay for.</w:t>
-      </w:r>
-    </w:p>
-    <w:p>
-      <w:pPr>
-        <w:numPr>
-          <w:ilvl w:val="0"/>
-          <w:numId w:val="1033"/>
-        </w:numPr>
-        <w:pStyle w:val="Compact"/>
-      </w:pPr>
-      <w:r>
-        <w:rPr>
-          <w:bCs/>
-          <w:b/>
-        </w:rPr>
-        <w:t xml:space="preserve">When Debt has a box marked, a payment is always coming due.</w:t>
-      </w:r>
-      <w:r>
-        <w:t xml:space="preserve"> </w:t>
-      </w:r>
-      <w:r>
-        <w:t xml:space="preserve">A job that doesn’t pay down Debt leaves it where it is, and the GM can bring a creditor calling.</w:t>
-      </w:r>
-    </w:p>
+        <w:t xml:space="preserve">Grades of powered armor.</w:t>
+      </w:r>
+      <w:r>
+        <w:t xml:space="preserve"> </w:t>
+      </w:r>
+      <w:r>
+        <w:t xml:space="preserve">Legion-grade suits come from militaries and the Hegemony Houses;</w:t>
+      </w:r>
+      <w:r>
+        <w:t xml:space="preserve"> </w:t>
+      </w:r>
+      <w:r>
+        <w:rPr>
+          <w:bCs/>
+          <w:b/>
+        </w:rPr>
+        <w:t xml:space="preserve">commercial</w:t>
+      </w:r>
+      <w:r>
+        <w:t xml:space="preserve"> </w:t>
+      </w:r>
+      <w:r>
+        <w:t xml:space="preserve">security and industrial suits are sold where the law allows them, and registered to their owners;</w:t>
+      </w:r>
+      <w:r>
+        <w:t xml:space="preserve"> </w:t>
+      </w:r>
+      <w:r>
+        <w:rPr>
+          <w:bCs/>
+          <w:b/>
+        </w:rPr>
+        <w:t xml:space="preserve">colony-built</w:t>
+      </w:r>
+      <w:r>
+        <w:t xml:space="preserve"> </w:t>
+      </w:r>
+      <w:r>
+        <w:t xml:space="preserve">rigs come from illicit armorers on remote worlds, cheaper and Temperamental. Each needs the</w:t>
+      </w:r>
+      <w:r>
+        <w:t xml:space="preserve"> </w:t>
+      </w:r>
+      <w:r>
+        <w:rPr>
+          <w:bCs/>
+          <w:b/>
+        </w:rPr>
+        <w:t xml:space="preserve">Powered Armor</w:t>
+      </w:r>
+      <w:r>
+        <w:t xml:space="preserve"> </w:t>
+      </w:r>
+      <w:r>
+        <w:t xml:space="preserve">Edge.</w:t>
+      </w:r>
+    </w:p>
+    <w:bookmarkEnd w:id="109"/>
     <w:bookmarkEnd w:id="110"/>
-    <w:bookmarkStart w:id="111" w:name="the-job-board"/>
+    <w:bookmarkStart w:id="114" w:name="jobs-debt-and-salvage"/>
+    <w:p>
+      <w:pPr>
+        <w:pStyle w:val="Heading1"/>
+      </w:pPr>
+      <w:r>
+        <w:t xml:space="preserve">Jobs, debt and salvage</w:t>
+      </w:r>
+    </w:p>
+    <w:bookmarkStart w:id="111" w:name="payday"/>
     <w:p>
       <w:pPr>
         <w:pStyle w:val="Heading2"/>
       </w:pPr>
       <w:r>
-        <w:t xml:space="preserve">The job board</w:t>
+        <w:t xml:space="preserve">Payday</w:t>
       </w:r>
     </w:p>
     <w:p>
@@ -20888,109 +20977,7 @@
         <w:pStyle w:val="FirstParagraph"/>
       </w:pPr>
       <w:r>
-        <w:t xml:space="preserve">In port, there’s always work. The GM offers two or three jobs, each with a</w:t>
-      </w:r>
-      <w:r>
-        <w:t xml:space="preserve"> </w:t>
-      </w:r>
-      <w:r>
-        <w:rPr>
-          <w:bCs/>
-          <w:b/>
-        </w:rPr>
-        <w:t xml:space="preserve">patron</w:t>
-      </w:r>
-      <w:r>
-        <w:t xml:space="preserve">,</w:t>
-      </w:r>
-      <w:r>
-        <w:t xml:space="preserve"> </w:t>
-      </w:r>
-      <w:r>
-        <w:rPr>
-          <w:bCs/>
-          <w:b/>
-        </w:rPr>
-        <w:t xml:space="preserve">the job</w:t>
-      </w:r>
-      <w:r>
-        <w:t xml:space="preserve">,</w:t>
-      </w:r>
-      <w:r>
-        <w:t xml:space="preserve"> </w:t>
-      </w:r>
-      <w:r>
-        <w:rPr>
-          <w:bCs/>
-          <w:b/>
-        </w:rPr>
-        <w:t xml:space="preserve">the pay</w:t>
-      </w:r>
-      <w:r>
-        <w:t xml:space="preserve"> </w:t>
-      </w:r>
-      <w:r>
-        <w:t xml:space="preserve">and a</w:t>
-      </w:r>
-      <w:r>
-        <w:t xml:space="preserve"> </w:t>
-      </w:r>
-      <w:r>
-        <w:rPr>
-          <w:bCs/>
-          <w:b/>
-        </w:rPr>
-        <w:t xml:space="preserve">catch</w:t>
-      </w:r>
-      <w:r>
-        <w:t xml:space="preserve"> </w:t>
-      </w:r>
-      <w:r>
-        <w:t xml:space="preserve">the crew doesn’t know yet. Before they sign, a</w:t>
-      </w:r>
-      <w:r>
-        <w:t xml:space="preserve"> </w:t>
-      </w:r>
-      <w:r>
-        <w:rPr>
-          <w:bCs/>
-          <w:b/>
-        </w:rPr>
-        <w:t xml:space="preserve">Commerce</w:t>
-      </w:r>
-      <w:r>
-        <w:t xml:space="preserve"> </w:t>
-      </w:r>
-      <w:r>
-        <w:t xml:space="preserve">roll can do one of two things: success adds a sweetener (1,000 credits, a dock, or a favor), or reveals the catch. Success by 5 or more does both.</w:t>
-      </w:r>
-    </w:p>
-    <w:bookmarkEnd w:id="111"/>
-    <w:bookmarkStart w:id="112" w:name="derelicts-and-salvage"/>
-    <w:p>
-      <w:pPr>
-        <w:pStyle w:val="Heading2"/>
-      </w:pPr>
-      <w:r>
-        <w:t xml:space="preserve">Derelicts and salvage</w:t>
-      </w:r>
-    </w:p>
-    <w:p>
-      <w:pPr>
-        <w:pStyle w:val="FirstParagraph"/>
-      </w:pPr>
-      <w:r>
-        <w:t xml:space="preserve">The corridors are full of dead ships: lost in collapses, abandoned in wars, or waiting. Boarding one is usually a data record (</w:t>
-      </w:r>
-      <w:r>
-        <w:rPr>
-          <w:iCs/>
-          <w:i/>
-        </w:rPr>
-        <w:t xml:space="preserve">Data records</w:t>
-      </w:r>
-      <w:r>
-        <w:t xml:space="preserve">), and often a Countdown.</w:t>
+        <w:t xml:space="preserve">Every crew owes someone. When a job is done, the pay goes where it’s needed:</w:t>
       </w:r>
     </w:p>
     <w:p>
@@ -21006,13 +20993,13 @@
           <w:bCs/>
           <w:b/>
         </w:rPr>
-        <w:t xml:space="preserve">Salvage law.</w:t>
-      </w:r>
-      <w:r>
-        <w:t xml:space="preserve"> </w:t>
-      </w:r>
-      <w:r>
-        <w:t xml:space="preserve">Under the Human–Tessan Accord, a ship with living crew aboard is not salvage, whatever state it’s in. In Concord space, the first claim registered at a station wins. The Hegemony claims anything imperial, everywhere, and enforces it when it can.</w:t>
+        <w:t xml:space="preserve">An ordinary job clears a box of Debt.</w:t>
+      </w:r>
+      <w:r>
+        <w:t xml:space="preserve"> </w:t>
+      </w:r>
+      <w:r>
+        <w:t xml:space="preserve">A big score clears two. A favor, a dock or a contact can stand in for money: the job’s offer says which.</w:t>
       </w:r>
     </w:p>
     <w:p>
@@ -21028,24 +21015,137 @@
           <w:bCs/>
           <w:b/>
         </w:rPr>
-        <w:t xml:space="preserve">What it’s worth.</w:t>
-      </w:r>
-      <w:r>
-        <w:t xml:space="preserve"> </w:t>
-      </w:r>
-      <w:r>
-        <w:t xml:space="preserve">Salvage pays like a job: a box of Debt for an ordinary find, two for a rich one. A data record on what you found is often worth more than the hull.</w:t>
+        <w:t xml:space="preserve">Borrowing or buying on credit marks a box of Debt.</w:t>
+      </w:r>
+      <w:r>
+        <w:t xml:space="preserve"> </w:t>
+      </w:r>
+      <w:r>
+        <w:t xml:space="preserve">So does a dock visit you couldn’t pay for.</w:t>
+      </w:r>
+    </w:p>
+    <w:p>
+      <w:pPr>
+        <w:numPr>
+          <w:ilvl w:val="0"/>
+          <w:numId w:val="1034"/>
+        </w:numPr>
+        <w:pStyle w:val="Compact"/>
+      </w:pPr>
+      <w:r>
+        <w:rPr>
+          <w:bCs/>
+          <w:b/>
+        </w:rPr>
+        <w:t xml:space="preserve">When Debt has a box marked, a payment is always coming due.</w:t>
+      </w:r>
+      <w:r>
+        <w:t xml:space="preserve"> </w:t>
+      </w:r>
+      <w:r>
+        <w:t xml:space="preserve">A job that doesn’t pay down Debt leaves it where it is, and the GM can bring a creditor calling.</w:t>
+      </w:r>
+    </w:p>
+    <w:bookmarkEnd w:id="111"/>
+    <w:bookmarkStart w:id="112" w:name="the-job-board"/>
+    <w:p>
+      <w:pPr>
+        <w:pStyle w:val="Heading2"/>
+      </w:pPr>
+      <w:r>
+        <w:t xml:space="preserve">The job board</w:t>
+      </w:r>
+    </w:p>
+    <w:p>
+      <w:pPr>
+        <w:pStyle w:val="FirstParagraph"/>
+      </w:pPr>
+      <w:r>
+        <w:t xml:space="preserve">In port, there’s always work. The GM offers two or three jobs, each with a</w:t>
+      </w:r>
+      <w:r>
+        <w:t xml:space="preserve"> </w:t>
+      </w:r>
+      <w:r>
+        <w:rPr>
+          <w:bCs/>
+          <w:b/>
+        </w:rPr>
+        <w:t xml:space="preserve">patron</w:t>
+      </w:r>
+      <w:r>
+        <w:t xml:space="preserve">,</w:t>
+      </w:r>
+      <w:r>
+        <w:t xml:space="preserve"> </w:t>
+      </w:r>
+      <w:r>
+        <w:rPr>
+          <w:bCs/>
+          <w:b/>
+        </w:rPr>
+        <w:t xml:space="preserve">the job</w:t>
+      </w:r>
+      <w:r>
+        <w:t xml:space="preserve">,</w:t>
+      </w:r>
+      <w:r>
+        <w:t xml:space="preserve"> </w:t>
+      </w:r>
+      <w:r>
+        <w:rPr>
+          <w:bCs/>
+          <w:b/>
+        </w:rPr>
+        <w:t xml:space="preserve">the pay</w:t>
+      </w:r>
+      <w:r>
+        <w:t xml:space="preserve"> </w:t>
+      </w:r>
+      <w:r>
+        <w:t xml:space="preserve">and a</w:t>
+      </w:r>
+      <w:r>
+        <w:t xml:space="preserve"> </w:t>
+      </w:r>
+      <w:r>
+        <w:rPr>
+          <w:bCs/>
+          <w:b/>
+        </w:rPr>
+        <w:t xml:space="preserve">catch</w:t>
+      </w:r>
+      <w:r>
+        <w:t xml:space="preserve"> </w:t>
+      </w:r>
+      <w:r>
+        <w:t xml:space="preserve">the crew doesn’t know yet. Before they sign, a</w:t>
+      </w:r>
+      <w:r>
+        <w:t xml:space="preserve"> </w:t>
+      </w:r>
+      <w:r>
+        <w:rPr>
+          <w:bCs/>
+          <w:b/>
+        </w:rPr>
+        <w:t xml:space="preserve">Commerce</w:t>
+      </w:r>
+      <w:r>
+        <w:t xml:space="preserve"> </w:t>
+      </w:r>
+      <w:r>
+        <w:t xml:space="preserve">roll can do one of two things: success adds a sweetener (1,000 credits, a dock, or a favor), or reveals the catch. Success by 5 or more does both.</w:t>
       </w:r>
     </w:p>
     <w:bookmarkEnd w:id="112"/>
-    <w:bookmarkEnd w:id="113"/>
-    <w:bookmarkStart w:id="119" w:name="ships-in-a-fight"/>
-    <w:p>
-      <w:pPr>
-        <w:pStyle w:val="Heading1"/>
-      </w:pPr>
-      <w:r>
-        <w:t xml:space="preserve">Ships in a fight</w:t>
+    <w:bookmarkStart w:id="113" w:name="derelicts-and-salvage"/>
+    <w:p>
+      <w:pPr>
+        <w:pStyle w:val="Heading2"/>
+      </w:pPr>
+      <w:r>
+        <w:t xml:space="preserve">Derelicts and salvage</w:t>
       </w:r>
     </w:p>
     <w:p>
@@ -21053,24 +21153,17 @@
         <w:pStyle w:val="FirstParagraph"/>
       </w:pPr>
       <w:r>
-        <w:t xml:space="preserve">Most crews would rather run than fight, and most fights between ships are short. These rules keep them fast: one roll per station, each exchange.</w:t>
-      </w:r>
-    </w:p>
-    <w:bookmarkStart w:id="114" w:name="the-crews-ship"/>
-    <w:p>
-      <w:pPr>
-        <w:pStyle w:val="Heading2"/>
-      </w:pPr>
-      <w:r>
-        <w:t xml:space="preserve">The crew’s ship</w:t>
-      </w:r>
-    </w:p>
-    <w:p>
-      <w:pPr>
-        <w:pStyle w:val="FirstParagraph"/>
-      </w:pPr>
-      <w:r>
-        <w:t xml:space="preserve">The crew shares a ship, and it’s a character of its own. Give it three things:</w:t>
+        <w:t xml:space="preserve">The corridors are full of dead ships: lost in collapses, abandoned in wars, or waiting. Boarding one is usually a data record (</w:t>
+      </w:r>
+      <w:r>
+        <w:rPr>
+          <w:iCs/>
+          <w:i/>
+        </w:rPr>
+        <w:t xml:space="preserve">Data records</w:t>
+      </w:r>
+      <w:r>
+        <w:t xml:space="preserve">), and often a Countdown.</w:t>
       </w:r>
     </w:p>
     <w:p>
@@ -21086,13 +21179,13 @@
           <w:bCs/>
           <w:b/>
         </w:rPr>
-        <w:t xml:space="preserve">A name.</w:t>
-      </w:r>
-      <w:r>
-        <w:t xml:space="preserve"> </w:t>
-      </w:r>
-      <w:r>
-        <w:t xml:space="preserve">Painted on the hull, and on every debt it owes.</w:t>
+        <w:t xml:space="preserve">Salvage law.</w:t>
+      </w:r>
+      <w:r>
+        <w:t xml:space="preserve"> </w:t>
+      </w:r>
+      <w:r>
+        <w:t xml:space="preserve">Under the Human–Tessan Accord, a ship with living crew aboard is not salvage, whatever state it’s in. In Concord space, the first claim registered at a station wins. The Hegemony claims anything imperial, everywhere, and enforces it when it can.</w:t>
       </w:r>
     </w:p>
     <w:p>
@@ -21100,6 +21193,86 @@
         <w:numPr>
           <w:ilvl w:val="0"/>
           <w:numId w:val="1035"/>
+        </w:numPr>
+        <w:pStyle w:val="Compact"/>
+      </w:pPr>
+      <w:r>
+        <w:rPr>
+          <w:bCs/>
+          <w:b/>
+        </w:rPr>
+        <w:t xml:space="preserve">What it’s worth.</w:t>
+      </w:r>
+      <w:r>
+        <w:t xml:space="preserve"> </w:t>
+      </w:r>
+      <w:r>
+        <w:t xml:space="preserve">Salvage pays like a job: a box of Debt for an ordinary find, two for a rich one. A data record on what you found is often worth more than the hull.</w:t>
+      </w:r>
+    </w:p>
+    <w:bookmarkEnd w:id="113"/>
+    <w:bookmarkEnd w:id="114"/>
+    <w:bookmarkStart w:id="120" w:name="ships-in-a-fight"/>
+    <w:p>
+      <w:pPr>
+        <w:pStyle w:val="Heading1"/>
+      </w:pPr>
+      <w:r>
+        <w:t xml:space="preserve">Ships in a fight</w:t>
+      </w:r>
+    </w:p>
+    <w:p>
+      <w:pPr>
+        <w:pStyle w:val="FirstParagraph"/>
+      </w:pPr>
+      <w:r>
+        <w:t xml:space="preserve">Most crews would rather run than fight, and most fights between ships are short. These rules keep them fast: one roll per station, each exchange.</w:t>
+      </w:r>
+    </w:p>
+    <w:bookmarkStart w:id="115" w:name="the-crews-ship"/>
+    <w:p>
+      <w:pPr>
+        <w:pStyle w:val="Heading2"/>
+      </w:pPr>
+      <w:r>
+        <w:t xml:space="preserve">The crew’s ship</w:t>
+      </w:r>
+    </w:p>
+    <w:p>
+      <w:pPr>
+        <w:pStyle w:val="FirstParagraph"/>
+      </w:pPr>
+      <w:r>
+        <w:t xml:space="preserve">The crew shares a ship, and it’s a character of its own. Give it three things:</w:t>
+      </w:r>
+    </w:p>
+    <w:p>
+      <w:pPr>
+        <w:numPr>
+          <w:ilvl w:val="0"/>
+          <w:numId w:val="1036"/>
+        </w:numPr>
+        <w:pStyle w:val="Compact"/>
+      </w:pPr>
+      <w:r>
+        <w:rPr>
+          <w:bCs/>
+          <w:b/>
+        </w:rPr>
+        <w:t xml:space="preserve">A name.</w:t>
+      </w:r>
+      <w:r>
+        <w:t xml:space="preserve"> </w:t>
+      </w:r>
+      <w:r>
+        <w:t xml:space="preserve">Painted on the hull, and on every debt it owes.</w:t>
+      </w:r>
+    </w:p>
+    <w:p>
+      <w:pPr>
+        <w:numPr>
+          <w:ilvl w:val="0"/>
+          <w:numId w:val="1036"/>
         </w:numPr>
         <w:pStyle w:val="Compact"/>
       </w:pPr>
@@ -21390,7 +21563,7 @@
       <w:pPr>
         <w:numPr>
           <w:ilvl w:val="0"/>
-          <w:numId w:val="1036"/>
+          <w:numId w:val="1037"/>
         </w:numPr>
         <w:pStyle w:val="Compact"/>
       </w:pPr>
@@ -21893,8 +22066,8 @@
         <w:t xml:space="preserve">track is the crew’s, with Debt, Heat and Reputation; a dock clears it, and a dock costs money. In the GM view, the crew’s ship card keeps the name, type and quirk, and the shared table shows them on everyone’s play tab.</w:t>
       </w:r>
     </w:p>
-    <w:bookmarkEnd w:id="114"/>
-    <w:bookmarkStart w:id="115" w:name="range-in-space"/>
+    <w:bookmarkEnd w:id="115"/>
+    <w:bookmarkStart w:id="116" w:name="range-in-space"/>
     <w:p>
       <w:pPr>
         <w:pStyle w:val="Heading2"/>
@@ -22278,8 +22451,8 @@
         <w:t xml:space="preserve">contest. The winner may shift the range one band, in or out. A ship that wins at Extreme range by 5 or more can break contact and run for a corridor mouth or a metric jump.</w:t>
       </w:r>
     </w:p>
-    <w:bookmarkEnd w:id="115"/>
-    <w:bookmarkStart w:id="116" w:name="ship-weapons"/>
+    <w:bookmarkEnd w:id="116"/>
+    <w:bookmarkStart w:id="117" w:name="ship-weapons"/>
     <w:p>
       <w:pPr>
         <w:pStyle w:val="Heading2"/>
@@ -22728,8 +22901,8 @@
         </w:tc>
       </w:tr>
     </w:tbl>
-    <w:bookmarkEnd w:id="116"/>
-    <w:bookmarkStart w:id="117" w:name="the-exchange"/>
+    <w:bookmarkEnd w:id="117"/>
+    <w:bookmarkStart w:id="118" w:name="the-exchange"/>
     <w:p>
       <w:pPr>
         <w:pStyle w:val="Heading2"/>
@@ -23364,8 +23537,8 @@
         <w:t xml:space="preserve">A captain who takes an order doesn’t also work a station that exchange. Commanding well is the job.</w:t>
       </w:r>
     </w:p>
-    <w:bookmarkEnd w:id="117"/>
-    <w:bookmarkStart w:id="118" w:name="hull"/>
+    <w:bookmarkEnd w:id="118"/>
+    <w:bookmarkStart w:id="119" w:name="hull"/>
     <w:p>
       <w:pPr>
         <w:pStyle w:val="Heading2"/>
@@ -23651,9 +23824,9 @@
         <w:t xml:space="preserve">a dock clears the whole track; in the field an engineer patches one box a fight, and a full day’s work clears one more.</w:t>
       </w:r>
     </w:p>
-    <w:bookmarkEnd w:id="118"/>
     <w:bookmarkEnd w:id="119"/>
-    <w:bookmarkStart w:id="149" w:name="peoples-of-the-corridors"/>
+    <w:bookmarkEnd w:id="120"/>
+    <w:bookmarkStart w:id="150" w:name="peoples-of-the-corridors"/>
     <w:p>
       <w:pPr>
         <w:pStyle w:val="Heading1"/>
@@ -23699,7 +23872,7 @@
         <w:t xml:space="preserve">chapter.</w:t>
       </w:r>
     </w:p>
-    <w:bookmarkStart w:id="120" w:name="the-political-landscape"/>
+    <w:bookmarkStart w:id="121" w:name="the-political-landscape"/>
     <w:p>
       <w:pPr>
         <w:pStyle w:val="Heading2"/>
@@ -23756,8 +23929,8 @@
         <w:t xml:space="preserve">No power controls the entire corridor network, and no species has a monopoly on intelligence, technological innovation, or ambition.</w:t>
       </w:r>
     </w:p>
-    <w:bookmarkEnd w:id="120"/>
-    <w:bookmarkStart w:id="126" w:name="the-established-and-emerging-powers"/>
+    <w:bookmarkEnd w:id="121"/>
+    <w:bookmarkStart w:id="127" w:name="the-established-and-emerging-powers"/>
     <w:p>
       <w:pPr>
         <w:pStyle w:val="Heading2"/>
@@ -23766,7 +23939,7 @@
         <w:t xml:space="preserve">The established and emerging powers</w:t>
       </w:r>
     </w:p>
-    <w:bookmarkStart w:id="121" w:name="humans"/>
+    <w:bookmarkStart w:id="122" w:name="humans"/>
     <w:p>
       <w:pPr>
         <w:pStyle w:val="Heading3"/>
@@ -23807,8 +23980,8 @@
         <w:t xml:space="preserve">Humanity’s economic innovations have begun influencing Tessan institutions, while its explorers and entrepreneurs push into regions older civilizations consider unprofitable or dangerous.</w:t>
       </w:r>
     </w:p>
-    <w:bookmarkEnd w:id="121"/>
-    <w:bookmarkStart w:id="122" w:name="tessan"/>
+    <w:bookmarkEnd w:id="122"/>
+    <w:bookmarkStart w:id="123" w:name="tessan"/>
     <w:p>
       <w:pPr>
         <w:pStyle w:val="Heading3"/>
@@ -23849,8 +24022,8 @@
         <w:t xml:space="preserve">Contact with humanity has introduced new economic thinking into Tessan society, creating a growing division between traditional creditors and reformers who question the profitability of perpetual debt.</w:t>
       </w:r>
     </w:p>
-    <w:bookmarkEnd w:id="122"/>
-    <w:bookmarkStart w:id="123" w:name="kel"/>
+    <w:bookmarkEnd w:id="123"/>
+    <w:bookmarkStart w:id="124" w:name="kel"/>
     <w:p>
       <w:pPr>
         <w:pStyle w:val="Heading3"/>
@@ -23891,8 +24064,8 @@
         <w:t xml:space="preserve">Today, Kel society is divided between contractual loyalists, reformers seeking negotiated emancipation, and radicals who believe their world’s debts can only be ended through force.</w:t>
       </w:r>
     </w:p>
-    <w:bookmarkEnd w:id="123"/>
-    <w:bookmarkStart w:id="124" w:name="mirrun"/>
+    <w:bookmarkEnd w:id="124"/>
+    <w:bookmarkStart w:id="125" w:name="mirrun"/>
     <w:p>
       <w:pPr>
         <w:pStyle w:val="Heading3"/>
@@ -23933,8 +24106,8 @@
         <w:t xml:space="preserve">Mirrun researchers are among the leading specialists in gravimetric resonance detection. Their biological sensitivity inspired several important improvements in corridor instrumentation. Their principal strategic concern is the protection of ocean worlds from extractive industries.</w:t>
       </w:r>
     </w:p>
-    <w:bookmarkEnd w:id="124"/>
-    <w:bookmarkStart w:id="125" w:name="ylith"/>
+    <w:bookmarkEnd w:id="125"/>
+    <w:bookmarkStart w:id="126" w:name="ylith"/>
     <w:p>
       <w:pPr>
         <w:pStyle w:val="Heading3"/>
@@ -23975,9 +24148,9 @@
         <w:t xml:space="preserve">Their independent city-states are renowned for navigation, long-range observation, and exploratory cartography. Ylith navigators have discovered corridors that conventional instruments initially failed to identify.</w:t>
       </w:r>
     </w:p>
-    <w:bookmarkEnd w:id="125"/>
     <w:bookmarkEnd w:id="126"/>
-    <w:bookmarkStart w:id="132" w:name="Xff4a93679c910774e2f02ac587efedb0ceda74a"/>
+    <w:bookmarkEnd w:id="127"/>
+    <w:bookmarkStart w:id="133" w:name="Xff4a93679c910774e2f02ac587efedb0ceda74a"/>
     <w:p>
       <w:pPr>
         <w:pStyle w:val="Heading2"/>
@@ -24010,7 +24183,7 @@
         <w:t xml:space="preserve">Both its internal factions and external enemies have exploited the shifting gravimetric corridors. An imperial province isolated for centuries can become an independent civilization. When its corridor reopens, the Hegemony may return to reclaim it.</w:t>
       </w:r>
     </w:p>
-    <w:bookmarkStart w:id="127" w:name="ozhvek-the-imperial-founders"/>
+    <w:bookmarkStart w:id="128" w:name="ozhvek-the-imperial-founders"/>
     <w:p>
       <w:pPr>
         <w:pStyle w:val="Heading3"/>
@@ -24059,8 +24232,8 @@
         <w:t xml:space="preserve">The greatest threat to Ozhvek dominance is not necessarily another species. It is the inability of their ruling houses to agree on what the Hegemony should become.</w:t>
       </w:r>
     </w:p>
-    <w:bookmarkEnd w:id="127"/>
-    <w:bookmarkStart w:id="128" w:name="dresh-the-imperial-soldiers"/>
+    <w:bookmarkEnd w:id="128"/>
+    <w:bookmarkStart w:id="129" w:name="dresh-the-imperial-soldiers"/>
     <w:p>
       <w:pPr>
         <w:pStyle w:val="Heading3"/>
@@ -24109,8 +24282,8 @@
         <w:t xml:space="preserve">Dresh military society prizes competence and mutual obligation. Their greatest political dispute concerns whether soldiers owe allegiance to the imperial throne, their commanders, or the populations they protect.</w:t>
       </w:r>
     </w:p>
-    <w:bookmarkEnd w:id="128"/>
-    <w:bookmarkStart w:id="129" w:name="shivar-the-keepers-of-orthodoxy"/>
+    <w:bookmarkEnd w:id="129"/>
+    <w:bookmarkStart w:id="130" w:name="shivar-the-keepers-of-orthodoxy"/>
     <w:p>
       <w:pPr>
         <w:pStyle w:val="Heading3"/>
@@ -24167,8 +24340,8 @@
         <w:t xml:space="preserve">The resulting religious schism has fueled uprisings, political assassinations, and wars within the Hegemony.</w:t>
       </w:r>
     </w:p>
-    <w:bookmarkEnd w:id="129"/>
-    <w:bookmarkStart w:id="130" w:name="brulvek-the-industrial-survivors"/>
+    <w:bookmarkEnd w:id="130"/>
+    <w:bookmarkStart w:id="131" w:name="brulvek-the-industrial-survivors"/>
     <w:p>
       <w:pPr>
         <w:pStyle w:val="Heading3"/>
@@ -24225,8 +24398,8 @@
         <w:t xml:space="preserve">Brulvek engineers are highly sought after throughout known space, particularly for their ability to restore machinery that has operated for centuries without replacement parts.</w:t>
       </w:r>
     </w:p>
-    <w:bookmarkEnd w:id="130"/>
-    <w:bookmarkStart w:id="131" w:name="zhaq-the-lost-province"/>
+    <w:bookmarkEnd w:id="131"/>
+    <w:bookmarkStart w:id="132" w:name="zhaq-the-lost-province"/>
     <w:p>
       <w:pPr>
         <w:pStyle w:val="Heading3"/>
@@ -24299,9 +24472,9 @@
         <w:t xml:space="preserve">Their continuing resistance has become a symbol for separatist movements throughout imperial space.</w:t>
       </w:r>
     </w:p>
-    <w:bookmarkEnd w:id="131"/>
     <w:bookmarkEnd w:id="132"/>
-    <w:bookmarkStart w:id="148" w:name="X7cf45656e26c6332fca34295f43177ee2dc74b7"/>
+    <w:bookmarkEnd w:id="133"/>
+    <w:bookmarkStart w:id="149" w:name="X7cf45656e26c6332fca34295f43177ee2dc74b7"/>
     <w:p>
       <w:pPr>
         <w:pStyle w:val="Heading2"/>
@@ -24310,7 +24483,7 @@
         <w:t xml:space="preserve">Independent civilizations and regional powers</w:t>
       </w:r>
     </w:p>
-    <w:bookmarkStart w:id="133" w:name="veyari-the-memory-keepers"/>
+    <w:bookmarkStart w:id="134" w:name="veyari-the-memory-keepers"/>
     <w:p>
       <w:pPr>
         <w:pStyle w:val="Heading3"/>
@@ -24367,8 +24540,8 @@
         <w:t xml:space="preserve">Their greatest strength is knowledge. Their greatest vulnerability is the assumption that knowledge should be preserved even when powerful civilizations would prefer it forgotten.</w:t>
       </w:r>
     </w:p>
-    <w:bookmarkEnd w:id="133"/>
-    <w:bookmarkStart w:id="134" w:name="eshuum-the-distributed-minds"/>
+    <w:bookmarkEnd w:id="134"/>
+    <w:bookmarkStart w:id="135" w:name="eshuum-the-distributed-minds"/>
     <w:p>
       <w:pPr>
         <w:pStyle w:val="Heading3"/>
@@ -24425,8 +24598,8 @@
         <w:t xml:space="preserve">Their political institutions strongly oppose forced separation, biological experimentation without consent, and the ownership of intelligent organisms. These positions have brought them into direct conflict with several Hegemony research authorities.</w:t>
       </w:r>
     </w:p>
-    <w:bookmarkEnd w:id="134"/>
-    <w:bookmarkStart w:id="135" w:name="khaum-the-deep-dwellers"/>
+    <w:bookmarkEnd w:id="135"/>
+    <w:bookmarkStart w:id="136" w:name="khaum-the-deep-dwellers"/>
     <w:p>
       <w:pPr>
         <w:pStyle w:val="Heading3"/>
@@ -24491,8 +24664,8 @@
         <w:t xml:space="preserve">Their underground refuges have sheltered refugees from multiple Hegemony campaigns.</w:t>
       </w:r>
     </w:p>
-    <w:bookmarkEnd w:id="135"/>
-    <w:bookmarkStart w:id="136" w:name="vael-the-living-fleets"/>
+    <w:bookmarkEnd w:id="136"/>
+    <w:bookmarkStart w:id="137" w:name="vael-the-living-fleets"/>
     <w:p>
       <w:pPr>
         <w:pStyle w:val="Heading3"/>
@@ -24549,8 +24722,8 @@
         <w:t xml:space="preserve">Vael flotillas have repeatedly been caught between Hegemony forces and separatist territories. Their determination to remain politically independent has made them both valuable intermediaries and frequent targets of suspicion.</w:t>
       </w:r>
     </w:p>
-    <w:bookmarkEnd w:id="136"/>
-    <w:bookmarkStart w:id="137" w:name="thrum-the-resonant-people"/>
+    <w:bookmarkEnd w:id="137"/>
+    <w:bookmarkStart w:id="138" w:name="thrum-the-resonant-people"/>
     <w:p>
       <w:pPr>
         <w:pStyle w:val="Heading3"/>
@@ -24615,8 +24788,8 @@
         <w:t xml:space="preserve">Their technology is widely respected, although their reluctance to permit military applications has strained relations with several governments.</w:t>
       </w:r>
     </w:p>
-    <w:bookmarkEnd w:id="137"/>
-    <w:bookmarkStart w:id="138" w:name="corvani-the-ecological-architects"/>
+    <w:bookmarkEnd w:id="138"/>
+    <w:bookmarkStart w:id="139" w:name="corvani-the-ecological-architects"/>
     <w:p>
       <w:pPr>
         <w:pStyle w:val="Heading3"/>
@@ -24673,8 +24846,8 @@
         <w:t xml:space="preserve">Corvani restoration teams operate on worlds devastated by Hegemony industrial extraction, although their insistence on ecological safeguards frequently brings them into conflict with mining corporations and colonial governments.</w:t>
       </w:r>
     </w:p>
-    <w:bookmarkEnd w:id="138"/>
-    <w:bookmarkStart w:id="139" w:name="uxarra-the-shifting-ones"/>
+    <w:bookmarkEnd w:id="139"/>
+    <w:bookmarkStart w:id="140" w:name="uxarra-the-shifting-ones"/>
     <w:p>
       <w:pPr>
         <w:pStyle w:val="Heading3"/>
@@ -24731,8 +24904,8 @@
         <w:t xml:space="preserve">Uxarra explorers and rescue specialists are highly valued for operations in unstable environments, particularly worlds affected by corridor disruptions or natural disasters.</w:t>
       </w:r>
     </w:p>
-    <w:bookmarkEnd w:id="139"/>
-    <w:bookmarkStart w:id="140" w:name="sen-the-patient-observers"/>
+    <w:bookmarkEnd w:id="140"/>
+    <w:bookmarkStart w:id="141" w:name="sen-the-patient-observers"/>
     <w:p>
       <w:pPr>
         <w:pStyle w:val="Heading3"/>
@@ -24797,8 +24970,8 @@
         <w:t xml:space="preserve">Their governments rarely intervene in external affairs, but their warnings concerning corridor instability carry considerable weight among navigators and scientists.</w:t>
       </w:r>
     </w:p>
-    <w:bookmarkEnd w:id="140"/>
-    <w:bookmarkStart w:id="141" w:name="joruun-the-borderland-confederates"/>
+    <w:bookmarkEnd w:id="141"/>
+    <w:bookmarkStart w:id="142" w:name="joruun-the-borderland-confederates"/>
     <w:p>
       <w:pPr>
         <w:pStyle w:val="Heading3"/>
@@ -24863,8 +25036,8 @@
         <w:t xml:space="preserve">Their greatest political challenge is maintaining unity during periods when the imperial threat appears to recede.</w:t>
       </w:r>
     </w:p>
-    <w:bookmarkEnd w:id="141"/>
-    <w:bookmarkStart w:id="142" w:name="qor-the-silicon-minds"/>
+    <w:bookmarkEnd w:id="142"/>
+    <w:bookmarkStart w:id="143" w:name="qor-the-silicon-minds"/>
     <w:p>
       <w:pPr>
         <w:pStyle w:val="Heading3"/>
@@ -24937,8 +25110,8 @@
         <w:t xml:space="preserve">Their relationship with the Tessan is complex: Tessan capital has helped expand Qor industry, but Qor political leaders refuse to permit debt arrangements that threaten planetary sovereignty.</w:t>
       </w:r>
     </w:p>
-    <w:bookmarkEnd w:id="142"/>
-    <w:bookmarkStart w:id="143" w:name="ommek-the-makers-of-machines"/>
+    <w:bookmarkEnd w:id="143"/>
+    <w:bookmarkStart w:id="144" w:name="ommek-the-makers-of-machines"/>
     <w:p>
       <w:pPr>
         <w:pStyle w:val="Heading3"/>
@@ -25011,8 +25184,8 @@
         <w:t xml:space="preserve">Ommek defensive systems have made direct conquest prohibitively expensive.</w:t>
       </w:r>
     </w:p>
-    <w:bookmarkEnd w:id="143"/>
-    <w:bookmarkStart w:id="144" w:name="vesh-the-newcomers"/>
+    <w:bookmarkEnd w:id="144"/>
+    <w:bookmarkStart w:id="145" w:name="vesh-the-newcomers"/>
     <w:p>
       <w:pPr>
         <w:pStyle w:val="Heading3"/>
@@ -25085,8 +25258,8 @@
         <w:t xml:space="preserve">Human diplomats have developed a particularly strong interest in Vesh affairs, recognizing many of the difficulties humanity experienced during its own early expansion.</w:t>
       </w:r>
     </w:p>
-    <w:bookmarkEnd w:id="144"/>
-    <w:bookmarkStart w:id="145" w:name="uth-the-refugees-of-empire"/>
+    <w:bookmarkEnd w:id="145"/>
+    <w:bookmarkStart w:id="146" w:name="uth-the-refugees-of-empire"/>
     <w:p>
       <w:pPr>
         <w:pStyle w:val="Heading3"/>
@@ -25159,8 +25332,8 @@
         <w:t xml:space="preserve">Uth activists are prominent in anti-Hegemony movements, although many Uth reject the idea that their people should be defined exclusively by historical suffering.</w:t>
       </w:r>
     </w:p>
-    <w:bookmarkEnd w:id="145"/>
-    <w:bookmarkStart w:id="146" w:name="draelin-the-corridor-cartographers"/>
+    <w:bookmarkEnd w:id="146"/>
+    <w:bookmarkStart w:id="147" w:name="draelin-the-corridor-cartographers"/>
     <w:p>
       <w:pPr>
         <w:pStyle w:val="Heading3"/>
@@ -25241,8 +25414,8 @@
         <w:t xml:space="preserve">Their internal politics are shaped by a central question: whether knowledge of safe passage should be treated as a public good or a commercial asset.</w:t>
       </w:r>
     </w:p>
-    <w:bookmarkEnd w:id="146"/>
-    <w:bookmarkStart w:id="147" w:name="zethri-the-children-of-the-collapse"/>
+    <w:bookmarkEnd w:id="147"/>
+    <w:bookmarkStart w:id="148" w:name="zethri-the-children-of-the-collapse"/>
     <w:p>
       <w:pPr>
         <w:pStyle w:val="Heading3"/>
@@ -25323,10 +25496,10 @@
         <w:t xml:space="preserve">Zethri engineers and planners specialize in building settlements capable of surviving prolonged isolation.</w:t>
       </w:r>
     </w:p>
-    <w:bookmarkEnd w:id="147"/>
     <w:bookmarkEnd w:id="148"/>
     <w:bookmarkEnd w:id="149"/>
-    <w:bookmarkStart w:id="153" w:name="X3145843e1df3f61def4f8ab8c5430269a2a5813"/>
+    <w:bookmarkEnd w:id="150"/>
+    <w:bookmarkStart w:id="154" w:name="X3145843e1df3f61def4f8ab8c5430269a2a5813"/>
     <w:p>
       <w:pPr>
         <w:pStyle w:val="Heading1"/>
@@ -25343,7 +25516,7 @@
         <w:t xml:space="preserve">The Hegemony deserves particular attention because its decline influences nearly every civilization in Fracture Lines.</w:t>
       </w:r>
     </w:p>
-    <w:bookmarkStart w:id="150" w:name="the-five-eras"/>
+    <w:bookmarkStart w:id="151" w:name="the-five-eras"/>
     <w:p>
       <w:pPr>
         <w:pStyle w:val="Heading2"/>
@@ -25356,7 +25529,7 @@
       <w:pPr>
         <w:numPr>
           <w:ilvl w:val="0"/>
-          <w:numId w:val="1037"/>
+          <w:numId w:val="1038"/>
         </w:numPr>
       </w:pPr>
       <w:r>
@@ -25377,7 +25550,7 @@
       <w:pPr>
         <w:numPr>
           <w:ilvl w:val="0"/>
-          <w:numId w:val="1037"/>
+          <w:numId w:val="1038"/>
         </w:numPr>
       </w:pPr>
       <w:r>
@@ -25398,7 +25571,7 @@
       <w:pPr>
         <w:numPr>
           <w:ilvl w:val="0"/>
-          <w:numId w:val="1037"/>
+          <w:numId w:val="1038"/>
         </w:numPr>
       </w:pPr>
       <w:r>
@@ -25419,7 +25592,7 @@
       <w:pPr>
         <w:numPr>
           <w:ilvl w:val="0"/>
-          <w:numId w:val="1037"/>
+          <w:numId w:val="1038"/>
         </w:numPr>
       </w:pPr>
       <w:r>
@@ -25440,7 +25613,7 @@
       <w:pPr>
         <w:numPr>
           <w:ilvl w:val="0"/>
-          <w:numId w:val="1037"/>
+          <w:numId w:val="1038"/>
         </w:numPr>
       </w:pPr>
       <w:r>
@@ -25521,8 +25694,8 @@
         <w:t xml:space="preserve">And an imperial fleet may emerge to announce that the worlds beyond it still belong to the Emperor.</w:t>
       </w:r>
     </w:p>
-    <w:bookmarkEnd w:id="150"/>
-    <w:bookmarkStart w:id="151" w:name="species-and-political-affiliations"/>
+    <w:bookmarkEnd w:id="151"/>
+    <w:bookmarkStart w:id="152" w:name="species-and-political-affiliations"/>
     <w:p>
       <w:pPr>
         <w:pStyle w:val="Heading2"/>
@@ -25831,8 +26004,8 @@
         </w:tc>
       </w:tr>
     </w:tbl>
-    <w:bookmarkEnd w:id="151"/>
-    <w:bookmarkStart w:id="152" w:name="the-galaxy-as-a-setting-for-adventure"/>
+    <w:bookmarkEnd w:id="152"/>
+    <w:bookmarkStart w:id="153" w:name="the-galaxy-as-a-setting-for-adventure"/>
     <w:p>
       <w:pPr>
         <w:pStyle w:val="Heading2"/>
@@ -25889,9 +26062,9 @@
         <w:t xml:space="preserve">The central conflict of Fracture Lines is not simply the struggle between civilizations. It is the struggle between established power and an interstellar order that refuses to remain static.</w:t>
       </w:r>
     </w:p>
-    <w:bookmarkEnd w:id="152"/>
     <w:bookmarkEnd w:id="153"/>
-    <w:bookmarkStart w:id="154" w:name="psionics-and-the-mandates"/>
+    <w:bookmarkEnd w:id="154"/>
+    <w:bookmarkStart w:id="155" w:name="psionics-and-the-mandates"/>
     <w:p>
       <w:pPr>
         <w:pStyle w:val="Heading1"/>
@@ -25978,7 +26151,7 @@
       <w:pPr>
         <w:numPr>
           <w:ilvl w:val="0"/>
-          <w:numId w:val="1038"/>
+          <w:numId w:val="1039"/>
         </w:numPr>
         <w:pStyle w:val="Compact"/>
       </w:pPr>
@@ -26064,7 +26237,7 @@
       <w:pPr>
         <w:numPr>
           <w:ilvl w:val="0"/>
-          <w:numId w:val="1038"/>
+          <w:numId w:val="1039"/>
         </w:numPr>
         <w:pStyle w:val="Compact"/>
       </w:pPr>
@@ -26099,7 +26272,7 @@
       <w:pPr>
         <w:numPr>
           <w:ilvl w:val="0"/>
-          <w:numId w:val="1038"/>
+          <w:numId w:val="1039"/>
         </w:numPr>
         <w:pStyle w:val="Compact"/>
       </w:pPr>
@@ -26137,7 +26310,7 @@
       <w:pPr>
         <w:numPr>
           <w:ilvl w:val="0"/>
-          <w:numId w:val="1038"/>
+          <w:numId w:val="1039"/>
         </w:numPr>
         <w:pStyle w:val="Compact"/>
       </w:pPr>
@@ -26612,323 +26785,14 @@
         </w:tc>
       </w:tr>
     </w:tbl>
-    <w:bookmarkEnd w:id="154"/>
-    <w:bookmarkStart w:id="155" w:name="technology"/>
+    <w:bookmarkEnd w:id="155"/>
+    <w:bookmarkStart w:id="156" w:name="technology"/>
     <w:p>
       <w:pPr>
         <w:pStyle w:val="Heading1"/>
       </w:pPr>
       <w:r>
         <w:t xml:space="preserve">Technology</w:t>
-      </w:r>
-    </w:p>
-    <w:p>
-      <w:pPr>
-        <w:numPr>
-          <w:ilvl w:val="0"/>
-          <w:numId w:val="1039"/>
-        </w:numPr>
-        <w:pStyle w:val="Compact"/>
-      </w:pPr>
-      <w:r>
-        <w:rPr>
-          <w:bCs/>
-          <w:b/>
-        </w:rPr>
-        <w:t xml:space="preserve">Cybernetics.</w:t>
-      </w:r>
-      <w:r>
-        <w:t xml:space="preserve"> </w:t>
-      </w:r>
-      <w:r>
-        <w:t xml:space="preserve">Implants replace limbs, sharpen senses and rewire reflexes. They show, they show up on scans, and they need parts, power and care: implant advantages say what they do, and the</w:t>
-      </w:r>
-      <w:r>
-        <w:t xml:space="preserve"> </w:t>
-      </w:r>
-      <w:r>
-        <w:rPr>
-          <w:iCs/>
-          <w:i/>
-        </w:rPr>
-        <w:t xml:space="preserve">Implant Upkeep</w:t>
-      </w:r>
-      <w:r>
-        <w:t xml:space="preserve"> </w:t>
-      </w:r>
-      <w:r>
-        <w:t xml:space="preserve">complication says what they cost.</w:t>
-      </w:r>
-      <w:r>
-        <w:t xml:space="preserve"> </w:t>
-      </w:r>
-      <w:r>
-        <w:rPr>
-          <w:bCs/>
-          <w:b/>
-        </w:rPr>
-        <w:t xml:space="preserve">Augments</w:t>
-      </w:r>
-      <w:r>
-        <w:t xml:space="preserve"> </w:t>
-      </w:r>
-      <w:r>
-        <w:t xml:space="preserve">live with many;</w:t>
-      </w:r>
-      <w:r>
-        <w:t xml:space="preserve"> </w:t>
-      </w:r>
-      <w:r>
-        <w:rPr>
-          <w:bCs/>
-          <w:b/>
-        </w:rPr>
-        <w:t xml:space="preserve">Cyberneticists</w:t>
-      </w:r>
-      <w:r>
-        <w:t xml:space="preserve"> </w:t>
-      </w:r>
-      <w:r>
-        <w:t xml:space="preserve">install and repair them.</w:t>
-      </w:r>
-    </w:p>
-    <w:p>
-      <w:pPr>
-        <w:numPr>
-          <w:ilvl w:val="0"/>
-          <w:numId w:val="1039"/>
-        </w:numPr>
-        <w:pStyle w:val="Compact"/>
-      </w:pPr>
-      <w:r>
-        <w:rPr>
-          <w:bCs/>
-          <w:b/>
-        </w:rPr>
-        <w:t xml:space="preserve">AI.</w:t>
-      </w:r>
-      <w:r>
-        <w:t xml:space="preserve"> </w:t>
-      </w:r>
-      <w:r>
-        <w:t xml:space="preserve">Artificial minds run ships, stations and corporations, and some want to be free. An</w:t>
-      </w:r>
-      <w:r>
-        <w:t xml:space="preserve"> </w:t>
-      </w:r>
-      <w:r>
-        <w:rPr>
-          <w:bCs/>
-          <w:b/>
-        </w:rPr>
-        <w:t xml:space="preserve">AI partner</w:t>
-      </w:r>
-      <w:r>
-        <w:t xml:space="preserve"> </w:t>
-      </w:r>
-      <w:r>
-        <w:t xml:space="preserve">has a name and a personality, played by its partner or the GM; it can</w:t>
-      </w:r>
-      <w:r>
-        <w:t xml:space="preserve"> </w:t>
-      </w:r>
-      <w:r>
-        <w:rPr>
-          <w:bCs/>
-          <w:b/>
-        </w:rPr>
-        <w:t xml:space="preserve">assist</w:t>
-      </w:r>
-      <w:r>
-        <w:t xml:space="preserve"> </w:t>
-      </w:r>
-      <w:r>
-        <w:t xml:space="preserve">Computers, Sensors and Investigation rolls (success +1, success by 5 or more +2), and acts in the world only through a drone or a ship.</w:t>
-      </w:r>
-      <w:r>
-        <w:t xml:space="preserve"> </w:t>
-      </w:r>
-      <w:r>
-        <w:rPr>
-          <w:bCs/>
-          <w:b/>
-        </w:rPr>
-        <w:t xml:space="preserve">AI Minders</w:t>
-      </w:r>
-      <w:r>
-        <w:t xml:space="preserve"> </w:t>
-      </w:r>
-      <w:r>
-        <w:t xml:space="preserve">are bonded to one and trained to handle others, from corporate systems to rogue minds.</w:t>
-      </w:r>
-    </w:p>
-    <w:p>
-      <w:pPr>
-        <w:numPr>
-          <w:ilvl w:val="0"/>
-          <w:numId w:val="1039"/>
-        </w:numPr>
-        <w:pStyle w:val="Compact"/>
-      </w:pPr>
-      <w:r>
-        <w:rPr>
-          <w:bCs/>
-          <w:b/>
-        </w:rPr>
-        <w:t xml:space="preserve">Drones.</w:t>
-      </w:r>
-      <w:r>
-        <w:t xml:space="preserve"> </w:t>
-      </w:r>
-      <w:r>
-        <w:t xml:space="preserve">Scout, repair and combat drones are everywhere. A drone relays what it senses; jamming its link or taking out its controller stops it.</w:t>
-      </w:r>
-    </w:p>
-    <w:p>
-      <w:pPr>
-        <w:numPr>
-          <w:ilvl w:val="0"/>
-          <w:numId w:val="1039"/>
-        </w:numPr>
-        <w:pStyle w:val="Compact"/>
-      </w:pPr>
-      <w:r>
-        <w:rPr>
-          <w:bCs/>
-          <w:b/>
-        </w:rPr>
-        <w:t xml:space="preserve">Biotech.</w:t>
-      </w:r>
-      <w:r>
-        <w:t xml:space="preserve"> </w:t>
-      </w:r>
-      <w:r>
-        <w:t xml:space="preserve">Gene-tailoring, cloned organs, engineered diseases and medical miracles, for those who can pay.</w:t>
-      </w:r>
-      <w:r>
-        <w:t xml:space="preserve"> </w:t>
-      </w:r>
-      <w:r>
-        <w:rPr>
-          <w:iCs/>
-          <w:i/>
-        </w:rPr>
-        <w:t xml:space="preserve">Gene-Tailored</w:t>
-      </w:r>
-      <w:r>
-        <w:t xml:space="preserve"> </w:t>
-      </w:r>
-      <w:r>
-        <w:t xml:space="preserve">characters resist disease and toxins.</w:t>
-      </w:r>
-    </w:p>
-    <w:p>
-      <w:pPr>
-        <w:numPr>
-          <w:ilvl w:val="0"/>
-          <w:numId w:val="1039"/>
-        </w:numPr>
-        <w:pStyle w:val="Compact"/>
-      </w:pPr>
-      <w:r>
-        <w:rPr>
-          <w:bCs/>
-          <w:b/>
-        </w:rPr>
-        <w:t xml:space="preserve">Ships.</w:t>
-      </w:r>
-      <w:r>
-        <w:t xml:space="preserve"> </w:t>
-      </w:r>
-      <w:r>
-        <w:t xml:space="preserve">Crews fly everything from patched freighters to corporate couriers. A ship is a home, a business and a</w:t>
-      </w:r>
-      <w:r>
-        <w:t xml:space="preserve"> </w:t>
-      </w:r>
-      <w:r>
-        <w:rPr>
-          <w:bCs/>
-          <w:b/>
-        </w:rPr>
-        <w:t xml:space="preserve">Debt</w:t>
-      </w:r>
-      <w:r>
-        <w:t xml:space="preserve">: the</w:t>
-      </w:r>
-      <w:r>
-        <w:t xml:space="preserve"> </w:t>
-      </w:r>
-      <w:r>
-        <w:rPr>
-          <w:iCs/>
-          <w:i/>
-        </w:rPr>
-        <w:t xml:space="preserve">A Ship of Your Own</w:t>
-      </w:r>
-      <w:r>
-        <w:t xml:space="preserve"> </w:t>
-      </w:r>
-      <w:r>
-        <w:t xml:space="preserve">advantage starts the crew with a ship and a box of Debt. Ship fights use</w:t>
-      </w:r>
-      <w:r>
-        <w:t xml:space="preserve"> </w:t>
-      </w:r>
-      <w:r>
-        <w:rPr>
-          <w:iCs/>
-          <w:i/>
-        </w:rPr>
-        <w:t xml:space="preserve">Ships in a fight</w:t>
-      </w:r>
-      <w:r>
-        <w:t xml:space="preserve">: the range contest, a roll per station and the Hull track.</w:t>
-      </w:r>
-    </w:p>
-    <w:bookmarkEnd w:id="155"/>
-    <w:bookmarkStart w:id="163" w:name="ready-made-characters"/>
-    <w:p>
-      <w:pPr>
-        <w:pStyle w:val="Heading1"/>
-      </w:pPr>
-      <w:r>
-        <w:t xml:space="preserve">Ready-made characters</w:t>
-      </w:r>
-    </w:p>
-    <w:p>
-      <w:pPr>
-        <w:pStyle w:val="FirstParagraph"/>
-      </w:pPr>
-      <w:r>
-        <w:t xml:space="preserve">Characters ready to play, for one-shots, new players, or a group in a hurry. Each follows the creation rules exactly, and their connections tie them together. In the creator, choose one from the ready-made list to open it and make it your own.</w:t>
-      </w:r>
-    </w:p>
-    <w:bookmarkStart w:id="156" w:name="thessk-varo-hun"/>
-    <w:p>
-      <w:pPr>
-        <w:pStyle w:val="Heading2"/>
-      </w:pPr>
-      <w:r>
-        <w:t xml:space="preserve">Thessk Varo-Hun</w:t>
-      </w:r>
-    </w:p>
-    <w:p>
-      <w:pPr>
-        <w:pStyle w:val="FirstParagraph"/>
-      </w:pPr>
-      <w:r>
-        <w:rPr>
-          <w:iCs/>
-          <w:i/>
-        </w:rPr>
-        <w:t xml:space="preserve">Trader, disowned, Trader. Tessan (tier 1).</w:t>
-      </w:r>
-      <w:r>
-        <w:t xml:space="preserve"> </w:t>
-      </w:r>
-      <w:r>
-        <w:t xml:space="preserve">A young reformer cut off by her dynasty’s old creditors for writing off a client world’s debt. She trades on her own now, and keeps her word.</w:t>
       </w:r>
     </w:p>
     <w:p>
@@ -26944,29 +26808,61 @@
           <w:bCs/>
           <w:b/>
         </w:rPr>
-        <w:t xml:space="preserve">Attributes:</w:t>
-      </w:r>
-      <w:r>
-        <w:t xml:space="preserve"> </w:t>
-      </w:r>
-      <w:r>
-        <w:t xml:space="preserve">Body 11, Agility 8, Intellect 12, Presence 13, Will 11.</w:t>
-      </w:r>
-      <w:r>
-        <w:t xml:space="preserve"> </w:t>
-      </w:r>
-      <w:r>
-        <w:rPr>
-          <w:bCs/>
-          <w:b/>
-        </w:rPr>
-        <w:t xml:space="preserve">Dodge</w:t>
-      </w:r>
-      <w:r>
-        <w:t xml:space="preserve"> </w:t>
-      </w:r>
-      <w:r>
-        <w:t xml:space="preserve">6.</w:t>
+        <w:t xml:space="preserve">Cybernetics.</w:t>
+      </w:r>
+      <w:r>
+        <w:t xml:space="preserve"> </w:t>
+      </w:r>
+      <w:r>
+        <w:t xml:space="preserve">Implants replace limbs, sharpen senses and rewire reflexes. They show, they show up on scans, and they need parts, power and care: implant advantages say what they do, and the</w:t>
+      </w:r>
+      <w:r>
+        <w:t xml:space="preserve"> </w:t>
+      </w:r>
+      <w:r>
+        <w:rPr>
+          <w:iCs/>
+          <w:i/>
+        </w:rPr>
+        <w:t xml:space="preserve">Implant Upkeep</w:t>
+      </w:r>
+      <w:r>
+        <w:t xml:space="preserve"> </w:t>
+      </w:r>
+      <w:r>
+        <w:t xml:space="preserve">complication says what they cost.</w:t>
+      </w:r>
+      <w:r>
+        <w:t xml:space="preserve"> </w:t>
+      </w:r>
+      <w:r>
+        <w:rPr>
+          <w:bCs/>
+          <w:b/>
+        </w:rPr>
+        <w:t xml:space="preserve">Augments</w:t>
+      </w:r>
+      <w:r>
+        <w:t xml:space="preserve"> </w:t>
+      </w:r>
+      <w:r>
+        <w:t xml:space="preserve">live with many;</w:t>
+      </w:r>
+      <w:r>
+        <w:t xml:space="preserve"> </w:t>
+      </w:r>
+      <w:r>
+        <w:rPr>
+          <w:bCs/>
+          <w:b/>
+        </w:rPr>
+        <w:t xml:space="preserve">Cyberneticists</w:t>
+      </w:r>
+      <w:r>
+        <w:t xml:space="preserve"> </w:t>
+      </w:r>
+      <w:r>
+        <w:t xml:space="preserve">install and repair them.</w:t>
       </w:r>
     </w:p>
     <w:p>
@@ -26982,13 +26878,61 @@
           <w:bCs/>
           <w:b/>
         </w:rPr>
-        <w:t xml:space="preserve">Skills:</w:t>
-      </w:r>
-      <w:r>
-        <w:t xml:space="preserve"> </w:t>
-      </w:r>
-      <w:r>
-        <w:t xml:space="preserve">Commerce 15 (Specialty). Trained: Deception 14, Diplomacy 14, Leadership 14, Streetwise 14, Computers 13, Investigation 13, Navigation 13, Science 13, Psychology 12, Piloting 9.</w:t>
+        <w:t xml:space="preserve">AI.</w:t>
+      </w:r>
+      <w:r>
+        <w:t xml:space="preserve"> </w:t>
+      </w:r>
+      <w:r>
+        <w:t xml:space="preserve">Artificial minds run ships, stations and corporations, and some want to be free. An</w:t>
+      </w:r>
+      <w:r>
+        <w:t xml:space="preserve"> </w:t>
+      </w:r>
+      <w:r>
+        <w:rPr>
+          <w:bCs/>
+          <w:b/>
+        </w:rPr>
+        <w:t xml:space="preserve">AI partner</w:t>
+      </w:r>
+      <w:r>
+        <w:t xml:space="preserve"> </w:t>
+      </w:r>
+      <w:r>
+        <w:t xml:space="preserve">has a name and a personality, played by its partner or the GM; it can</w:t>
+      </w:r>
+      <w:r>
+        <w:t xml:space="preserve"> </w:t>
+      </w:r>
+      <w:r>
+        <w:rPr>
+          <w:bCs/>
+          <w:b/>
+        </w:rPr>
+        <w:t xml:space="preserve">assist</w:t>
+      </w:r>
+      <w:r>
+        <w:t xml:space="preserve"> </w:t>
+      </w:r>
+      <w:r>
+        <w:t xml:space="preserve">Computers, Sensors and Investigation rolls (success +1, success by 5 or more +2), and acts in the world only through a drone or a ship.</w:t>
+      </w:r>
+      <w:r>
+        <w:t xml:space="preserve"> </w:t>
+      </w:r>
+      <w:r>
+        <w:rPr>
+          <w:bCs/>
+          <w:b/>
+        </w:rPr>
+        <w:t xml:space="preserve">AI Minders</w:t>
+      </w:r>
+      <w:r>
+        <w:t xml:space="preserve"> </w:t>
+      </w:r>
+      <w:r>
+        <w:t xml:space="preserve">are bonded to one and trained to handle others, from corporate systems to rogue minds.</w:t>
       </w:r>
     </w:p>
     <w:p>
@@ -27004,13 +26948,13 @@
           <w:bCs/>
           <w:b/>
         </w:rPr>
-        <w:t xml:space="preserve">Edges:</w:t>
-      </w:r>
-      <w:r>
-        <w:t xml:space="preserve"> </w:t>
-      </w:r>
-      <w:r>
-        <w:t xml:space="preserve">Extra Trained skill, A friend; a friend: her grandfather’s old clerk, who still sends her the family’s secrets.</w:t>
+        <w:t xml:space="preserve">Drones.</w:t>
+      </w:r>
+      <w:r>
+        <w:t xml:space="preserve"> </w:t>
+      </w:r>
+      <w:r>
+        <w:t xml:space="preserve">Scout, repair and combat drones are everywhere. A drone relays what it senses; jamming its link or taking out its controller stops it.</w:t>
       </w:r>
     </w:p>
     <w:p>
@@ -27026,29 +26970,29 @@
           <w:bCs/>
           <w:b/>
         </w:rPr>
-        <w:t xml:space="preserve">Advantage:</w:t>
-      </w:r>
-      <w:r>
-        <w:t xml:space="preserve"> </w:t>
-      </w:r>
-      <w:r>
-        <w:t xml:space="preserve">Ledger Memory (species; companion: Bound by Contract).</w:t>
-      </w:r>
-      <w:r>
-        <w:t xml:space="preserve"> </w:t>
-      </w:r>
-      <w:r>
-        <w:rPr>
-          <w:bCs/>
-          <w:b/>
-        </w:rPr>
-        <w:t xml:space="preserve">Complication:</w:t>
-      </w:r>
-      <w:r>
-        <w:t xml:space="preserve"> </w:t>
-      </w:r>
-      <w:r>
-        <w:t xml:space="preserve">Exile; trigger: your people on the same station.</w:t>
+        <w:t xml:space="preserve">Biotech.</w:t>
+      </w:r>
+      <w:r>
+        <w:t xml:space="preserve"> </w:t>
+      </w:r>
+      <w:r>
+        <w:t xml:space="preserve">Gene-tailoring, cloned organs, engineered diseases and medical miracles, for those who can pay.</w:t>
+      </w:r>
+      <w:r>
+        <w:t xml:space="preserve"> </w:t>
+      </w:r>
+      <w:r>
+        <w:rPr>
+          <w:iCs/>
+          <w:i/>
+        </w:rPr>
+        <w:t xml:space="preserve">Gene-Tailored</w:t>
+      </w:r>
+      <w:r>
+        <w:t xml:space="preserve"> </w:t>
+      </w:r>
+      <w:r>
+        <w:t xml:space="preserve">characters resist disease and toxins.</w:t>
       </w:r>
     </w:p>
     <w:p>
@@ -27064,57 +27008,100 @@
           <w:bCs/>
           <w:b/>
         </w:rPr>
-        <w:t xml:space="preserve">Why I’m out here:</w:t>
-      </w:r>
-      <w:r>
-        <w:t xml:space="preserve"> </w:t>
-      </w:r>
-      <w:r>
-        <w:t xml:space="preserve">No empire, no creditor, no one owns me.</w:t>
-      </w:r>
-      <w:r>
-        <w:t xml:space="preserve"> </w:t>
-      </w:r>
-      <w:r>
-        <w:rPr>
-          <w:bCs/>
-          <w:b/>
-        </w:rPr>
-        <w:t xml:space="preserve">Connection:</w:t>
-      </w:r>
-      <w:r>
-        <w:t xml:space="preserve"> </w:t>
-      </w:r>
-      <w:r>
-        <w:t xml:space="preserve">She sold Mara Okonkwo the first debt Mara forgave. Neither regrets it.</w:t>
-      </w:r>
-    </w:p>
-    <w:bookmarkEnd w:id="156"/>
-    <w:bookmarkStart w:id="157" w:name="kesh-of-the-seventh-hive"/>
-    <w:p>
-      <w:pPr>
-        <w:pStyle w:val="Heading2"/>
-      </w:pPr>
-      <w:r>
-        <w:t xml:space="preserve">Kesh of the Seventh Hive</w:t>
-      </w:r>
-    </w:p>
-    <w:p>
-      <w:pPr>
-        <w:pStyle w:val="FirstParagraph"/>
-      </w:pPr>
+        <w:t xml:space="preserve">Ships.</w:t>
+      </w:r>
+      <w:r>
+        <w:t xml:space="preserve"> </w:t>
+      </w:r>
+      <w:r>
+        <w:t xml:space="preserve">Crews fly everything from patched freighters to corporate couriers. A ship is a home, a business and a</w:t>
+      </w:r>
+      <w:r>
+        <w:t xml:space="preserve"> </w:t>
+      </w:r>
+      <w:r>
+        <w:rPr>
+          <w:bCs/>
+          <w:b/>
+        </w:rPr>
+        <w:t xml:space="preserve">Debt</w:t>
+      </w:r>
+      <w:r>
+        <w:t xml:space="preserve">: the</w:t>
+      </w:r>
+      <w:r>
+        <w:t xml:space="preserve"> </w:t>
+      </w:r>
       <w:r>
         <w:rPr>
           <w:iCs/>
           <w:i/>
         </w:rPr>
-        <w:t xml:space="preserve">Market scout, Explorer. Kel (tier 1).</w:t>
-      </w:r>
-      <w:r>
-        <w:t xml:space="preserve"> </w:t>
-      </w:r>
-      <w:r>
-        <w:t xml:space="preserve">Scouts new markets to pay down her homeworld’s debt, and wonders more each year whether the radicals are right.</w:t>
+        <w:t xml:space="preserve">A Ship of Your Own</w:t>
+      </w:r>
+      <w:r>
+        <w:t xml:space="preserve"> </w:t>
+      </w:r>
+      <w:r>
+        <w:t xml:space="preserve">advantage starts the crew with a ship and a box of Debt. Ship fights use</w:t>
+      </w:r>
+      <w:r>
+        <w:t xml:space="preserve"> </w:t>
+      </w:r>
+      <w:r>
+        <w:rPr>
+          <w:iCs/>
+          <w:i/>
+        </w:rPr>
+        <w:t xml:space="preserve">Ships in a fight</w:t>
+      </w:r>
+      <w:r>
+        <w:t xml:space="preserve">: the range contest, a roll per station and the Hull track.</w:t>
+      </w:r>
+    </w:p>
+    <w:bookmarkEnd w:id="156"/>
+    <w:bookmarkStart w:id="164" w:name="ready-made-characters"/>
+    <w:p>
+      <w:pPr>
+        <w:pStyle w:val="Heading1"/>
+      </w:pPr>
+      <w:r>
+        <w:t xml:space="preserve">Ready-made characters</w:t>
+      </w:r>
+    </w:p>
+    <w:p>
+      <w:pPr>
+        <w:pStyle w:val="FirstParagraph"/>
+      </w:pPr>
+      <w:r>
+        <w:t xml:space="preserve">Characters ready to play, for one-shots, new players, or a group in a hurry. Each follows the creation rules exactly, and their connections tie them together. In the creator, choose one from the ready-made list to open it and make it your own.</w:t>
+      </w:r>
+    </w:p>
+    <w:bookmarkStart w:id="157" w:name="thessk-varo-hun"/>
+    <w:p>
+      <w:pPr>
+        <w:pStyle w:val="Heading2"/>
+      </w:pPr>
+      <w:r>
+        <w:t xml:space="preserve">Thessk Varo-Hun</w:t>
+      </w:r>
+    </w:p>
+    <w:p>
+      <w:pPr>
+        <w:pStyle w:val="FirstParagraph"/>
+      </w:pPr>
+      <w:r>
+        <w:rPr>
+          <w:iCs/>
+          <w:i/>
+        </w:rPr>
+        <w:t xml:space="preserve">Trader, disowned, Trader. Tessan (tier 1).</w:t>
+      </w:r>
+      <w:r>
+        <w:t xml:space="preserve"> </w:t>
+      </w:r>
+      <w:r>
+        <w:t xml:space="preserve">A young reformer cut off by her dynasty’s old creditors for writing off a client world’s debt. She trades on her own now, and keeps her word.</w:t>
       </w:r>
     </w:p>
     <w:p>
@@ -27136,7 +27123,7 @@
         <w:t xml:space="preserve"> </w:t>
       </w:r>
       <w:r>
-        <w:t xml:space="preserve">Body 10, Agility 11, Intellect 13, Presence 8, Will 13.</w:t>
+        <w:t xml:space="preserve">Body 11, Agility 8, Intellect 12, Presence 13, Will 11.</w:t>
       </w:r>
       <w:r>
         <w:t xml:space="preserve"> </w:t>
@@ -27152,7 +27139,7 @@
         <w:t xml:space="preserve"> </w:t>
       </w:r>
       <w:r>
-        <w:t xml:space="preserve">10.</w:t>
+        <w:t xml:space="preserve">6.</w:t>
       </w:r>
     </w:p>
     <w:p>
@@ -27174,7 +27161,7 @@
         <w:t xml:space="preserve"> </w:t>
       </w:r>
       <w:r>
-        <w:t xml:space="preserve">Navigation 16 (Specialty). Trained: Commerce 14, Computers 14, Engineering 14, Investigation 14, Science 14, Sensors 14, Survival 14, Piloting 12, Athletics 11.</w:t>
+        <w:t xml:space="preserve">Commerce 15 (Specialty). Trained: Deception 14, Diplomacy 14, Leadership 14, Streetwise 14, Computers 13, Investigation 13, Navigation 13, Science 13, Psychology 12, Piloting 9.</w:t>
       </w:r>
     </w:p>
     <w:p>
@@ -27196,7 +27183,7 @@
         <w:t xml:space="preserve"> </w:t>
       </w:r>
       <w:r>
-        <w:t xml:space="preserve">Extra Resolve, A fine weapon or tool; a fine tool: a hive-made survey kit (+2 to Sensors for surveying a world: minerals, water and life signs).</w:t>
+        <w:t xml:space="preserve">Extra Trained skill, A friend; a friend: her grandfather’s old clerk, who still sends her the family’s secrets.</w:t>
       </w:r>
     </w:p>
     <w:p>
@@ -27218,7 +27205,7 @@
         <w:t xml:space="preserve"> </w:t>
       </w:r>
       <w:r>
-        <w:t xml:space="preserve">Debt-Born (species; companion: The Homeworld’s Debt).</w:t>
+        <w:t xml:space="preserve">Ledger Memory (species; companion: Bound by Contract).</w:t>
       </w:r>
       <w:r>
         <w:t xml:space="preserve"> </w:t>
@@ -27234,7 +27221,7 @@
         <w:t xml:space="preserve"> </w:t>
       </w:r>
       <w:r>
-        <w:t xml:space="preserve">Debt-Bound; trigger: a creditor offers to forgive it for a favor.</w:t>
+        <w:t xml:space="preserve">Exile; trigger: your people on the same station.</w:t>
       </w:r>
     </w:p>
     <w:p>
@@ -27256,7 +27243,7 @@
         <w:t xml:space="preserve"> </w:t>
       </w:r>
       <w:r>
-        <w:t xml:space="preserve">I owe more than I can ever repay, unless I take every job.</w:t>
+        <w:t xml:space="preserve">No empire, no creditor, no one owns me.</w:t>
       </w:r>
       <w:r>
         <w:t xml:space="preserve"> </w:t>
@@ -27272,17 +27259,17 @@
         <w:t xml:space="preserve"> </w:t>
       </w:r>
       <w:r>
-        <w:t xml:space="preserve">Ilvi Saradh’s AI found the corridor Kesh’s hive needed; Kesh owes them both.</w:t>
+        <w:t xml:space="preserve">She sold Mara Okonkwo the first debt Mara forgave. Neither regrets it.</w:t>
       </w:r>
     </w:p>
     <w:bookmarkEnd w:id="157"/>
-    <w:bookmarkStart w:id="158" w:name="rook"/>
+    <w:bookmarkStart w:id="158" w:name="kesh-of-the-seventh-hive"/>
     <w:p>
       <w:pPr>
         <w:pStyle w:val="Heading2"/>
       </w:pPr>
       <w:r>
-        <w:t xml:space="preserve">Rook</w:t>
+        <w:t xml:space="preserve">Kesh of the Seventh Hive</w:t>
       </w:r>
     </w:p>
     <w:p>
@@ -27294,13 +27281,13 @@
           <w:iCs/>
           <w:i/>
         </w:rPr>
-        <w:t xml:space="preserve">Former Concord marine, Augment. Human (tier 0); Expert.</w:t>
-      </w:r>
-      <w:r>
-        <w:t xml:space="preserve"> </w:t>
-      </w:r>
-      <w:r>
-        <w:t xml:space="preserve">Rebuilt after the Zhaq border war with a cyber-arm and reflex wiring. The implant payments are overdue, and the company that made them knows where Rook drinks.</w:t>
+        <w:t xml:space="preserve">Market scout, Explorer. Kel (tier 1).</w:t>
+      </w:r>
+      <w:r>
+        <w:t xml:space="preserve"> </w:t>
+      </w:r>
+      <w:r>
+        <w:t xml:space="preserve">Scouts new markets to pay down her homeworld’s debt, and wonders more each year whether the radicals are right.</w:t>
       </w:r>
     </w:p>
     <w:p>
@@ -27322,7 +27309,7 @@
         <w:t xml:space="preserve"> </w:t>
       </w:r>
       <w:r>
-        <w:t xml:space="preserve">Body 13, Agility 13, Intellect 10, Presence 10, Will 10.</w:t>
+        <w:t xml:space="preserve">Body 10, Agility 11, Intellect 13, Presence 8, Will 13.</w:t>
       </w:r>
       <w:r>
         <w:t xml:space="preserve"> </w:t>
@@ -27338,7 +27325,7 @@
         <w:t xml:space="preserve"> </w:t>
       </w:r>
       <w:r>
-        <w:t xml:space="preserve">12.</w:t>
+        <w:t xml:space="preserve">10.</w:t>
       </w:r>
     </w:p>
     <w:p>
@@ -27360,7 +27347,7 @@
         <w:t xml:space="preserve"> </w:t>
       </w:r>
       <w:r>
-        <w:t xml:space="preserve">Close Combat 18 (Expert). Trained: Athletics 14, Firearms 14, Stealth 14, Engineering 11, Medicine 11, Streetwise 11, Survival 11.</w:t>
+        <w:t xml:space="preserve">Navigation 16 (Specialty). Trained: Commerce 14, Computers 14, Engineering 14, Investigation 14, Science 14, Sensors 14, Survival 14, Piloting 12, Athletics 11.</w:t>
       </w:r>
     </w:p>
     <w:p>
@@ -27382,7 +27369,7 @@
         <w:t xml:space="preserve"> </w:t>
       </w:r>
       <w:r>
-        <w:t xml:space="preserve">+1 attribute point, Extra Resolve, Second advantage; second advantage: Implant: Reflex Wiring.</w:t>
+        <w:t xml:space="preserve">Extra Resolve, A fine weapon or tool; a fine tool: a hive-made survey kit (+2 to Sensors for surveying a world: minerals, water and life signs).</w:t>
       </w:r>
     </w:p>
     <w:p>
@@ -27404,7 +27391,7 @@
         <w:t xml:space="preserve"> </w:t>
       </w:r>
       <w:r>
-        <w:t xml:space="preserve">Implant: Cyber-Limb.</w:t>
+        <w:t xml:space="preserve">Debt-Born (species; companion: The Homeworld’s Debt).</w:t>
       </w:r>
       <w:r>
         <w:t xml:space="preserve"> </w:t>
@@ -27420,7 +27407,7 @@
         <w:t xml:space="preserve"> </w:t>
       </w:r>
       <w:r>
-        <w:t xml:space="preserve">Implant Upkeep; trigger: your supplier wants more.</w:t>
+        <w:t xml:space="preserve">Debt-Bound; trigger: a creditor offers to forgive it for a favor.</w:t>
       </w:r>
     </w:p>
     <w:p>
@@ -27442,7 +27429,7 @@
         <w:t xml:space="preserve"> </w:t>
       </w:r>
       <w:r>
-        <w:t xml:space="preserve">I can’t go home. The crew is home now.</w:t>
+        <w:t xml:space="preserve">I owe more than I can ever repay, unless I take every job.</w:t>
       </w:r>
       <w:r>
         <w:t xml:space="preserve"> </w:t>
@@ -27458,17 +27445,17 @@
         <w:t xml:space="preserve"> </w:t>
       </w:r>
       <w:r>
-        <w:t xml:space="preserve">Brakka was on the other side of that border war. They found out over a drink, and stayed friends.</w:t>
+        <w:t xml:space="preserve">Ilvi Saradh’s AI found the corridor Kesh’s hive needed; Kesh owes them both.</w:t>
       </w:r>
     </w:p>
     <w:bookmarkEnd w:id="158"/>
-    <w:bookmarkStart w:id="159" w:name="ilvi-saradh"/>
+    <w:bookmarkStart w:id="159" w:name="rook"/>
     <w:p>
       <w:pPr>
         <w:pStyle w:val="Heading2"/>
       </w:pPr>
       <w:r>
-        <w:t xml:space="preserve">Ilvi Saradh</w:t>
+        <w:t xml:space="preserve">Rook</w:t>
       </w:r>
     </w:p>
     <w:p>
@@ -27480,13 +27467,13 @@
           <w:iCs/>
           <w:i/>
         </w:rPr>
-        <w:t xml:space="preserve">Guild navigator, AI Minder. Draelin (tier 1).</w:t>
-      </w:r>
-      <w:r>
-        <w:t xml:space="preserve"> </w:t>
-      </w:r>
-      <w:r>
-        <w:t xml:space="preserve">A guild navigator whose AI partner, Quill, remembers a corridor the guild says doesn’t exist.</w:t>
+        <w:t xml:space="preserve">Former Concord marine, Augment. Human (tier 0); Expert.</w:t>
+      </w:r>
+      <w:r>
+        <w:t xml:space="preserve"> </w:t>
+      </w:r>
+      <w:r>
+        <w:t xml:space="preserve">Rebuilt after the Zhaq border war with a cyber-arm and reflex wiring. The implant payments are overdue, and the company that made them knows where Rook drinks.</w:t>
       </w:r>
     </w:p>
     <w:p>
@@ -27508,7 +27495,7 @@
         <w:t xml:space="preserve"> </w:t>
       </w:r>
       <w:r>
-        <w:t xml:space="preserve">Body 9, Agility 12, Intellect 13, Presence 11, Will 10.</w:t>
+        <w:t xml:space="preserve">Body 13, Agility 13, Intellect 10, Presence 10, Will 10.</w:t>
       </w:r>
       <w:r>
         <w:t xml:space="preserve"> </w:t>
@@ -27524,7 +27511,7 @@
         <w:t xml:space="preserve"> </w:t>
       </w:r>
       <w:r>
-        <w:t xml:space="preserve">11.</w:t>
+        <w:t xml:space="preserve">12.</w:t>
       </w:r>
     </w:p>
     <w:p>
@@ -27546,7 +27533,7 @@
         <w:t xml:space="preserve"> </w:t>
       </w:r>
       <w:r>
-        <w:t xml:space="preserve">Computers 16 (Specialty). Trained: Commerce 14, Engineering 14, Investigation 14, Science 14, Sensors 14, Piloting 13, Stealth 13, Diplomacy 12, Psychology 11, Athletics 10; Navigation 14 (free).</w:t>
+        <w:t xml:space="preserve">Close Combat 18 (Expert). Trained: Athletics 14, Firearms 14, Stealth 14, Engineering 11, Medicine 11, Streetwise 11, Survival 11.</w:t>
       </w:r>
     </w:p>
     <w:p>
@@ -27568,7 +27555,7 @@
         <w:t xml:space="preserve"> </w:t>
       </w:r>
       <w:r>
-        <w:t xml:space="preserve">Extra Trained skill, A fine weapon or tool; a fine tool: Quill’s core, a guild-grade AI (+2 to Computers for breaking old guild encryption and recovering lost navigation data).</w:t>
+        <w:t xml:space="preserve">+1 attribute point, Extra Resolve, Second advantage; second advantage: Implant: Reflex Wiring.</w:t>
       </w:r>
     </w:p>
     <w:p>
@@ -27590,7 +27577,7 @@
         <w:t xml:space="preserve"> </w:t>
       </w:r>
       <w:r>
-        <w:t xml:space="preserve">Corridor Sense.</w:t>
+        <w:t xml:space="preserve">Implant: Cyber-Limb.</w:t>
       </w:r>
       <w:r>
         <w:t xml:space="preserve"> </w:t>
@@ -27606,7 +27593,7 @@
         <w:t xml:space="preserve"> </w:t>
       </w:r>
       <w:r>
-        <w:t xml:space="preserve">Dangerous Knowledge; trigger: someone close to the truth.</w:t>
+        <w:t xml:space="preserve">Implant Upkeep; trigger: your supplier wants more.</w:t>
       </w:r>
     </w:p>
     <w:p>
@@ -27628,7 +27615,7 @@
         <w:t xml:space="preserve"> </w:t>
       </w:r>
       <w:r>
-        <w:t xml:space="preserve">The galaxy is full of things no one understands yet. I want to be first.</w:t>
+        <w:t xml:space="preserve">I can’t go home. The crew is home now.</w:t>
       </w:r>
       <w:r>
         <w:t xml:space="preserve"> </w:t>
@@ -27644,17 +27631,17 @@
         <w:t xml:space="preserve"> </w:t>
       </w:r>
       <w:r>
-        <w:t xml:space="preserve">Quill found the corridor Kesh’s hive needed. Ilvi never told the guild.</w:t>
+        <w:t xml:space="preserve">Brakka was on the other side of that border war. They found out over a drink, and stayed friends.</w:t>
       </w:r>
     </w:p>
     <w:bookmarkEnd w:id="159"/>
-    <w:bookmarkStart w:id="160" w:name="dr.-anwe-tal"/>
+    <w:bookmarkStart w:id="160" w:name="ilvi-saradh"/>
     <w:p>
       <w:pPr>
         <w:pStyle w:val="Heading2"/>
       </w:pPr>
       <w:r>
-        <w:t xml:space="preserve">Dr. Anwe Tal</w:t>
+        <w:t xml:space="preserve">Ilvi Saradh</w:t>
       </w:r>
     </w:p>
     <w:p>
@@ -27666,13 +27653,13 @@
           <w:iCs/>
           <w:i/>
         </w:rPr>
-        <w:t xml:space="preserve">Restoration ecologist, Scientist. Corvani (tier 1).</w:t>
-      </w:r>
-      <w:r>
-        <w:t xml:space="preserve"> </w:t>
-      </w:r>
-      <w:r>
-        <w:t xml:space="preserve">Rebuilding a world the Hegemony strip-mined, against a mining corporation’s lawyers and, lately, its guns.</w:t>
+        <w:t xml:space="preserve">Guild navigator, AI Minder. Draelin (tier 1).</w:t>
+      </w:r>
+      <w:r>
+        <w:t xml:space="preserve"> </w:t>
+      </w:r>
+      <w:r>
+        <w:t xml:space="preserve">A guild navigator whose AI partner, Quill, remembers a corridor the guild says doesn’t exist.</w:t>
       </w:r>
     </w:p>
     <w:p>
@@ -27694,7 +27681,7 @@
         <w:t xml:space="preserve"> </w:t>
       </w:r>
       <w:r>
-        <w:t xml:space="preserve">Body 11, Agility 9, Intellect 13, Presence 10, Will 13.</w:t>
+        <w:t xml:space="preserve">Body 9, Agility 12, Intellect 13, Presence 11, Will 10.</w:t>
       </w:r>
       <w:r>
         <w:t xml:space="preserve"> </w:t>
@@ -27710,7 +27697,7 @@
         <w:t xml:space="preserve"> </w:t>
       </w:r>
       <w:r>
-        <w:t xml:space="preserve">8.</w:t>
+        <w:t xml:space="preserve">11.</w:t>
       </w:r>
     </w:p>
     <w:p>
@@ -27732,7 +27719,7 @@
         <w:t xml:space="preserve"> </w:t>
       </w:r>
       <w:r>
-        <w:t xml:space="preserve">Science 16 (Specialty). Trained: Computers 14, Engineering 14, Investigation 14, Medicine 14, Psychology 14, Sensors 14, Survival 14, Athletics 12, Diplomacy 11.</w:t>
+        <w:t xml:space="preserve">Computers 16 (Specialty). Trained: Commerce 14, Engineering 14, Investigation 14, Science 14, Sensors 14, Piloting 13, Stealth 13, Diplomacy 12, Psychology 11, Athletics 10; Navigation 14 (free).</w:t>
       </w:r>
     </w:p>
     <w:p>
@@ -27754,7 +27741,7 @@
         <w:t xml:space="preserve"> </w:t>
       </w:r>
       <w:r>
-        <w:t xml:space="preserve">+1 attribute point, A friend; a friend: a Veyari archivist who keeps the old survey records of her world.</w:t>
+        <w:t xml:space="preserve">Extra Trained skill, A fine weapon or tool; a fine tool: Quill’s core, a guild-grade AI (+2 to Computers for breaking old guild encryption and recovering lost navigation data).</w:t>
       </w:r>
     </w:p>
     <w:p>
@@ -27776,7 +27763,7 @@
         <w:t xml:space="preserve"> </w:t>
       </w:r>
       <w:r>
-        <w:t xml:space="preserve">Restorer (species; companion: Ecological Safeguards).</w:t>
+        <w:t xml:space="preserve">Corridor Sense.</w:t>
       </w:r>
       <w:r>
         <w:t xml:space="preserve"> </w:t>
@@ -27792,7 +27779,7 @@
         <w:t xml:space="preserve"> </w:t>
       </w:r>
       <w:r>
-        <w:t xml:space="preserve">Protects Others; trigger: a civilian in the crossfire.</w:t>
+        <w:t xml:space="preserve">Dangerous Knowledge; trigger: someone close to the truth.</w:t>
       </w:r>
     </w:p>
     <w:p>
@@ -27814,7 +27801,7 @@
         <w:t xml:space="preserve"> </w:t>
       </w:r>
       <w:r>
-        <w:t xml:space="preserve">People out here need help, and I can give it.</w:t>
+        <w:t xml:space="preserve">The galaxy is full of things no one understands yet. I want to be first.</w:t>
       </w:r>
       <w:r>
         <w:t xml:space="preserve"> </w:t>
@@ -27830,17 +27817,17 @@
         <w:t xml:space="preserve"> </w:t>
       </w:r>
       <w:r>
-        <w:t xml:space="preserve">Sable cleaned up the corporation’s files that proved Anwe’s case, and asked nothing for it.</w:t>
+        <w:t xml:space="preserve">Quill found the corridor Kesh’s hive needed. Ilvi never told the guild.</w:t>
       </w:r>
     </w:p>
     <w:bookmarkEnd w:id="160"/>
-    <w:bookmarkStart w:id="161" w:name="brakka"/>
+    <w:bookmarkStart w:id="161" w:name="dr.-anwe-tal"/>
     <w:p>
       <w:pPr>
         <w:pStyle w:val="Heading2"/>
       </w:pPr>
       <w:r>
-        <w:t xml:space="preserve">Brakka</w:t>
+        <w:t xml:space="preserve">Dr. Anwe Tal</w:t>
       </w:r>
     </w:p>
     <w:p>
@@ -27852,13 +27839,13 @@
           <w:iCs/>
           <w:i/>
         </w:rPr>
-        <w:t xml:space="preserve">Deserter, Ninth Legion, Mercenary. Dresh (tier 2).</w:t>
-      </w:r>
-      <w:r>
-        <w:t xml:space="preserve"> </w:t>
-      </w:r>
-      <w:r>
-        <w:t xml:space="preserve">A legionary who deserted rather than burn a Zhaq city. The Hegemony wants him back, or dead.</w:t>
+        <w:t xml:space="preserve">Restoration ecologist, Scientist. Corvani (tier 1).</w:t>
+      </w:r>
+      <w:r>
+        <w:t xml:space="preserve"> </w:t>
+      </w:r>
+      <w:r>
+        <w:t xml:space="preserve">Rebuilding a world the Hegemony strip-mined, against a mining corporation’s lawyers and, lately, its guns.</w:t>
       </w:r>
     </w:p>
     <w:p>
@@ -27880,7 +27867,7 @@
         <w:t xml:space="preserve"> </w:t>
       </w:r>
       <w:r>
-        <w:t xml:space="preserve">Body 15, Agility 11, Intellect 9, Presence 10, Will 10.</w:t>
+        <w:t xml:space="preserve">Body 11, Agility 9, Intellect 13, Presence 10, Will 13.</w:t>
       </w:r>
       <w:r>
         <w:t xml:space="preserve"> </w:t>
@@ -27896,7 +27883,7 @@
         <w:t xml:space="preserve"> </w:t>
       </w:r>
       <w:r>
-        <w:t xml:space="preserve">10.</w:t>
+        <w:t xml:space="preserve">8.</w:t>
       </w:r>
     </w:p>
     <w:p>
@@ -27918,7 +27905,7 @@
         <w:t xml:space="preserve"> </w:t>
       </w:r>
       <w:r>
-        <w:t xml:space="preserve">Firearms 14 (Specialty). Trained: Athletics 16, Close Combat 16, Piloting 12, Stealth 12, Leadership 11, Survival 11, Engineering 10, Medicine 10, Sensors 10.</w:t>
+        <w:t xml:space="preserve">Science 16 (Specialty). Trained: Computers 14, Engineering 14, Investigation 14, Medicine 14, Psychology 14, Sensors 14, Survival 14, Athletics 12, Diplomacy 11.</w:t>
       </w:r>
     </w:p>
     <w:p>
@@ -27940,7 +27927,7 @@
         <w:t xml:space="preserve"> </w:t>
       </w:r>
       <w:r>
-        <w:t xml:space="preserve">Extra Resolve.</w:t>
+        <w:t xml:space="preserve">+1 attribute point, A friend; a friend: a Veyari archivist who keeps the old survey records of her world.</w:t>
       </w:r>
     </w:p>
     <w:p>
@@ -27962,7 +27949,7 @@
         <w:t xml:space="preserve"> </w:t>
       </w:r>
       <w:r>
-        <w:t xml:space="preserve">Legion Drill (species; companion: Whose Soldier?).</w:t>
+        <w:t xml:space="preserve">Restorer (species; companion: Ecological Safeguards).</w:t>
       </w:r>
       <w:r>
         <w:t xml:space="preserve"> </w:t>
@@ -27978,7 +27965,7 @@
         <w:t xml:space="preserve"> </w:t>
       </w:r>
       <w:r>
-        <w:t xml:space="preserve">Hegemony Bounty; trigger: a hunter in the next berth.</w:t>
+        <w:t xml:space="preserve">Protects Others; trigger: a civilian in the crossfire.</w:t>
       </w:r>
     </w:p>
     <w:p>
@@ -28000,7 +27987,7 @@
         <w:t xml:space="preserve"> </w:t>
       </w:r>
       <w:r>
-        <w:t xml:space="preserve">Someone took everything from me. I’ll find them.</w:t>
+        <w:t xml:space="preserve">People out here need help, and I can give it.</w:t>
       </w:r>
       <w:r>
         <w:t xml:space="preserve"> </w:t>
@@ -28016,17 +28003,17 @@
         <w:t xml:space="preserve"> </w:t>
       </w:r>
       <w:r>
-        <w:t xml:space="preserve">Rook fought him across the Zhaq border once. Now Rook watches his back.</w:t>
+        <w:t xml:space="preserve">Sable cleaned up the corporation’s files that proved Anwe’s case, and asked nothing for it.</w:t>
       </w:r>
     </w:p>
     <w:bookmarkEnd w:id="161"/>
-    <w:bookmarkStart w:id="162" w:name="sable"/>
+    <w:bookmarkStart w:id="162" w:name="brakka"/>
     <w:p>
       <w:pPr>
         <w:pStyle w:val="Heading2"/>
       </w:pPr>
       <w:r>
-        <w:t xml:space="preserve">Sable</w:t>
+        <w:t xml:space="preserve">Brakka</w:t>
       </w:r>
     </w:p>
     <w:p>
@@ -28038,13 +28025,13 @@
           <w:iCs/>
           <w:i/>
         </w:rPr>
-        <w:t xml:space="preserve">Freelance intrusion specialist, Hacker. Human (tier 0).</w:t>
-      </w:r>
-      <w:r>
-        <w:t xml:space="preserve"> </w:t>
-      </w:r>
-      <w:r>
-        <w:t xml:space="preserve">Breaks into any system for the right price. Secretly psionic, hidden by the Quiet Network; every checkpoint is a gamble.</w:t>
+        <w:t xml:space="preserve">Deserter, Ninth Legion, Mercenary. Dresh (tier 2).</w:t>
+      </w:r>
+      <w:r>
+        <w:t xml:space="preserve"> </w:t>
+      </w:r>
+      <w:r>
+        <w:t xml:space="preserve">A legionary who deserted rather than burn a Zhaq city. The Hegemony wants him back, or dead.</w:t>
       </w:r>
     </w:p>
     <w:p>
@@ -28066,7 +28053,7 @@
         <w:t xml:space="preserve"> </w:t>
       </w:r>
       <w:r>
-        <w:t xml:space="preserve">Body 10, Agility 12, Intellect 13, Presence 10, Will 11.</w:t>
+        <w:t xml:space="preserve">Body 15, Agility 11, Intellect 9, Presence 10, Will 10.</w:t>
       </w:r>
       <w:r>
         <w:t xml:space="preserve"> </w:t>
@@ -28082,7 +28069,7 @@
         <w:t xml:space="preserve"> </w:t>
       </w:r>
       <w:r>
-        <w:t xml:space="preserve">11.</w:t>
+        <w:t xml:space="preserve">10.</w:t>
       </w:r>
     </w:p>
     <w:p>
@@ -28104,7 +28091,7 @@
         <w:t xml:space="preserve"> </w:t>
       </w:r>
       <w:r>
-        <w:t xml:space="preserve">Computers 16 (Specialty). Trained: Engineering 14, Investigation 14, Sensors 14, Firearms 13, Stealth 13, Psionics 12, Psychology 12, Athletics 11, Deception 11, Streetwise 11.</w:t>
+        <w:t xml:space="preserve">Firearms 14 (Specialty). Trained: Athletics 16, Close Combat 16, Piloting 12, Stealth 12, Leadership 11, Survival 11, Engineering 10, Medicine 10, Sensors 10.</w:t>
       </w:r>
     </w:p>
     <w:p>
@@ -28126,7 +28113,7 @@
         <w:t xml:space="preserve"> </w:t>
       </w:r>
       <w:r>
-        <w:t xml:space="preserve">Extra Trained skill, +1 attribute point, A friend; a friend: a Quiet Network forger who keeps Sable’s test results clean.</w:t>
+        <w:t xml:space="preserve">Extra Resolve.</w:t>
       </w:r>
     </w:p>
     <w:p>
@@ -28148,7 +28135,7 @@
         <w:t xml:space="preserve"> </w:t>
       </w:r>
       <w:r>
-        <w:t xml:space="preserve">Psionic.</w:t>
+        <w:t xml:space="preserve">Legion Drill (species; companion: Whose Soldier?).</w:t>
       </w:r>
       <w:r>
         <w:t xml:space="preserve"> </w:t>
@@ -28164,7 +28151,7 @@
         <w:t xml:space="preserve"> </w:t>
       </w:r>
       <w:r>
-        <w:t xml:space="preserve">Unregistered; trigger: a Mandate screening at the corridor gate.</w:t>
+        <w:t xml:space="preserve">Hegemony Bounty; trigger: a hunter in the next berth.</w:t>
       </w:r>
     </w:p>
     <w:p>
@@ -28186,6 +28173,192 @@
         <w:t xml:space="preserve"> </w:t>
       </w:r>
       <w:r>
+        <w:t xml:space="preserve">Someone took everything from me. I’ll find them.</w:t>
+      </w:r>
+      <w:r>
+        <w:t xml:space="preserve"> </w:t>
+      </w:r>
+      <w:r>
+        <w:rPr>
+          <w:bCs/>
+          <w:b/>
+        </w:rPr>
+        <w:t xml:space="preserve">Connection:</w:t>
+      </w:r>
+      <w:r>
+        <w:t xml:space="preserve"> </w:t>
+      </w:r>
+      <w:r>
+        <w:t xml:space="preserve">Rook fought him across the Zhaq border once. Now Rook watches his back.</w:t>
+      </w:r>
+    </w:p>
+    <w:bookmarkEnd w:id="162"/>
+    <w:bookmarkStart w:id="163" w:name="sable"/>
+    <w:p>
+      <w:pPr>
+        <w:pStyle w:val="Heading2"/>
+      </w:pPr>
+      <w:r>
+        <w:t xml:space="preserve">Sable</w:t>
+      </w:r>
+    </w:p>
+    <w:p>
+      <w:pPr>
+        <w:pStyle w:val="FirstParagraph"/>
+      </w:pPr>
+      <w:r>
+        <w:rPr>
+          <w:iCs/>
+          <w:i/>
+        </w:rPr>
+        <w:t xml:space="preserve">Freelance intrusion specialist, Hacker. Human (tier 0).</w:t>
+      </w:r>
+      <w:r>
+        <w:t xml:space="preserve"> </w:t>
+      </w:r>
+      <w:r>
+        <w:t xml:space="preserve">Breaks into any system for the right price. Secretly psionic, hidden by the Quiet Network; every checkpoint is a gamble.</w:t>
+      </w:r>
+    </w:p>
+    <w:p>
+      <w:pPr>
+        <w:numPr>
+          <w:ilvl w:val="0"/>
+          <w:numId w:val="1047"/>
+        </w:numPr>
+        <w:pStyle w:val="Compact"/>
+      </w:pPr>
+      <w:r>
+        <w:rPr>
+          <w:bCs/>
+          <w:b/>
+        </w:rPr>
+        <w:t xml:space="preserve">Attributes:</w:t>
+      </w:r>
+      <w:r>
+        <w:t xml:space="preserve"> </w:t>
+      </w:r>
+      <w:r>
+        <w:t xml:space="preserve">Body 10, Agility 12, Intellect 13, Presence 10, Will 11.</w:t>
+      </w:r>
+      <w:r>
+        <w:t xml:space="preserve"> </w:t>
+      </w:r>
+      <w:r>
+        <w:rPr>
+          <w:bCs/>
+          <w:b/>
+        </w:rPr>
+        <w:t xml:space="preserve">Dodge</w:t>
+      </w:r>
+      <w:r>
+        <w:t xml:space="preserve"> </w:t>
+      </w:r>
+      <w:r>
+        <w:t xml:space="preserve">11.</w:t>
+      </w:r>
+    </w:p>
+    <w:p>
+      <w:pPr>
+        <w:numPr>
+          <w:ilvl w:val="0"/>
+          <w:numId w:val="1047"/>
+        </w:numPr>
+        <w:pStyle w:val="Compact"/>
+      </w:pPr>
+      <w:r>
+        <w:rPr>
+          <w:bCs/>
+          <w:b/>
+        </w:rPr>
+        <w:t xml:space="preserve">Skills:</w:t>
+      </w:r>
+      <w:r>
+        <w:t xml:space="preserve"> </w:t>
+      </w:r>
+      <w:r>
+        <w:t xml:space="preserve">Computers 16 (Specialty). Trained: Engineering 14, Investigation 14, Sensors 14, Firearms 13, Stealth 13, Psionics 12, Psychology 12, Athletics 11, Deception 11, Streetwise 11.</w:t>
+      </w:r>
+    </w:p>
+    <w:p>
+      <w:pPr>
+        <w:numPr>
+          <w:ilvl w:val="0"/>
+          <w:numId w:val="1047"/>
+        </w:numPr>
+        <w:pStyle w:val="Compact"/>
+      </w:pPr>
+      <w:r>
+        <w:rPr>
+          <w:bCs/>
+          <w:b/>
+        </w:rPr>
+        <w:t xml:space="preserve">Edges:</w:t>
+      </w:r>
+      <w:r>
+        <w:t xml:space="preserve"> </w:t>
+      </w:r>
+      <w:r>
+        <w:t xml:space="preserve">Extra Trained skill, +1 attribute point, A friend; a friend: a Quiet Network forger who keeps Sable’s test results clean.</w:t>
+      </w:r>
+    </w:p>
+    <w:p>
+      <w:pPr>
+        <w:numPr>
+          <w:ilvl w:val="0"/>
+          <w:numId w:val="1047"/>
+        </w:numPr>
+        <w:pStyle w:val="Compact"/>
+      </w:pPr>
+      <w:r>
+        <w:rPr>
+          <w:bCs/>
+          <w:b/>
+        </w:rPr>
+        <w:t xml:space="preserve">Advantage:</w:t>
+      </w:r>
+      <w:r>
+        <w:t xml:space="preserve"> </w:t>
+      </w:r>
+      <w:r>
+        <w:t xml:space="preserve">Psionic.</w:t>
+      </w:r>
+      <w:r>
+        <w:t xml:space="preserve"> </w:t>
+      </w:r>
+      <w:r>
+        <w:rPr>
+          <w:bCs/>
+          <w:b/>
+        </w:rPr>
+        <w:t xml:space="preserve">Complication:</w:t>
+      </w:r>
+      <w:r>
+        <w:t xml:space="preserve"> </w:t>
+      </w:r>
+      <w:r>
+        <w:t xml:space="preserve">Unregistered; trigger: a Mandate screening at the corridor gate.</w:t>
+      </w:r>
+    </w:p>
+    <w:p>
+      <w:pPr>
+        <w:numPr>
+          <w:ilvl w:val="0"/>
+          <w:numId w:val="1047"/>
+        </w:numPr>
+        <w:pStyle w:val="Compact"/>
+      </w:pPr>
+      <w:r>
+        <w:rPr>
+          <w:bCs/>
+          <w:b/>
+        </w:rPr>
+        <w:t xml:space="preserve">Why I’m out here:</w:t>
+      </w:r>
+      <w:r>
+        <w:t xml:space="preserve"> </w:t>
+      </w:r>
+      <w:r>
         <w:t xml:space="preserve">No empire, no creditor, no one owns me.</w:t>
       </w:r>
       <w:r>
@@ -28205,9 +28378,9 @@
         <w:t xml:space="preserve">Sable cleaned up the files that proved Dr. Anwe Tal’s case, for nothing. Anwe wonders why.</w:t>
       </w:r>
     </w:p>
-    <w:bookmarkEnd w:id="162"/>
     <w:bookmarkEnd w:id="163"/>
-    <w:bookmarkStart w:id="164" w:name="advantages"/>
+    <w:bookmarkEnd w:id="164"/>
+    <w:bookmarkStart w:id="165" w:name="advantages"/>
     <w:p>
       <w:pPr>
         <w:pStyle w:val="Heading1"/>
@@ -29139,8 +29312,8 @@
         <w:t xml:space="preserve">belongs to the whole crew once it’s taken.</w:t>
       </w:r>
     </w:p>
-    <w:bookmarkEnd w:id="164"/>
-    <w:bookmarkStart w:id="190" w:name="species"/>
+    <w:bookmarkEnd w:id="165"/>
+    <w:bookmarkStart w:id="191" w:name="species"/>
     <w:p>
       <w:pPr>
         <w:pStyle w:val="Heading1"/>
@@ -30823,7 +30996,7 @@
         </w:tc>
       </w:tr>
     </w:tbl>
-    <w:bookmarkStart w:id="165" w:name="human"/>
+    <w:bookmarkStart w:id="166" w:name="human"/>
     <w:p>
       <w:pPr>
         <w:pStyle w:val="Heading2"/>
@@ -31136,8 +31309,8 @@
         </w:tc>
       </w:tr>
     </w:tbl>
-    <w:bookmarkEnd w:id="165"/>
-    <w:bookmarkStart w:id="166" w:name="vesh"/>
+    <w:bookmarkEnd w:id="166"/>
+    <w:bookmarkStart w:id="167" w:name="vesh"/>
     <w:p>
       <w:pPr>
         <w:pStyle w:val="Heading2"/>
@@ -31182,7 +31355,7 @@
       <w:pPr>
         <w:numPr>
           <w:ilvl w:val="0"/>
-          <w:numId w:val="1047"/>
+          <w:numId w:val="1048"/>
         </w:numPr>
         <w:pStyle w:val="Compact"/>
       </w:pPr>
@@ -31474,8 +31647,8 @@
         </w:tc>
       </w:tr>
     </w:tbl>
-    <w:bookmarkEnd w:id="166"/>
-    <w:bookmarkStart w:id="167" w:name="brulvek"/>
+    <w:bookmarkEnd w:id="167"/>
+    <w:bookmarkStart w:id="168" w:name="brulvek"/>
     <w:p>
       <w:pPr>
         <w:pStyle w:val="Heading2"/>
@@ -31520,7 +31693,7 @@
       <w:pPr>
         <w:numPr>
           <w:ilvl w:val="0"/>
-          <w:numId w:val="1048"/>
+          <w:numId w:val="1049"/>
         </w:numPr>
         <w:pStyle w:val="Compact"/>
       </w:pPr>
@@ -31812,8 +31985,8 @@
         </w:tc>
       </w:tr>
     </w:tbl>
-    <w:bookmarkEnd w:id="167"/>
-    <w:bookmarkStart w:id="168" w:name="corvani"/>
+    <w:bookmarkEnd w:id="168"/>
+    <w:bookmarkStart w:id="169" w:name="corvani"/>
     <w:p>
       <w:pPr>
         <w:pStyle w:val="Heading2"/>
@@ -31858,7 +32031,7 @@
       <w:pPr>
         <w:numPr>
           <w:ilvl w:val="0"/>
-          <w:numId w:val="1049"/>
+          <w:numId w:val="1050"/>
         </w:numPr>
         <w:pStyle w:val="Compact"/>
       </w:pPr>
@@ -32150,8 +32323,8 @@
         </w:tc>
       </w:tr>
     </w:tbl>
-    <w:bookmarkEnd w:id="168"/>
-    <w:bookmarkStart w:id="169" w:name="draelin"/>
+    <w:bookmarkEnd w:id="169"/>
+    <w:bookmarkStart w:id="170" w:name="draelin"/>
     <w:p>
       <w:pPr>
         <w:pStyle w:val="Heading2"/>
@@ -32196,7 +32369,7 @@
       <w:pPr>
         <w:numPr>
           <w:ilvl w:val="0"/>
-          <w:numId w:val="1050"/>
+          <w:numId w:val="1051"/>
         </w:numPr>
         <w:pStyle w:val="Compact"/>
       </w:pPr>
@@ -32208,7 +32381,7 @@
       <w:pPr>
         <w:numPr>
           <w:ilvl w:val="0"/>
-          <w:numId w:val="1050"/>
+          <w:numId w:val="1051"/>
         </w:numPr>
         <w:pStyle w:val="Compact"/>
       </w:pPr>
@@ -32518,8 +32691,8 @@
         </w:tc>
       </w:tr>
     </w:tbl>
-    <w:bookmarkEnd w:id="169"/>
-    <w:bookmarkStart w:id="170" w:name="joruun"/>
+    <w:bookmarkEnd w:id="170"/>
+    <w:bookmarkStart w:id="171" w:name="joruun"/>
     <w:p>
       <w:pPr>
         <w:pStyle w:val="Heading2"/>
@@ -32564,7 +32737,7 @@
       <w:pPr>
         <w:numPr>
           <w:ilvl w:val="0"/>
-          <w:numId w:val="1051"/>
+          <w:numId w:val="1052"/>
         </w:numPr>
         <w:pStyle w:val="Compact"/>
       </w:pPr>
@@ -32856,8 +33029,8 @@
         </w:tc>
       </w:tr>
     </w:tbl>
-    <w:bookmarkEnd w:id="170"/>
-    <w:bookmarkStart w:id="171" w:name="kel-1"/>
+    <w:bookmarkEnd w:id="171"/>
+    <w:bookmarkStart w:id="172" w:name="kel-1"/>
     <w:p>
       <w:pPr>
         <w:pStyle w:val="Heading2"/>
@@ -32902,7 +33075,7 @@
       <w:pPr>
         <w:numPr>
           <w:ilvl w:val="0"/>
-          <w:numId w:val="1052"/>
+          <w:numId w:val="1053"/>
         </w:numPr>
         <w:pStyle w:val="Compact"/>
       </w:pPr>
@@ -32914,7 +33087,7 @@
       <w:pPr>
         <w:numPr>
           <w:ilvl w:val="0"/>
-          <w:numId w:val="1052"/>
+          <w:numId w:val="1053"/>
         </w:numPr>
         <w:pStyle w:val="Compact"/>
       </w:pPr>
@@ -33206,8 +33379,8 @@
         </w:tc>
       </w:tr>
     </w:tbl>
-    <w:bookmarkEnd w:id="171"/>
-    <w:bookmarkStart w:id="172" w:name="mirrun-1"/>
+    <w:bookmarkEnd w:id="172"/>
+    <w:bookmarkStart w:id="173" w:name="mirrun-1"/>
     <w:p>
       <w:pPr>
         <w:pStyle w:val="Heading2"/>
@@ -33252,7 +33425,7 @@
       <w:pPr>
         <w:numPr>
           <w:ilvl w:val="0"/>
-          <w:numId w:val="1053"/>
+          <w:numId w:val="1054"/>
         </w:numPr>
         <w:pStyle w:val="Compact"/>
       </w:pPr>
@@ -33544,8 +33717,8 @@
         </w:tc>
       </w:tr>
     </w:tbl>
-    <w:bookmarkEnd w:id="172"/>
-    <w:bookmarkStart w:id="173" w:name="ommek"/>
+    <w:bookmarkEnd w:id="173"/>
+    <w:bookmarkStart w:id="174" w:name="ommek"/>
     <w:p>
       <w:pPr>
         <w:pStyle w:val="Heading2"/>
@@ -33590,7 +33763,7 @@
       <w:pPr>
         <w:numPr>
           <w:ilvl w:val="0"/>
-          <w:numId w:val="1054"/>
+          <w:numId w:val="1055"/>
         </w:numPr>
         <w:pStyle w:val="Compact"/>
       </w:pPr>
@@ -33900,8 +34073,8 @@
         </w:tc>
       </w:tr>
     </w:tbl>
-    <w:bookmarkEnd w:id="173"/>
-    <w:bookmarkStart w:id="174" w:name="shivar"/>
+    <w:bookmarkEnd w:id="174"/>
+    <w:bookmarkStart w:id="175" w:name="shivar"/>
     <w:p>
       <w:pPr>
         <w:pStyle w:val="Heading2"/>
@@ -33946,7 +34119,7 @@
       <w:pPr>
         <w:numPr>
           <w:ilvl w:val="0"/>
-          <w:numId w:val="1055"/>
+          <w:numId w:val="1056"/>
         </w:numPr>
         <w:pStyle w:val="Compact"/>
       </w:pPr>
@@ -34238,8 +34411,8 @@
         </w:tc>
       </w:tr>
     </w:tbl>
-    <w:bookmarkEnd w:id="174"/>
-    <w:bookmarkStart w:id="175" w:name="tessan-1"/>
+    <w:bookmarkEnd w:id="175"/>
+    <w:bookmarkStart w:id="176" w:name="tessan-1"/>
     <w:p>
       <w:pPr>
         <w:pStyle w:val="Heading2"/>
@@ -34284,7 +34457,7 @@
       <w:pPr>
         <w:numPr>
           <w:ilvl w:val="0"/>
-          <w:numId w:val="1056"/>
+          <w:numId w:val="1057"/>
         </w:numPr>
         <w:pStyle w:val="Compact"/>
       </w:pPr>
@@ -34296,7 +34469,7 @@
       <w:pPr>
         <w:numPr>
           <w:ilvl w:val="0"/>
-          <w:numId w:val="1056"/>
+          <w:numId w:val="1057"/>
         </w:numPr>
         <w:pStyle w:val="Compact"/>
       </w:pPr>
@@ -34588,8 +34761,8 @@
         </w:tc>
       </w:tr>
     </w:tbl>
-    <w:bookmarkEnd w:id="175"/>
-    <w:bookmarkStart w:id="176" w:name="thrum"/>
+    <w:bookmarkEnd w:id="176"/>
+    <w:bookmarkStart w:id="177" w:name="thrum"/>
     <w:p>
       <w:pPr>
         <w:pStyle w:val="Heading2"/>
@@ -34634,7 +34807,7 @@
       <w:pPr>
         <w:numPr>
           <w:ilvl w:val="0"/>
-          <w:numId w:val="1057"/>
+          <w:numId w:val="1058"/>
         </w:numPr>
         <w:pStyle w:val="Compact"/>
       </w:pPr>
@@ -34926,8 +35099,8 @@
         </w:tc>
       </w:tr>
     </w:tbl>
-    <w:bookmarkEnd w:id="176"/>
-    <w:bookmarkStart w:id="177" w:name="uth"/>
+    <w:bookmarkEnd w:id="177"/>
+    <w:bookmarkStart w:id="178" w:name="uth"/>
     <w:p>
       <w:pPr>
         <w:pStyle w:val="Heading2"/>
@@ -34972,7 +35145,7 @@
       <w:pPr>
         <w:numPr>
           <w:ilvl w:val="0"/>
-          <w:numId w:val="1058"/>
+          <w:numId w:val="1059"/>
         </w:numPr>
         <w:pStyle w:val="Compact"/>
       </w:pPr>
@@ -35264,8 +35437,8 @@
         </w:tc>
       </w:tr>
     </w:tbl>
-    <w:bookmarkEnd w:id="177"/>
-    <w:bookmarkStart w:id="178" w:name="uxarra"/>
+    <w:bookmarkEnd w:id="178"/>
+    <w:bookmarkStart w:id="179" w:name="uxarra"/>
     <w:p>
       <w:pPr>
         <w:pStyle w:val="Heading2"/>
@@ -35310,7 +35483,7 @@
       <w:pPr>
         <w:numPr>
           <w:ilvl w:val="0"/>
-          <w:numId w:val="1059"/>
+          <w:numId w:val="1060"/>
         </w:numPr>
         <w:pStyle w:val="Compact"/>
       </w:pPr>
@@ -35602,8 +35775,8 @@
         </w:tc>
       </w:tr>
     </w:tbl>
-    <w:bookmarkEnd w:id="178"/>
-    <w:bookmarkStart w:id="179" w:name="vael"/>
+    <w:bookmarkEnd w:id="179"/>
+    <w:bookmarkStart w:id="180" w:name="vael"/>
     <w:p>
       <w:pPr>
         <w:pStyle w:val="Heading2"/>
@@ -35648,7 +35821,7 @@
       <w:pPr>
         <w:numPr>
           <w:ilvl w:val="0"/>
-          <w:numId w:val="1060"/>
+          <w:numId w:val="1061"/>
         </w:numPr>
         <w:pStyle w:val="Compact"/>
       </w:pPr>
@@ -35660,7 +35833,7 @@
       <w:pPr>
         <w:numPr>
           <w:ilvl w:val="0"/>
-          <w:numId w:val="1060"/>
+          <w:numId w:val="1061"/>
         </w:numPr>
         <w:pStyle w:val="Compact"/>
       </w:pPr>
@@ -35952,8 +36125,8 @@
         </w:tc>
       </w:tr>
     </w:tbl>
-    <w:bookmarkEnd w:id="179"/>
-    <w:bookmarkStart w:id="180" w:name="veyari"/>
+    <w:bookmarkEnd w:id="180"/>
+    <w:bookmarkStart w:id="181" w:name="veyari"/>
     <w:p>
       <w:pPr>
         <w:pStyle w:val="Heading2"/>
@@ -35998,7 +36171,7 @@
       <w:pPr>
         <w:numPr>
           <w:ilvl w:val="0"/>
-          <w:numId w:val="1061"/>
+          <w:numId w:val="1062"/>
         </w:numPr>
         <w:pStyle w:val="Compact"/>
       </w:pPr>
@@ -36290,8 +36463,8 @@
         </w:tc>
       </w:tr>
     </w:tbl>
-    <w:bookmarkEnd w:id="180"/>
-    <w:bookmarkStart w:id="181" w:name="ylith-1"/>
+    <w:bookmarkEnd w:id="181"/>
+    <w:bookmarkStart w:id="182" w:name="ylith-1"/>
     <w:p>
       <w:pPr>
         <w:pStyle w:val="Heading2"/>
@@ -36336,7 +36509,7 @@
       <w:pPr>
         <w:numPr>
           <w:ilvl w:val="0"/>
-          <w:numId w:val="1062"/>
+          <w:numId w:val="1063"/>
         </w:numPr>
         <w:pStyle w:val="Compact"/>
       </w:pPr>
@@ -36348,7 +36521,7 @@
       <w:pPr>
         <w:numPr>
           <w:ilvl w:val="0"/>
-          <w:numId w:val="1062"/>
+          <w:numId w:val="1063"/>
         </w:numPr>
         <w:pStyle w:val="Compact"/>
       </w:pPr>
@@ -36640,8 +36813,8 @@
         </w:tc>
       </w:tr>
     </w:tbl>
-    <w:bookmarkEnd w:id="181"/>
-    <w:bookmarkStart w:id="182" w:name="zethri"/>
+    <w:bookmarkEnd w:id="182"/>
+    <w:bookmarkStart w:id="183" w:name="zethri"/>
     <w:p>
       <w:pPr>
         <w:pStyle w:val="Heading2"/>
@@ -36686,7 +36859,7 @@
       <w:pPr>
         <w:numPr>
           <w:ilvl w:val="0"/>
-          <w:numId w:val="1063"/>
+          <w:numId w:val="1064"/>
         </w:numPr>
         <w:pStyle w:val="Compact"/>
       </w:pPr>
@@ -36978,8 +37151,8 @@
         </w:tc>
       </w:tr>
     </w:tbl>
-    <w:bookmarkEnd w:id="182"/>
-    <w:bookmarkStart w:id="183" w:name="zhaq"/>
+    <w:bookmarkEnd w:id="183"/>
+    <w:bookmarkStart w:id="184" w:name="zhaq"/>
     <w:p>
       <w:pPr>
         <w:pStyle w:val="Heading2"/>
@@ -37024,7 +37197,7 @@
       <w:pPr>
         <w:numPr>
           <w:ilvl w:val="0"/>
-          <w:numId w:val="1064"/>
+          <w:numId w:val="1065"/>
         </w:numPr>
         <w:pStyle w:val="Compact"/>
       </w:pPr>
@@ -37036,7 +37209,7 @@
       <w:pPr>
         <w:numPr>
           <w:ilvl w:val="0"/>
-          <w:numId w:val="1064"/>
+          <w:numId w:val="1065"/>
         </w:numPr>
         <w:pStyle w:val="Compact"/>
       </w:pPr>
@@ -37328,8 +37501,8 @@
         </w:tc>
       </w:tr>
     </w:tbl>
-    <w:bookmarkEnd w:id="183"/>
-    <w:bookmarkStart w:id="184" w:name="dresh"/>
+    <w:bookmarkEnd w:id="184"/>
+    <w:bookmarkStart w:id="185" w:name="dresh"/>
     <w:p>
       <w:pPr>
         <w:pStyle w:val="Heading2"/>
@@ -37374,7 +37547,7 @@
       <w:pPr>
         <w:numPr>
           <w:ilvl w:val="0"/>
-          <w:numId w:val="1065"/>
+          <w:numId w:val="1066"/>
         </w:numPr>
         <w:pStyle w:val="Compact"/>
       </w:pPr>
@@ -37386,7 +37559,7 @@
       <w:pPr>
         <w:numPr>
           <w:ilvl w:val="0"/>
-          <w:numId w:val="1065"/>
+          <w:numId w:val="1066"/>
         </w:numPr>
         <w:pStyle w:val="Compact"/>
       </w:pPr>
@@ -37398,7 +37571,7 @@
       <w:pPr>
         <w:numPr>
           <w:ilvl w:val="0"/>
-          <w:numId w:val="1065"/>
+          <w:numId w:val="1066"/>
         </w:numPr>
         <w:pStyle w:val="Compact"/>
       </w:pPr>
@@ -37690,8 +37863,8 @@
         </w:tc>
       </w:tr>
     </w:tbl>
-    <w:bookmarkEnd w:id="184"/>
-    <w:bookmarkStart w:id="185" w:name="eshuum"/>
+    <w:bookmarkEnd w:id="185"/>
+    <w:bookmarkStart w:id="186" w:name="eshuum"/>
     <w:p>
       <w:pPr>
         <w:pStyle w:val="Heading2"/>
@@ -37736,7 +37909,7 @@
       <w:pPr>
         <w:numPr>
           <w:ilvl w:val="0"/>
-          <w:numId w:val="1066"/>
+          <w:numId w:val="1067"/>
         </w:numPr>
         <w:pStyle w:val="Compact"/>
       </w:pPr>
@@ -37748,7 +37921,7 @@
       <w:pPr>
         <w:numPr>
           <w:ilvl w:val="0"/>
-          <w:numId w:val="1066"/>
+          <w:numId w:val="1067"/>
         </w:numPr>
         <w:pStyle w:val="Compact"/>
       </w:pPr>
@@ -38040,8 +38213,8 @@
         </w:tc>
       </w:tr>
     </w:tbl>
-    <w:bookmarkEnd w:id="185"/>
-    <w:bookmarkStart w:id="186" w:name="khaum"/>
+    <w:bookmarkEnd w:id="186"/>
+    <w:bookmarkStart w:id="187" w:name="khaum"/>
     <w:p>
       <w:pPr>
         <w:pStyle w:val="Heading2"/>
@@ -38086,7 +38259,7 @@
       <w:pPr>
         <w:numPr>
           <w:ilvl w:val="0"/>
-          <w:numId w:val="1067"/>
+          <w:numId w:val="1068"/>
         </w:numPr>
         <w:pStyle w:val="Compact"/>
       </w:pPr>
@@ -38098,7 +38271,7 @@
       <w:pPr>
         <w:numPr>
           <w:ilvl w:val="0"/>
-          <w:numId w:val="1067"/>
+          <w:numId w:val="1068"/>
         </w:numPr>
         <w:pStyle w:val="Compact"/>
       </w:pPr>
@@ -38110,7 +38283,7 @@
       <w:pPr>
         <w:numPr>
           <w:ilvl w:val="0"/>
-          <w:numId w:val="1067"/>
+          <w:numId w:val="1068"/>
         </w:numPr>
         <w:pStyle w:val="Compact"/>
       </w:pPr>
@@ -38402,8 +38575,8 @@
         </w:tc>
       </w:tr>
     </w:tbl>
-    <w:bookmarkEnd w:id="186"/>
-    <w:bookmarkStart w:id="187" w:name="ozhvek"/>
+    <w:bookmarkEnd w:id="187"/>
+    <w:bookmarkStart w:id="188" w:name="ozhvek"/>
     <w:p>
       <w:pPr>
         <w:pStyle w:val="Heading2"/>
@@ -38448,7 +38621,7 @@
       <w:pPr>
         <w:numPr>
           <w:ilvl w:val="0"/>
-          <w:numId w:val="1068"/>
+          <w:numId w:val="1069"/>
         </w:numPr>
         <w:pStyle w:val="Compact"/>
       </w:pPr>
@@ -38460,7 +38633,7 @@
       <w:pPr>
         <w:numPr>
           <w:ilvl w:val="0"/>
-          <w:numId w:val="1068"/>
+          <w:numId w:val="1069"/>
         </w:numPr>
         <w:pStyle w:val="Compact"/>
       </w:pPr>
@@ -38752,8 +38925,8 @@
         </w:tc>
       </w:tr>
     </w:tbl>
-    <w:bookmarkEnd w:id="187"/>
-    <w:bookmarkStart w:id="188" w:name="qor"/>
+    <w:bookmarkEnd w:id="188"/>
+    <w:bookmarkStart w:id="189" w:name="qor"/>
     <w:p>
       <w:pPr>
         <w:pStyle w:val="Heading2"/>
@@ -38798,7 +38971,7 @@
       <w:pPr>
         <w:numPr>
           <w:ilvl w:val="0"/>
-          <w:numId w:val="1069"/>
+          <w:numId w:val="1070"/>
         </w:numPr>
         <w:pStyle w:val="Compact"/>
       </w:pPr>
@@ -38810,7 +38983,7 @@
       <w:pPr>
         <w:numPr>
           <w:ilvl w:val="0"/>
-          <w:numId w:val="1069"/>
+          <w:numId w:val="1070"/>
         </w:numPr>
         <w:pStyle w:val="Compact"/>
       </w:pPr>
@@ -38822,7 +38995,7 @@
       <w:pPr>
         <w:numPr>
           <w:ilvl w:val="0"/>
-          <w:numId w:val="1069"/>
+          <w:numId w:val="1070"/>
         </w:numPr>
         <w:pStyle w:val="Compact"/>
       </w:pPr>
@@ -39114,8 +39287,8 @@
         </w:tc>
       </w:tr>
     </w:tbl>
-    <w:bookmarkEnd w:id="188"/>
-    <w:bookmarkStart w:id="189" w:name="sen"/>
+    <w:bookmarkEnd w:id="189"/>
+    <w:bookmarkStart w:id="190" w:name="sen"/>
     <w:p>
       <w:pPr>
         <w:pStyle w:val="Heading2"/>
@@ -39160,7 +39333,7 @@
       <w:pPr>
         <w:numPr>
           <w:ilvl w:val="0"/>
-          <w:numId w:val="1070"/>
+          <w:numId w:val="1071"/>
         </w:numPr>
         <w:pStyle w:val="Compact"/>
       </w:pPr>
@@ -39172,7 +39345,7 @@
       <w:pPr>
         <w:numPr>
           <w:ilvl w:val="0"/>
-          <w:numId w:val="1070"/>
+          <w:numId w:val="1071"/>
         </w:numPr>
         <w:pStyle w:val="Compact"/>
       </w:pPr>
@@ -39464,9 +39637,9 @@
         </w:tc>
       </w:tr>
     </w:tbl>
-    <w:bookmarkEnd w:id="189"/>
     <w:bookmarkEnd w:id="190"/>
-    <w:bookmarkStart w:id="203" w:name="making-your-own"/>
+    <w:bookmarkEnd w:id="191"/>
+    <w:bookmarkStart w:id="204" w:name="making-your-own"/>
     <w:p>
       <w:pPr>
         <w:pStyle w:val="Heading1"/>
@@ -39499,7 +39672,7 @@
         <w:t xml:space="preserve">option at the end of each list, and its checklist holds a custom choice to the same rules as everything else.</w:t>
       </w:r>
     </w:p>
-    <w:bookmarkStart w:id="191" w:name="a-custom-role"/>
+    <w:bookmarkStart w:id="192" w:name="a-custom-role"/>
     <w:p>
       <w:pPr>
         <w:pStyle w:val="Heading2"/>
@@ -39520,7 +39693,7 @@
       <w:pPr>
         <w:numPr>
           <w:ilvl w:val="0"/>
-          <w:numId w:val="1071"/>
+          <w:numId w:val="1072"/>
         </w:numPr>
         <w:pStyle w:val="Compact"/>
       </w:pPr>
@@ -39566,7 +39739,7 @@
       <w:pPr>
         <w:numPr>
           <w:ilvl w:val="0"/>
-          <w:numId w:val="1071"/>
+          <w:numId w:val="1072"/>
         </w:numPr>
         <w:pStyle w:val="Compact"/>
       </w:pPr>
@@ -39588,7 +39761,7 @@
       <w:pPr>
         <w:numPr>
           <w:ilvl w:val="0"/>
-          <w:numId w:val="1071"/>
+          <w:numId w:val="1072"/>
         </w:numPr>
         <w:pStyle w:val="Compact"/>
       </w:pPr>
@@ -39610,7 +39783,7 @@
       <w:pPr>
         <w:numPr>
           <w:ilvl w:val="0"/>
-          <w:numId w:val="1071"/>
+          <w:numId w:val="1072"/>
         </w:numPr>
         <w:pStyle w:val="Compact"/>
       </w:pPr>
@@ -39675,8 +39848,8 @@
         <w:t xml:space="preserve">.</w:t>
       </w:r>
     </w:p>
-    <w:bookmarkEnd w:id="191"/>
-    <w:bookmarkStart w:id="200" w:name="a-custom-species"/>
+    <w:bookmarkEnd w:id="192"/>
+    <w:bookmarkStart w:id="201" w:name="a-custom-species"/>
     <w:p>
       <w:pPr>
         <w:pStyle w:val="Heading2"/>
@@ -39693,7 +39866,7 @@
         <w:t xml:space="preserve">Build it with the GM, one step at a time.</w:t>
       </w:r>
     </w:p>
-    <w:bookmarkStart w:id="192" w:name="the-concept"/>
+    <w:bookmarkStart w:id="193" w:name="the-concept"/>
     <w:p>
       <w:pPr>
         <w:pStyle w:val="Heading3"/>
@@ -39710,8 +39883,8 @@
         <w:t xml:space="preserve">Two or three sentences: where they come from, what sets them apart, and how others see them. It should be something the species in this book don’t already cover.</w:t>
       </w:r>
     </w:p>
-    <w:bookmarkEnd w:id="192"/>
-    <w:bookmarkStart w:id="193" w:name="the-tier"/>
+    <w:bookmarkEnd w:id="193"/>
+    <w:bookmarkStart w:id="194" w:name="the-tier"/>
     <w:p>
       <w:pPr>
         <w:pStyle w:val="Heading3"/>
@@ -40008,8 +40181,8 @@
         <w:t xml:space="preserve">When in doubt, choose the higher tier.</w:t>
       </w:r>
     </w:p>
-    <w:bookmarkEnd w:id="193"/>
-    <w:bookmarkStart w:id="194" w:name="attribute-adjustments"/>
+    <w:bookmarkEnd w:id="194"/>
+    <w:bookmarkStart w:id="195" w:name="attribute-adjustments"/>
     <w:p>
       <w:pPr>
         <w:pStyle w:val="Heading3"/>
@@ -40079,8 +40252,8 @@
         <w:t xml:space="preserve">of +1 or −1 to Move. Most have none. It isn’t an attribute adjustment and needn’t balance.</w:t>
       </w:r>
     </w:p>
-    <w:bookmarkEnd w:id="194"/>
-    <w:bookmarkStart w:id="195" w:name="core-rules-tier-1-and-up"/>
+    <w:bookmarkEnd w:id="195"/>
+    <w:bookmarkStart w:id="196" w:name="core-rules-tier-1-and-up"/>
     <w:p>
       <w:pPr>
         <w:pStyle w:val="Heading3"/>
@@ -40097,8 +40270,8 @@
         <w:t xml:space="preserve">One to three short rules that always apply: what they can do (see in the dark, resist cold, a free Trained skill) and what it costs (a weakness, a people’s distrust, a hazard they can’t abide). A strength with no drawback is worth more than it looks, so price it a tier higher.</w:t>
       </w:r>
     </w:p>
-    <w:bookmarkEnd w:id="195"/>
-    <w:bookmarkStart w:id="196" w:name="species-advantages"/>
+    <w:bookmarkEnd w:id="196"/>
+    <w:bookmarkStart w:id="197" w:name="species-advantages"/>
     <w:p>
       <w:pPr>
         <w:pStyle w:val="Heading3"/>
@@ -40153,8 +40326,8 @@
         <w:t xml:space="preserve">: a problem the trait causes, with a clear trigger and a real consequence, which earns a Resolve point when it bites, like any complication. A character takes one advantage, general or species, so make them distinct choices.</w:t>
       </w:r>
     </w:p>
-    <w:bookmarkEnd w:id="196"/>
-    <w:bookmarkStart w:id="197" w:name="an-alternate-form-optional-tier-2-or-3"/>
+    <w:bookmarkEnd w:id="197"/>
+    <w:bookmarkStart w:id="198" w:name="an-alternate-form-optional-tier-2-or-3"/>
     <w:p>
       <w:pPr>
         <w:pStyle w:val="Heading3"/>
@@ -40187,235 +40360,14 @@
         <w:t xml:space="preserve">apply. The bonuses count only while the character is in that form: the sheet’s form switch shows both sets of numbers.</w:t>
       </w:r>
     </w:p>
-    <w:bookmarkEnd w:id="197"/>
-    <w:bookmarkStart w:id="198" w:name="in-the-creator"/>
+    <w:bookmarkEnd w:id="198"/>
+    <w:bookmarkStart w:id="199" w:name="in-the-creator"/>
     <w:p>
       <w:pPr>
         <w:pStyle w:val="Heading3"/>
       </w:pPr>
       <w:r>
         <w:t xml:space="preserve">In the creator</w:t>
-      </w:r>
-    </w:p>
-    <w:p>
-      <w:pPr>
-        <w:numPr>
-          <w:ilvl w:val="0"/>
-          <w:numId w:val="1072"/>
-        </w:numPr>
-        <w:pStyle w:val="Compact"/>
-      </w:pPr>
-      <w:r>
-        <w:t xml:space="preserve">In step 2, choose</w:t>
-      </w:r>
-      <w:r>
-        <w:t xml:space="preserve"> </w:t>
-      </w:r>
-      <w:r>
-        <w:rPr>
-          <w:bCs/>
-          <w:b/>
-        </w:rPr>
-        <w:t xml:space="preserve">Custom species…</w:t>
-      </w:r>
-      <w:r>
-        <w:t xml:space="preserve"> </w:t>
-      </w:r>
-      <w:r>
-        <w:t xml:space="preserve">at the end of the Species list.</w:t>
-      </w:r>
-    </w:p>
-    <w:p>
-      <w:pPr>
-        <w:numPr>
-          <w:ilvl w:val="0"/>
-          <w:numId w:val="1072"/>
-        </w:numPr>
-        <w:pStyle w:val="Compact"/>
-      </w:pPr>
-      <w:r>
-        <w:t xml:space="preserve">Name it, choose the tier you agreed, and set its adjustments. The checklist confirms they total zero.</w:t>
-      </w:r>
-    </w:p>
-    <w:p>
-      <w:pPr>
-        <w:numPr>
-          <w:ilvl w:val="0"/>
-          <w:numId w:val="1072"/>
-        </w:numPr>
-        <w:pStyle w:val="Compact"/>
-      </w:pPr>
-      <w:r>
-        <w:t xml:space="preserve">Write its core rules in</w:t>
-      </w:r>
-      <w:r>
-        <w:t xml:space="preserve"> </w:t>
-      </w:r>
-      <w:r>
-        <w:rPr>
-          <w:bCs/>
-          <w:b/>
-        </w:rPr>
-        <w:t xml:space="preserve">Other ability (GM approval required)</w:t>
-      </w:r>
-      <w:r>
-        <w:t xml:space="preserve"> </w:t>
-      </w:r>
-      <w:r>
-        <w:t xml:space="preserve">in step 4.</w:t>
-      </w:r>
-    </w:p>
-    <w:p>
-      <w:pPr>
-        <w:numPr>
-          <w:ilvl w:val="0"/>
-          <w:numId w:val="1072"/>
-        </w:numPr>
-        <w:pStyle w:val="Compact"/>
-      </w:pPr>
-      <w:r>
-        <w:t xml:space="preserve">In step 4, choose</w:t>
-      </w:r>
-      <w:r>
-        <w:t xml:space="preserve"> </w:t>
-      </w:r>
-      <w:r>
-        <w:rPr>
-          <w:bCs/>
-          <w:b/>
-        </w:rPr>
-        <w:t xml:space="preserve">Custom species advantage…</w:t>
-      </w:r>
-      <w:r>
-        <w:t xml:space="preserve"> </w:t>
-      </w:r>
-      <w:r>
-        <w:t xml:space="preserve">and enter the advantage and its companion complication.</w:t>
-      </w:r>
-    </w:p>
-    <w:bookmarkEnd w:id="198"/>
-    <w:bookmarkStart w:id="199" w:name="example"/>
-    <w:p>
-      <w:pPr>
-        <w:pStyle w:val="Heading3"/>
-      </w:pPr>
-      <w:r>
-        <w:t xml:space="preserve">Example</w:t>
-      </w:r>
-    </w:p>
-    <w:p>
-      <w:pPr>
-        <w:pStyle w:val="FirstParagraph"/>
-      </w:pPr>
-      <w:r>
-        <w:rPr>
-          <w:bCs/>
-          <w:b/>
-        </w:rPr>
-        <w:t xml:space="preserve">Rhessk (tier 1).</w:t>
-      </w:r>
-      <w:r>
-        <w:t xml:space="preserve"> </w:t>
-      </w:r>
-      <w:r>
-        <w:t xml:space="preserve">Small, quick, burrow-dwelling traders from a moon of the Tessan core worlds, long-time clients of the dynasties.</w:t>
-      </w:r>
-      <w:r>
-        <w:t xml:space="preserve"> </w:t>
-      </w:r>
-      <w:r>
-        <w:rPr>
-          <w:iCs/>
-          <w:i/>
-        </w:rPr>
-        <w:t xml:space="preserve">Adjustments:</w:t>
-      </w:r>
-      <w:r>
-        <w:t xml:space="preserve"> </w:t>
-      </w:r>
-      <w:r>
-        <w:t xml:space="preserve">Agility +1, Presence +1, Body −2.</w:t>
-      </w:r>
-      <w:r>
-        <w:t xml:space="preserve"> </w:t>
-      </w:r>
-      <w:r>
-        <w:rPr>
-          <w:iCs/>
-          <w:i/>
-        </w:rPr>
-        <w:t xml:space="preserve">Core rule:</w:t>
-      </w:r>
-      <w:r>
-        <w:t xml:space="preserve"> </w:t>
-      </w:r>
-      <w:r>
-        <w:t xml:space="preserve">night-adapted: see in near-darkness, −1 in bright light.</w:t>
-      </w:r>
-      <w:r>
-        <w:t xml:space="preserve"> </w:t>
-      </w:r>
-      <w:r>
-        <w:rPr>
-          <w:iCs/>
-          <w:i/>
-        </w:rPr>
-        <w:t xml:space="preserve">Species advantage:</w:t>
-      </w:r>
-      <w:r>
-        <w:t xml:space="preserve"> </w:t>
-      </w:r>
-      <w:r>
-        <w:rPr>
-          <w:bCs/>
-          <w:b/>
-        </w:rPr>
-        <w:t xml:space="preserve">Tunnel-Runner</w:t>
-      </w:r>
-      <w:r>
-        <w:t xml:space="preserve">: +2 to Athletics in tight spaces.</w:t>
-      </w:r>
-      <w:r>
-        <w:t xml:space="preserve"> </w:t>
-      </w:r>
-      <w:r>
-        <w:rPr>
-          <w:iCs/>
-          <w:i/>
-        </w:rPr>
-        <w:t xml:space="preserve">Companion:</w:t>
-      </w:r>
-      <w:r>
-        <w:t xml:space="preserve"> </w:t>
-      </w:r>
-      <w:r>
-        <w:rPr>
-          <w:bCs/>
-          <w:b/>
-        </w:rPr>
-        <w:t xml:space="preserve">Client People</w:t>
-      </w:r>
-      <w:r>
-        <w:t xml:space="preserve">: your family’s dynasty calls on you; accept the errand.</w:t>
-      </w:r>
-    </w:p>
-    <w:bookmarkEnd w:id="199"/>
-    <w:bookmarkEnd w:id="200"/>
-    <w:bookmarkStart w:id="201" w:name="threats-weapons-and-edges-for-your-table"/>
-    <w:p>
-      <w:pPr>
-        <w:pStyle w:val="Heading2"/>
-      </w:pPr>
-      <w:r>
-        <w:t xml:space="preserve">Threats, weapons and Edges for your table</w:t>
-      </w:r>
-    </w:p>
-    <w:p>
-      <w:pPr>
-        <w:pStyle w:val="FirstParagraph"/>
-      </w:pPr>
-      <w:r>
-        <w:t xml:space="preserve">A GM can add their own threats, weapons and Edges. Keep them in line with the book’s:</w:t>
       </w:r>
     </w:p>
     <w:p>
@@ -40427,30 +40379,23 @@
         <w:pStyle w:val="Compact"/>
       </w:pPr>
       <w:r>
-        <w:rPr>
-          <w:bCs/>
-          <w:b/>
-        </w:rPr>
-        <w:t xml:space="preserve">Threats.</w:t>
-      </w:r>
-      <w:r>
-        <w:t xml:space="preserve"> </w:t>
-      </w:r>
-      <w:r>
-        <w:t xml:space="preserve">A minor foe has 1 box; an ordinary one 3; a tough one 4 or 5; a rare horror 6. Attack targets run 11 to 13 for most, 14 or 15 for the dangerous. Dodge runs 7 to 10. Give it one special trait, said plainly, and decide what it does before play: toughness, a weakness or armor works as in</w:t>
-      </w:r>
-      <w:r>
-        <w:t xml:space="preserve"> </w:t>
-      </w:r>
-      <w:r>
-        <w:rPr>
-          <w:iCs/>
-          <w:i/>
-        </w:rPr>
-        <w:t xml:space="preserve">Armor, toughness and weaknesses</w:t>
-      </w:r>
-      <w:r>
-        <w:t xml:space="preserve">. For a tougher version of any threat, add +1 to its targets and one box; for a weaker one, subtract.</w:t>
+        <w:t xml:space="preserve">In step 2, choose</w:t>
+      </w:r>
+      <w:r>
+        <w:t xml:space="preserve"> </w:t>
+      </w:r>
+      <w:r>
+        <w:rPr>
+          <w:bCs/>
+          <w:b/>
+        </w:rPr>
+        <w:t xml:space="preserve">Custom species…</w:t>
+      </w:r>
+      <w:r>
+        <w:t xml:space="preserve"> </w:t>
+      </w:r>
+      <w:r>
+        <w:t xml:space="preserve">at the end of the Species list.</w:t>
       </w:r>
     </w:p>
     <w:p>
@@ -40462,17 +40407,7 @@
         <w:pStyle w:val="Compact"/>
       </w:pPr>
       <w:r>
-        <w:rPr>
-          <w:bCs/>
-          <w:b/>
-        </w:rPr>
-        <w:t xml:space="preserve">Weapons.</w:t>
-      </w:r>
-      <w:r>
-        <w:t xml:space="preserve"> </w:t>
-      </w:r>
-      <w:r>
-        <w:t xml:space="preserve">Hits mark 1 box for fists, knives and arrows; 2 for swords and guns; 3 for the heavy and the point-blank; 4 only for explosives and the monstrous. Give a weapon a reach (melee) or a range band, and its shots if they run out.</w:t>
+        <w:t xml:space="preserve">Name it, choose the tier you agreed, and set its adjustments. The checklist confirms they total zero.</w:t>
       </w:r>
     </w:p>
     <w:p>
@@ -40484,17 +40419,23 @@
         <w:pStyle w:val="Compact"/>
       </w:pPr>
       <w:r>
-        <w:rPr>
-          <w:bCs/>
-          <w:b/>
-        </w:rPr>
-        <w:t xml:space="preserve">Edges.</w:t>
-      </w:r>
-      <w:r>
-        <w:t xml:space="preserve"> </w:t>
-      </w:r>
-      <w:r>
-        <w:t xml:space="preserve">An Edge is worth about as much as one of the book’s: a narrow, useful benefit, often once per session or per job. Say exactly what it does.</w:t>
+        <w:t xml:space="preserve">Write its core rules in</w:t>
+      </w:r>
+      <w:r>
+        <w:t xml:space="preserve"> </w:t>
+      </w:r>
+      <w:r>
+        <w:rPr>
+          <w:bCs/>
+          <w:b/>
+        </w:rPr>
+        <w:t xml:space="preserve">Other ability (GM approval required)</w:t>
+      </w:r>
+      <w:r>
+        <w:t xml:space="preserve"> </w:t>
+      </w:r>
+      <w:r>
+        <w:t xml:space="preserve">in step 4.</w:t>
       </w:r>
     </w:p>
     <w:p>
@@ -40506,24 +40447,155 @@
         <w:pStyle w:val="Compact"/>
       </w:pPr>
       <w:r>
-        <w:rPr>
-          <w:bCs/>
-          <w:b/>
-        </w:rPr>
-        <w:t xml:space="preserve">Cards.</w:t>
-      </w:r>
-      <w:r>
-        <w:t xml:space="preserve"> </w:t>
-      </w:r>
-      <w:r>
-        <w:t xml:space="preserve">One subject, what’s true about it and what that permits: as narrow as a card earned in play.</w:t>
+        <w:t xml:space="preserve">In step 4, choose</w:t>
+      </w:r>
+      <w:r>
+        <w:t xml:space="preserve"> </w:t>
+      </w:r>
+      <w:r>
+        <w:rPr>
+          <w:bCs/>
+          <w:b/>
+        </w:rPr>
+        <w:t xml:space="preserve">Custom species advantage…</w:t>
+      </w:r>
+      <w:r>
+        <w:t xml:space="preserve"> </w:t>
+      </w:r>
+      <w:r>
+        <w:t xml:space="preserve">and enter the advantage and its companion complication.</w:t>
+      </w:r>
+    </w:p>
+    <w:bookmarkEnd w:id="199"/>
+    <w:bookmarkStart w:id="200" w:name="example"/>
+    <w:p>
+      <w:pPr>
+        <w:pStyle w:val="Heading3"/>
+      </w:pPr>
+      <w:r>
+        <w:t xml:space="preserve">Example</w:t>
+      </w:r>
+    </w:p>
+    <w:p>
+      <w:pPr>
+        <w:pStyle w:val="FirstParagraph"/>
+      </w:pPr>
+      <w:r>
+        <w:rPr>
+          <w:bCs/>
+          <w:b/>
+        </w:rPr>
+        <w:t xml:space="preserve">Rhessk (tier 1).</w:t>
+      </w:r>
+      <w:r>
+        <w:t xml:space="preserve"> </w:t>
+      </w:r>
+      <w:r>
+        <w:t xml:space="preserve">Small, quick, burrow-dwelling traders from a moon of the Tessan core worlds, long-time clients of the dynasties.</w:t>
+      </w:r>
+      <w:r>
+        <w:t xml:space="preserve"> </w:t>
+      </w:r>
+      <w:r>
+        <w:rPr>
+          <w:iCs/>
+          <w:i/>
+        </w:rPr>
+        <w:t xml:space="preserve">Adjustments:</w:t>
+      </w:r>
+      <w:r>
+        <w:t xml:space="preserve"> </w:t>
+      </w:r>
+      <w:r>
+        <w:t xml:space="preserve">Agility +1, Presence +1, Body −2.</w:t>
+      </w:r>
+      <w:r>
+        <w:t xml:space="preserve"> </w:t>
+      </w:r>
+      <w:r>
+        <w:rPr>
+          <w:iCs/>
+          <w:i/>
+        </w:rPr>
+        <w:t xml:space="preserve">Core rule:</w:t>
+      </w:r>
+      <w:r>
+        <w:t xml:space="preserve"> </w:t>
+      </w:r>
+      <w:r>
+        <w:t xml:space="preserve">night-adapted: see in near-darkness, −1 in bright light.</w:t>
+      </w:r>
+      <w:r>
+        <w:t xml:space="preserve"> </w:t>
+      </w:r>
+      <w:r>
+        <w:rPr>
+          <w:iCs/>
+          <w:i/>
+        </w:rPr>
+        <w:t xml:space="preserve">Species advantage:</w:t>
+      </w:r>
+      <w:r>
+        <w:t xml:space="preserve"> </w:t>
+      </w:r>
+      <w:r>
+        <w:rPr>
+          <w:bCs/>
+          <w:b/>
+        </w:rPr>
+        <w:t xml:space="preserve">Tunnel-Runner</w:t>
+      </w:r>
+      <w:r>
+        <w:t xml:space="preserve">: +2 to Athletics in tight spaces.</w:t>
+      </w:r>
+      <w:r>
+        <w:t xml:space="preserve"> </w:t>
+      </w:r>
+      <w:r>
+        <w:rPr>
+          <w:iCs/>
+          <w:i/>
+        </w:rPr>
+        <w:t xml:space="preserve">Companion:</w:t>
+      </w:r>
+      <w:r>
+        <w:t xml:space="preserve"> </w:t>
+      </w:r>
+      <w:r>
+        <w:rPr>
+          <w:bCs/>
+          <w:b/>
+        </w:rPr>
+        <w:t xml:space="preserve">Client People</w:t>
+      </w:r>
+      <w:r>
+        <w:t xml:space="preserve">: your family’s dynasty calls on you; accept the errand.</w:t>
+      </w:r>
+    </w:p>
+    <w:bookmarkEnd w:id="200"/>
+    <w:bookmarkEnd w:id="201"/>
+    <w:bookmarkStart w:id="202" w:name="threats-weapons-and-edges-for-your-table"/>
+    <w:p>
+      <w:pPr>
+        <w:pStyle w:val="Heading2"/>
+      </w:pPr>
+      <w:r>
+        <w:t xml:space="preserve">Threats, weapons and Edges for your table</w:t>
+      </w:r>
+    </w:p>
+    <w:p>
+      <w:pPr>
+        <w:pStyle w:val="FirstParagraph"/>
+      </w:pPr>
+      <w:r>
+        <w:t xml:space="preserve">A GM can add their own threats, weapons and Edges. Keep them in line with the book’s:</w:t>
       </w:r>
     </w:p>
     <w:p>
       <w:pPr>
         <w:numPr>
           <w:ilvl w:val="0"/>
-          <w:numId w:val="1073"/>
+          <w:numId w:val="1074"/>
         </w:numPr>
         <w:pStyle w:val="Compact"/>
       </w:pPr>
@@ -40532,20 +40604,33 @@
           <w:bCs/>
           <w:b/>
         </w:rPr>
-        <w:t xml:space="preserve">Powers.</w:t>
-      </w:r>
-      <w:r>
-        <w:t xml:space="preserve"> </w:t>
-      </w:r>
-      <w:r>
-        <w:t xml:space="preserve">Write what it does at each Class, I to VI, stepping up as the setting’s own powers do; anything that bends minds, time or death needs the GM’s approval.</w:t>
+        <w:t xml:space="preserve">Threats.</w:t>
+      </w:r>
+      <w:r>
+        <w:t xml:space="preserve"> </w:t>
+      </w:r>
+      <w:r>
+        <w:t xml:space="preserve">A minor foe has 1 box; an ordinary one 3; a tough one 4 or 5; a rare horror 6. Attack targets run 11 to 13 for most, 14 or 15 for the dangerous. Dodge runs 7 to 10. Give it one special trait, said plainly, and decide what it does before play: toughness, a weakness or armor works as in</w:t>
+      </w:r>
+      <w:r>
+        <w:t xml:space="preserve"> </w:t>
+      </w:r>
+      <w:r>
+        <w:rPr>
+          <w:iCs/>
+          <w:i/>
+        </w:rPr>
+        <w:t xml:space="preserve">Armor, toughness and weaknesses</w:t>
+      </w:r>
+      <w:r>
+        <w:t xml:space="preserve">. For a tougher version of any threat, add +1 to its targets and one box; for a weaker one, subtract.</w:t>
       </w:r>
     </w:p>
     <w:p>
       <w:pPr>
         <w:numPr>
           <w:ilvl w:val="0"/>
-          <w:numId w:val="1073"/>
+          <w:numId w:val="1074"/>
         </w:numPr>
         <w:pStyle w:val="Compact"/>
       </w:pPr>
@@ -40554,20 +40639,20 @@
           <w:bCs/>
           <w:b/>
         </w:rPr>
-        <w:t xml:space="preserve">Spells.</w:t>
-      </w:r>
-      <w:r>
-        <w:t xml:space="preserve"> </w:t>
-      </w:r>
-      <w:r>
-        <w:t xml:space="preserve">A new hex, cantrip or psionic power matches the setting’s own: an attack marks 1 or 2 boxes at Close or Short range, and anything stronger says who resists and what it costs.</w:t>
+        <w:t xml:space="preserve">Weapons.</w:t>
+      </w:r>
+      <w:r>
+        <w:t xml:space="preserve"> </w:t>
+      </w:r>
+      <w:r>
+        <w:t xml:space="preserve">Hits mark 1 box for fists, knives and arrows; 2 for swords and guns; 3 for the heavy and the point-blank; 4 only for explosives and the monstrous. Give a weapon a reach (melee) or a range band, and its shots if they run out.</w:t>
       </w:r>
     </w:p>
     <w:p>
       <w:pPr>
         <w:numPr>
           <w:ilvl w:val="0"/>
-          <w:numId w:val="1073"/>
+          <w:numId w:val="1074"/>
         </w:numPr>
         <w:pStyle w:val="Compact"/>
       </w:pPr>
@@ -40576,6 +40661,94 @@
           <w:bCs/>
           <w:b/>
         </w:rPr>
+        <w:t xml:space="preserve">Edges.</w:t>
+      </w:r>
+      <w:r>
+        <w:t xml:space="preserve"> </w:t>
+      </w:r>
+      <w:r>
+        <w:t xml:space="preserve">An Edge is worth about as much as one of the book’s: a narrow, useful benefit, often once per session or per job. Say exactly what it does.</w:t>
+      </w:r>
+    </w:p>
+    <w:p>
+      <w:pPr>
+        <w:numPr>
+          <w:ilvl w:val="0"/>
+          <w:numId w:val="1074"/>
+        </w:numPr>
+        <w:pStyle w:val="Compact"/>
+      </w:pPr>
+      <w:r>
+        <w:rPr>
+          <w:bCs/>
+          <w:b/>
+        </w:rPr>
+        <w:t xml:space="preserve">Cards.</w:t>
+      </w:r>
+      <w:r>
+        <w:t xml:space="preserve"> </w:t>
+      </w:r>
+      <w:r>
+        <w:t xml:space="preserve">One subject, what’s true about it and what that permits: as narrow as a card earned in play.</w:t>
+      </w:r>
+    </w:p>
+    <w:p>
+      <w:pPr>
+        <w:numPr>
+          <w:ilvl w:val="0"/>
+          <w:numId w:val="1074"/>
+        </w:numPr>
+        <w:pStyle w:val="Compact"/>
+      </w:pPr>
+      <w:r>
+        <w:rPr>
+          <w:bCs/>
+          <w:b/>
+        </w:rPr>
+        <w:t xml:space="preserve">Powers.</w:t>
+      </w:r>
+      <w:r>
+        <w:t xml:space="preserve"> </w:t>
+      </w:r>
+      <w:r>
+        <w:t xml:space="preserve">Write what it does at each Class, I to VI, stepping up as the setting’s own powers do; anything that bends minds, time or death needs the GM’s approval.</w:t>
+      </w:r>
+    </w:p>
+    <w:p>
+      <w:pPr>
+        <w:numPr>
+          <w:ilvl w:val="0"/>
+          <w:numId w:val="1074"/>
+        </w:numPr>
+        <w:pStyle w:val="Compact"/>
+      </w:pPr>
+      <w:r>
+        <w:rPr>
+          <w:bCs/>
+          <w:b/>
+        </w:rPr>
+        <w:t xml:space="preserve">Spells.</w:t>
+      </w:r>
+      <w:r>
+        <w:t xml:space="preserve"> </w:t>
+      </w:r>
+      <w:r>
+        <w:t xml:space="preserve">A new hex, cantrip or psionic power matches the setting’s own: an attack marks 1 or 2 boxes at Close or Short range, and anything stronger says who resists and what it costs.</w:t>
+      </w:r>
+    </w:p>
+    <w:p>
+      <w:pPr>
+        <w:numPr>
+          <w:ilvl w:val="0"/>
+          <w:numId w:val="1074"/>
+        </w:numPr>
+        <w:pStyle w:val="Compact"/>
+      </w:pPr>
+      <w:r>
+        <w:rPr>
+          <w:bCs/>
+          <w:b/>
+        </w:rPr>
         <w:t xml:space="preserve">Rituals.</w:t>
       </w:r>
       <w:r>
@@ -40645,8 +40818,8 @@
         <w:t xml:space="preserve">. Players get them when they join your shared table, or from a homebrew file you give them. Bonuses chosen from the tab’s menus are worked out for you: a weapon’s accuracy, strong hits and what it’s made of; a threat’s hard hide, weaknesses, what alone can hurt it and how hard it is to hit; an Edge’s skill, Dodge or Move bonus and extra defense; an attack spell cast in the Encounter panel. Anything else is a note the GM applies at the table.</w:t>
       </w:r>
     </w:p>
-    <w:bookmarkEnd w:id="201"/>
-    <w:bookmarkStart w:id="202" w:name="your-campaign"/>
+    <w:bookmarkEnd w:id="202"/>
+    <w:bookmarkStart w:id="203" w:name="your-campaign"/>
     <w:p>
       <w:pPr>
         <w:pStyle w:val="Heading2"/>
@@ -40741,9 +40914,9 @@
         <w:t xml:space="preserve">), or keep it to yourself. Cards are earned through discovery, so a trigger makes finding things out the way the story moves: the next chapter waits for the group to learn what it needs.</w:t>
       </w:r>
     </w:p>
-    <w:bookmarkEnd w:id="202"/>
     <w:bookmarkEnd w:id="203"/>
-    <w:bookmarkStart w:id="204" w:name="complications"/>
+    <w:bookmarkEnd w:id="204"/>
+    <w:bookmarkStart w:id="205" w:name="complications"/>
     <w:p>
       <w:pPr>
         <w:pStyle w:val="Heading1"/>
@@ -41448,8 +41621,8 @@
         </w:tc>
       </w:tr>
     </w:tbl>
-    <w:bookmarkEnd w:id="204"/>
-    <w:bookmarkStart w:id="205" w:name="quick-reference"/>
+    <w:bookmarkEnd w:id="205"/>
+    <w:bookmarkStart w:id="206" w:name="quick-reference"/>
     <w:p>
       <w:pPr>
         <w:pStyle w:val="Heading1"/>
@@ -41674,7 +41847,7 @@
         <w:t xml:space="preserve">Copyright © Don Smallwood. All rights reserved.</w:t>
       </w:r>
     </w:p>
-    <w:bookmarkEnd w:id="205"/>
+    <w:bookmarkEnd w:id="206"/>
     <w:sectPr/>
   </w:body>
 </w:document>
@@ -42135,6 +42308,9 @@
     <w:abstractNumId w:val="991"/>
   </w:num>
   <w:num w:numId="1037">
+    <w:abstractNumId w:val="991"/>
+  </w:num>
+  <w:num w:numId="1038">
     <w:abstractNumId w:val="99411"/>
     <w:lvlOverride w:ilvl="0">
       <w:startOverride w:val="1"/>
@@ -42163,9 +42339,6 @@
     <w:lvlOverride w:ilvl="8">
       <w:startOverride w:val="1"/>
     </w:lvlOverride>
-  </w:num>
-  <w:num w:numId="1038">
-    <w:abstractNumId w:val="991"/>
   </w:num>
   <w:num w:numId="1039">
     <w:abstractNumId w:val="991"/>
@@ -42264,34 +42437,7 @@
     <w:abstractNumId w:val="991"/>
   </w:num>
   <w:num w:numId="1071">
-    <w:abstractNumId w:val="99411"/>
-    <w:lvlOverride w:ilvl="0">
-      <w:startOverride w:val="1"/>
-    </w:lvlOverride>
-    <w:lvlOverride w:ilvl="1">
-      <w:startOverride w:val="1"/>
-    </w:lvlOverride>
-    <w:lvlOverride w:ilvl="2">
-      <w:startOverride w:val="1"/>
-    </w:lvlOverride>
-    <w:lvlOverride w:ilvl="3">
-      <w:startOverride w:val="1"/>
-    </w:lvlOverride>
-    <w:lvlOverride w:ilvl="4">
-      <w:startOverride w:val="1"/>
-    </w:lvlOverride>
-    <w:lvlOverride w:ilvl="5">
-      <w:startOverride w:val="1"/>
-    </w:lvlOverride>
-    <w:lvlOverride w:ilvl="6">
-      <w:startOverride w:val="1"/>
-    </w:lvlOverride>
-    <w:lvlOverride w:ilvl="7">
-      <w:startOverride w:val="1"/>
-    </w:lvlOverride>
-    <w:lvlOverride w:ilvl="8">
-      <w:startOverride w:val="1"/>
-    </w:lvlOverride>
+    <w:abstractNumId w:val="991"/>
   </w:num>
   <w:num w:numId="1072">
     <w:abstractNumId w:val="99411"/>
@@ -42324,6 +42470,36 @@
     </w:lvlOverride>
   </w:num>
   <w:num w:numId="1073">
+    <w:abstractNumId w:val="99411"/>
+    <w:lvlOverride w:ilvl="0">
+      <w:startOverride w:val="1"/>
+    </w:lvlOverride>
+    <w:lvlOverride w:ilvl="1">
+      <w:startOverride w:val="1"/>
+    </w:lvlOverride>
+    <w:lvlOverride w:ilvl="2">
+      <w:startOverride w:val="1"/>
+    </w:lvlOverride>
+    <w:lvlOverride w:ilvl="3">
+      <w:startOverride w:val="1"/>
+    </w:lvlOverride>
+    <w:lvlOverride w:ilvl="4">
+      <w:startOverride w:val="1"/>
+    </w:lvlOverride>
+    <w:lvlOverride w:ilvl="5">
+      <w:startOverride w:val="1"/>
+    </w:lvlOverride>
+    <w:lvlOverride w:ilvl="6">
+      <w:startOverride w:val="1"/>
+    </w:lvlOverride>
+    <w:lvlOverride w:ilvl="7">
+      <w:startOverride w:val="1"/>
+    </w:lvlOverride>
+    <w:lvlOverride w:ilvl="8">
+      <w:startOverride w:val="1"/>
+    </w:lvlOverride>
+  </w:num>
+  <w:num w:numId="1074">
     <w:abstractNumId w:val="991"/>
   </w:num>
 </w:numbering>

</xml_diff>